<commit_message>
fix comparator for PC for BNE
</commit_message>
<xml_diff>
--- a/book/finalproject/Final_Project_Assignment_Stage1.docx
+++ b/book/finalproject/Final_Project_Assignment_Stage1.docx
@@ -496,29 +496,7 @@
           <w:szCs w:val="21"/>
           <w:shd w:val="clear" w:color="auto" w:fill="FFFFFF"/>
         </w:rPr>
-        <w:t xml:space="preserve">.  However, this stage does NOT have hazard detection and does NOT </w:t>
-      </w:r>
-      <w:proofErr w:type="gramStart"/>
-      <w:r>
-        <w:rPr>
-          <w:rFonts w:ascii="Helvetica" w:eastAsia="Times New Roman" w:hAnsi="Helvetica" w:cs="Helvetica"/>
-          <w:color w:val="333333"/>
-          <w:sz w:val="21"/>
-          <w:szCs w:val="21"/>
-          <w:shd w:val="clear" w:color="auto" w:fill="FFFFFF"/>
-        </w:rPr>
-        <w:t>stall to prevent</w:t>
-      </w:r>
-      <w:proofErr w:type="gramEnd"/>
-      <w:r>
-        <w:rPr>
-          <w:rFonts w:ascii="Helvetica" w:eastAsia="Times New Roman" w:hAnsi="Helvetica" w:cs="Helvetica"/>
-          <w:color w:val="333333"/>
-          <w:sz w:val="21"/>
-          <w:szCs w:val="21"/>
-          <w:shd w:val="clear" w:color="auto" w:fill="FFFFFF"/>
-        </w:rPr>
-        <w:t xml:space="preserve"> hazards.  </w:t>
+        <w:t xml:space="preserve">.  However, this stage does NOT have hazard detection and does NOT stall to prevent hazards.  </w:t>
       </w:r>
       <w:r>
         <w:rPr>
@@ -647,61 +625,17 @@
           <w:szCs w:val="21"/>
           <w:shd w:val="clear" w:color="auto" w:fill="FFFFFF"/>
         </w:rPr>
-        <w:t xml:space="preserve">: convert </w:t>
-      </w:r>
-      <w:proofErr w:type="gramStart"/>
-      <w:r>
-        <w:rPr>
-          <w:rFonts w:ascii="Helvetica" w:eastAsia="Times New Roman" w:hAnsi="Helvetica" w:cs="Helvetica"/>
-          <w:color w:val="333333"/>
-          <w:sz w:val="21"/>
-          <w:szCs w:val="21"/>
-          <w:shd w:val="clear" w:color="auto" w:fill="FFFFFF"/>
-        </w:rPr>
-        <w:t xml:space="preserve">the </w:t>
-      </w:r>
-      <w:r>
-        <w:rPr>
-          <w:rFonts w:ascii="Helvetica" w:eastAsia="Times New Roman" w:hAnsi="Helvetica" w:cs="Helvetica"/>
-          <w:color w:val="333333"/>
-          <w:sz w:val="21"/>
-          <w:szCs w:val="21"/>
-          <w:shd w:val="clear" w:color="auto" w:fill="FFFFFF"/>
-        </w:rPr>
-        <w:t>stage</w:t>
-      </w:r>
-      <w:proofErr w:type="gramEnd"/>
-      <w:r>
-        <w:rPr>
-          <w:rFonts w:ascii="Helvetica" w:eastAsia="Times New Roman" w:hAnsi="Helvetica" w:cs="Helvetica"/>
-          <w:color w:val="333333"/>
-          <w:sz w:val="21"/>
-          <w:szCs w:val="21"/>
-          <w:shd w:val="clear" w:color="auto" w:fill="FFFFFF"/>
-        </w:rPr>
-        <w:t xml:space="preserve"> 2 architecture to </w:t>
-      </w:r>
-      <w:proofErr w:type="gramStart"/>
-      <w:r>
-        <w:rPr>
-          <w:rFonts w:ascii="Helvetica" w:eastAsia="Times New Roman" w:hAnsi="Helvetica" w:cs="Helvetica"/>
-          <w:color w:val="333333"/>
-          <w:sz w:val="21"/>
-          <w:szCs w:val="21"/>
-          <w:shd w:val="clear" w:color="auto" w:fill="FFFFFF"/>
-        </w:rPr>
-        <w:t>a pipelined</w:t>
-      </w:r>
-      <w:proofErr w:type="gramEnd"/>
-      <w:r>
-        <w:rPr>
-          <w:rFonts w:ascii="Helvetica" w:eastAsia="Times New Roman" w:hAnsi="Helvetica" w:cs="Helvetica"/>
-          <w:color w:val="333333"/>
-          <w:sz w:val="21"/>
-          <w:szCs w:val="21"/>
-          <w:shd w:val="clear" w:color="auto" w:fill="FFFFFF"/>
-        </w:rPr>
-        <w:t xml:space="preserve"> architecture </w:t>
+        <w:t xml:space="preserve">: convert the </w:t>
+      </w:r>
+      <w:r>
+        <w:rPr>
+          <w:rFonts w:ascii="Helvetica" w:eastAsia="Times New Roman" w:hAnsi="Helvetica" w:cs="Helvetica"/>
+          <w:color w:val="333333"/>
+          <w:sz w:val="21"/>
+          <w:szCs w:val="21"/>
+          <w:shd w:val="clear" w:color="auto" w:fill="FFFFFF"/>
+        </w:rPr>
+        <w:t xml:space="preserve">stage 2 architecture to a pipelined architecture </w:t>
       </w:r>
       <w:r>
         <w:rPr>
@@ -731,39 +665,17 @@
           <w:szCs w:val="21"/>
           <w:shd w:val="clear" w:color="auto" w:fill="FFFFFF"/>
         </w:rPr>
-        <w:t xml:space="preserve"> and stalls appropriately to ensure proper </w:t>
-      </w:r>
-      <w:proofErr w:type="gramStart"/>
-      <w:r>
-        <w:rPr>
-          <w:rFonts w:ascii="Helvetica" w:eastAsia="Times New Roman" w:hAnsi="Helvetica" w:cs="Helvetica"/>
-          <w:color w:val="333333"/>
-          <w:sz w:val="21"/>
-          <w:szCs w:val="21"/>
-          <w:shd w:val="clear" w:color="auto" w:fill="FFFFFF"/>
-        </w:rPr>
-        <w:t>execution</w:t>
-      </w:r>
-      <w:r>
-        <w:rPr>
-          <w:rFonts w:ascii="Helvetica" w:eastAsia="Times New Roman" w:hAnsi="Helvetica" w:cs="Helvetica"/>
-          <w:color w:val="333333"/>
-          <w:sz w:val="21"/>
-          <w:szCs w:val="21"/>
-          <w:shd w:val="clear" w:color="auto" w:fill="FFFFFF"/>
-        </w:rPr>
-        <w:t>, but</w:t>
-      </w:r>
-      <w:proofErr w:type="gramEnd"/>
-      <w:r>
-        <w:rPr>
-          <w:rFonts w:ascii="Helvetica" w:eastAsia="Times New Roman" w:hAnsi="Helvetica" w:cs="Helvetica"/>
-          <w:color w:val="333333"/>
-          <w:sz w:val="21"/>
-          <w:szCs w:val="21"/>
-          <w:shd w:val="clear" w:color="auto" w:fill="FFFFFF"/>
-        </w:rPr>
-        <w:t xml:space="preserve"> does NOT have forwarding.</w:t>
+        <w:t xml:space="preserve"> and stalls appropriately to ensure proper execution</w:t>
+      </w:r>
+      <w:r>
+        <w:rPr>
+          <w:rFonts w:ascii="Helvetica" w:eastAsia="Times New Roman" w:hAnsi="Helvetica" w:cs="Helvetica"/>
+          <w:color w:val="333333"/>
+          <w:sz w:val="21"/>
+          <w:szCs w:val="21"/>
+          <w:shd w:val="clear" w:color="auto" w:fill="FFFFFF"/>
+        </w:rPr>
+        <w:t>, but does NOT have forwarding.</w:t>
       </w:r>
     </w:p>
     <w:p>
@@ -902,29 +814,7 @@
           <w:szCs w:val="21"/>
           <w:shd w:val="clear" w:color="auto" w:fill="FFFFFF"/>
         </w:rPr>
-        <w:t xml:space="preserve"> and branch decision moved to the ID stage, </w:t>
-      </w:r>
-      <w:proofErr w:type="gramStart"/>
-      <w:r>
-        <w:rPr>
-          <w:rFonts w:ascii="Helvetica" w:eastAsia="Times New Roman" w:hAnsi="Helvetica" w:cs="Helvetica"/>
-          <w:color w:val="333333"/>
-          <w:sz w:val="21"/>
-          <w:szCs w:val="21"/>
-          <w:shd w:val="clear" w:color="auto" w:fill="FFFFFF"/>
-        </w:rPr>
-        <w:t>similar to</w:t>
-      </w:r>
-      <w:proofErr w:type="gramEnd"/>
-      <w:r>
-        <w:rPr>
-          <w:rFonts w:ascii="Helvetica" w:eastAsia="Times New Roman" w:hAnsi="Helvetica" w:cs="Helvetica"/>
-          <w:color w:val="333333"/>
-          <w:sz w:val="21"/>
-          <w:szCs w:val="21"/>
-          <w:shd w:val="clear" w:color="auto" w:fill="FFFFFF"/>
-        </w:rPr>
-        <w:t xml:space="preserve"> Figure C.25.</w:t>
+        <w:t xml:space="preserve"> and branch decision moved to the ID stage, similar to Figure C.25.</w:t>
       </w:r>
     </w:p>
     <w:p>
@@ -1063,29 +953,7 @@
           <w:szCs w:val="21"/>
           <w:shd w:val="clear" w:color="auto" w:fill="FFFFFF"/>
         </w:rPr>
-        <w:t xml:space="preserve">, which is </w:t>
-      </w:r>
-      <w:proofErr w:type="gramStart"/>
-      <w:r>
-        <w:rPr>
-          <w:rFonts w:ascii="Helvetica" w:eastAsia="Times New Roman" w:hAnsi="Helvetica" w:cs="Helvetica"/>
-          <w:color w:val="333333"/>
-          <w:sz w:val="21"/>
-          <w:szCs w:val="21"/>
-          <w:shd w:val="clear" w:color="auto" w:fill="FFFFFF"/>
-        </w:rPr>
-        <w:t>similar to</w:t>
-      </w:r>
-      <w:proofErr w:type="gramEnd"/>
-      <w:r>
-        <w:rPr>
-          <w:rFonts w:ascii="Helvetica" w:eastAsia="Times New Roman" w:hAnsi="Helvetica" w:cs="Helvetica"/>
-          <w:color w:val="333333"/>
-          <w:sz w:val="21"/>
-          <w:szCs w:val="21"/>
-          <w:shd w:val="clear" w:color="auto" w:fill="FFFFFF"/>
-        </w:rPr>
-        <w:t xml:space="preserve"> LA,</w:t>
+        <w:t>, which is similar to LA,</w:t>
       </w:r>
       <w:r>
         <w:rPr>
@@ -1404,329 +1272,338 @@
           <w:sz w:val="20"/>
           <w:szCs w:val="20"/>
         </w:rPr>
-        <w:t>x7, 0(</w:t>
-      </w:r>
-      <w:proofErr w:type="gramStart"/>
-      <w:r>
+        <w:t>x7, 0(x6)       # x7 = initial value</w:t>
+      </w:r>
+    </w:p>
+    <w:p>
+      <w:pPr>
+        <w:spacing w:after="0" w:line="240" w:lineRule="auto"/>
+        <w:ind w:left="720"/>
         <w:rPr>
           <w:rFonts w:ascii="Courier New" w:eastAsia="Times New Roman" w:hAnsi="Courier New" w:cs="Courier New"/>
           <w:sz w:val="20"/>
           <w:szCs w:val="20"/>
         </w:rPr>
-        <w:t>x6)       #</w:t>
-      </w:r>
-      <w:proofErr w:type="gramEnd"/>
+      </w:pPr>
       <w:r>
         <w:rPr>
           <w:rFonts w:ascii="Courier New" w:eastAsia="Times New Roman" w:hAnsi="Courier New" w:cs="Courier New"/>
           <w:sz w:val="20"/>
           <w:szCs w:val="20"/>
         </w:rPr>
-        <w:t xml:space="preserve"> x7 = initial value</w:t>
-      </w:r>
-    </w:p>
-    <w:p>
-      <w:pPr>
-        <w:spacing w:after="0" w:line="240" w:lineRule="auto"/>
-        <w:ind w:left="720"/>
+        <w:t xml:space="preserve">loop:   </w:t>
+      </w:r>
+      <w:proofErr w:type="spellStart"/>
+      <w:r>
         <w:rPr>
           <w:rFonts w:ascii="Courier New" w:eastAsia="Times New Roman" w:hAnsi="Courier New" w:cs="Courier New"/>
           <w:sz w:val="20"/>
           <w:szCs w:val="20"/>
         </w:rPr>
-      </w:pPr>
+        <w:t>addi</w:t>
+      </w:r>
+      <w:proofErr w:type="spellEnd"/>
       <w:r>
         <w:rPr>
           <w:rFonts w:ascii="Courier New" w:eastAsia="Times New Roman" w:hAnsi="Courier New" w:cs="Courier New"/>
           <w:sz w:val="20"/>
           <w:szCs w:val="20"/>
         </w:rPr>
-        <w:t xml:space="preserve">loop:   </w:t>
-      </w:r>
-      <w:proofErr w:type="spellStart"/>
+        <w:t xml:space="preserve">    </w:t>
+      </w:r>
       <w:r>
         <w:rPr>
           <w:rFonts w:ascii="Courier New" w:eastAsia="Times New Roman" w:hAnsi="Courier New" w:cs="Courier New"/>
           <w:sz w:val="20"/>
           <w:szCs w:val="20"/>
         </w:rPr>
-        <w:t>addi</w:t>
-      </w:r>
-      <w:proofErr w:type="spellEnd"/>
+        <w:t xml:space="preserve">  </w:t>
+      </w:r>
       <w:r>
         <w:rPr>
           <w:rFonts w:ascii="Courier New" w:eastAsia="Times New Roman" w:hAnsi="Courier New" w:cs="Courier New"/>
           <w:sz w:val="20"/>
           <w:szCs w:val="20"/>
         </w:rPr>
-        <w:t xml:space="preserve">    </w:t>
-      </w:r>
-      <w:r>
+        <w:t xml:space="preserve">x6, x6, 4       </w:t>
+      </w:r>
+    </w:p>
+    <w:p>
+      <w:pPr>
+        <w:spacing w:after="0" w:line="240" w:lineRule="auto"/>
+        <w:ind w:left="720"/>
         <w:rPr>
           <w:rFonts w:ascii="Courier New" w:eastAsia="Times New Roman" w:hAnsi="Courier New" w:cs="Courier New"/>
           <w:sz w:val="20"/>
           <w:szCs w:val="20"/>
         </w:rPr>
-        <w:t xml:space="preserve">  </w:t>
-      </w:r>
+      </w:pPr>
       <w:r>
         <w:rPr>
           <w:rFonts w:ascii="Courier New" w:eastAsia="Times New Roman" w:hAnsi="Courier New" w:cs="Courier New"/>
           <w:sz w:val="20"/>
           <w:szCs w:val="20"/>
         </w:rPr>
-        <w:t xml:space="preserve">x6, x6, 4       </w:t>
-      </w:r>
-    </w:p>
-    <w:p>
-      <w:pPr>
-        <w:spacing w:after="0" w:line="240" w:lineRule="auto"/>
-        <w:ind w:left="720"/>
+        <w:t xml:space="preserve">        </w:t>
+      </w:r>
+      <w:proofErr w:type="spellStart"/>
+      <w:r>
         <w:rPr>
           <w:rFonts w:ascii="Courier New" w:eastAsia="Times New Roman" w:hAnsi="Courier New" w:cs="Courier New"/>
           <w:sz w:val="20"/>
           <w:szCs w:val="20"/>
         </w:rPr>
-      </w:pPr>
+        <w:t>lw</w:t>
+      </w:r>
+      <w:proofErr w:type="spellEnd"/>
       <w:r>
         <w:rPr>
           <w:rFonts w:ascii="Courier New" w:eastAsia="Times New Roman" w:hAnsi="Courier New" w:cs="Courier New"/>
           <w:sz w:val="20"/>
           <w:szCs w:val="20"/>
         </w:rPr>
-        <w:t xml:space="preserve">        </w:t>
-      </w:r>
-      <w:proofErr w:type="spellStart"/>
+        <w:t xml:space="preserve">      </w:t>
+      </w:r>
       <w:r>
         <w:rPr>
           <w:rFonts w:ascii="Courier New" w:eastAsia="Times New Roman" w:hAnsi="Courier New" w:cs="Courier New"/>
           <w:sz w:val="20"/>
           <w:szCs w:val="20"/>
         </w:rPr>
-        <w:t>lw</w:t>
-      </w:r>
-      <w:proofErr w:type="spellEnd"/>
+        <w:t xml:space="preserve">  </w:t>
+      </w:r>
       <w:r>
         <w:rPr>
           <w:rFonts w:ascii="Courier New" w:eastAsia="Times New Roman" w:hAnsi="Courier New" w:cs="Courier New"/>
           <w:sz w:val="20"/>
           <w:szCs w:val="20"/>
         </w:rPr>
-        <w:t xml:space="preserve">      </w:t>
-      </w:r>
-      <w:r>
+        <w:t xml:space="preserve">x10, 0(x6)      </w:t>
+      </w:r>
+    </w:p>
+    <w:p>
+      <w:pPr>
+        <w:spacing w:after="0" w:line="240" w:lineRule="auto"/>
+        <w:ind w:left="720"/>
         <w:rPr>
           <w:rFonts w:ascii="Courier New" w:eastAsia="Times New Roman" w:hAnsi="Courier New" w:cs="Courier New"/>
           <w:sz w:val="20"/>
           <w:szCs w:val="20"/>
         </w:rPr>
-        <w:t xml:space="preserve">  </w:t>
-      </w:r>
+      </w:pPr>
       <w:r>
         <w:rPr>
           <w:rFonts w:ascii="Courier New" w:eastAsia="Times New Roman" w:hAnsi="Courier New" w:cs="Courier New"/>
           <w:sz w:val="20"/>
           <w:szCs w:val="20"/>
         </w:rPr>
-        <w:t xml:space="preserve">x10, 0(x6)      </w:t>
-      </w:r>
-    </w:p>
-    <w:p>
-      <w:pPr>
-        <w:spacing w:after="0" w:line="240" w:lineRule="auto"/>
-        <w:ind w:left="720"/>
+        <w:t xml:space="preserve">        add     </w:t>
+      </w:r>
+      <w:r>
         <w:rPr>
           <w:rFonts w:ascii="Courier New" w:eastAsia="Times New Roman" w:hAnsi="Courier New" w:cs="Courier New"/>
           <w:sz w:val="20"/>
           <w:szCs w:val="20"/>
         </w:rPr>
-      </w:pPr>
+        <w:t xml:space="preserve">  </w:t>
+      </w:r>
       <w:r>
         <w:rPr>
           <w:rFonts w:ascii="Courier New" w:eastAsia="Times New Roman" w:hAnsi="Courier New" w:cs="Courier New"/>
           <w:sz w:val="20"/>
           <w:szCs w:val="20"/>
         </w:rPr>
-        <w:t xml:space="preserve">        add     </w:t>
-      </w:r>
-      <w:r>
+        <w:t xml:space="preserve">x7, x10, x7     </w:t>
+      </w:r>
+    </w:p>
+    <w:p>
+      <w:pPr>
+        <w:spacing w:after="0" w:line="240" w:lineRule="auto"/>
+        <w:ind w:left="720"/>
         <w:rPr>
           <w:rFonts w:ascii="Courier New" w:eastAsia="Times New Roman" w:hAnsi="Courier New" w:cs="Courier New"/>
           <w:sz w:val="20"/>
           <w:szCs w:val="20"/>
         </w:rPr>
-        <w:t xml:space="preserve">  </w:t>
-      </w:r>
+      </w:pPr>
       <w:r>
         <w:rPr>
           <w:rFonts w:ascii="Courier New" w:eastAsia="Times New Roman" w:hAnsi="Courier New" w:cs="Courier New"/>
           <w:sz w:val="20"/>
           <w:szCs w:val="20"/>
         </w:rPr>
-        <w:t xml:space="preserve">x7, x10, x7     </w:t>
-      </w:r>
-    </w:p>
-    <w:p>
-      <w:pPr>
-        <w:spacing w:after="0" w:line="240" w:lineRule="auto"/>
-        <w:ind w:left="720"/>
+        <w:t xml:space="preserve">        </w:t>
+      </w:r>
+      <w:proofErr w:type="spellStart"/>
+      <w:r>
         <w:rPr>
           <w:rFonts w:ascii="Courier New" w:eastAsia="Times New Roman" w:hAnsi="Courier New" w:cs="Courier New"/>
           <w:sz w:val="20"/>
           <w:szCs w:val="20"/>
         </w:rPr>
-      </w:pPr>
+        <w:t>subi</w:t>
+      </w:r>
+      <w:proofErr w:type="spellEnd"/>
       <w:r>
         <w:rPr>
           <w:rFonts w:ascii="Courier New" w:eastAsia="Times New Roman" w:hAnsi="Courier New" w:cs="Courier New"/>
           <w:sz w:val="20"/>
           <w:szCs w:val="20"/>
         </w:rPr>
-        <w:t xml:space="preserve">        </w:t>
-      </w:r>
-      <w:proofErr w:type="spellStart"/>
+        <w:t xml:space="preserve">    </w:t>
+      </w:r>
       <w:r>
         <w:rPr>
           <w:rFonts w:ascii="Courier New" w:eastAsia="Times New Roman" w:hAnsi="Courier New" w:cs="Courier New"/>
           <w:sz w:val="20"/>
           <w:szCs w:val="20"/>
         </w:rPr>
-        <w:t>subi</w:t>
-      </w:r>
-      <w:proofErr w:type="spellEnd"/>
+        <w:t xml:space="preserve">  </w:t>
+      </w:r>
       <w:r>
         <w:rPr>
           <w:rFonts w:ascii="Courier New" w:eastAsia="Times New Roman" w:hAnsi="Courier New" w:cs="Courier New"/>
           <w:sz w:val="20"/>
           <w:szCs w:val="20"/>
         </w:rPr>
-        <w:t xml:space="preserve">    </w:t>
-      </w:r>
-      <w:r>
+        <w:t xml:space="preserve">x5, x5, 1       </w:t>
+      </w:r>
+    </w:p>
+    <w:p>
+      <w:pPr>
+        <w:spacing w:after="0" w:line="240" w:lineRule="auto"/>
+        <w:ind w:left="720"/>
         <w:rPr>
           <w:rFonts w:ascii="Courier New" w:eastAsia="Times New Roman" w:hAnsi="Courier New" w:cs="Courier New"/>
           <w:sz w:val="20"/>
           <w:szCs w:val="20"/>
         </w:rPr>
-        <w:t xml:space="preserve">  </w:t>
-      </w:r>
+      </w:pPr>
       <w:r>
         <w:rPr>
           <w:rFonts w:ascii="Courier New" w:eastAsia="Times New Roman" w:hAnsi="Courier New" w:cs="Courier New"/>
           <w:sz w:val="20"/>
           <w:szCs w:val="20"/>
         </w:rPr>
-        <w:t xml:space="preserve">x5, x5, 1       </w:t>
-      </w:r>
-    </w:p>
-    <w:p>
-      <w:pPr>
-        <w:spacing w:after="0" w:line="240" w:lineRule="auto"/>
-        <w:ind w:left="720"/>
+        <w:t xml:space="preserve">        </w:t>
+      </w:r>
+      <w:proofErr w:type="spellStart"/>
+      <w:r>
         <w:rPr>
           <w:rFonts w:ascii="Courier New" w:eastAsia="Times New Roman" w:hAnsi="Courier New" w:cs="Courier New"/>
           <w:sz w:val="20"/>
           <w:szCs w:val="20"/>
         </w:rPr>
-      </w:pPr>
+        <w:t>bne</w:t>
+      </w:r>
+      <w:proofErr w:type="spellEnd"/>
       <w:r>
         <w:rPr>
           <w:rFonts w:ascii="Courier New" w:eastAsia="Times New Roman" w:hAnsi="Courier New" w:cs="Courier New"/>
           <w:sz w:val="20"/>
           <w:szCs w:val="20"/>
         </w:rPr>
-        <w:t xml:space="preserve">        </w:t>
-      </w:r>
-      <w:proofErr w:type="spellStart"/>
+        <w:t xml:space="preserve">     </w:t>
+      </w:r>
       <w:r>
         <w:rPr>
           <w:rFonts w:ascii="Courier New" w:eastAsia="Times New Roman" w:hAnsi="Courier New" w:cs="Courier New"/>
           <w:sz w:val="20"/>
           <w:szCs w:val="20"/>
         </w:rPr>
-        <w:t>bne</w:t>
-      </w:r>
-      <w:proofErr w:type="spellEnd"/>
+        <w:t xml:space="preserve">  </w:t>
+      </w:r>
       <w:r>
         <w:rPr>
           <w:rFonts w:ascii="Courier New" w:eastAsia="Times New Roman" w:hAnsi="Courier New" w:cs="Courier New"/>
           <w:sz w:val="20"/>
           <w:szCs w:val="20"/>
         </w:rPr>
-        <w:t xml:space="preserve">     </w:t>
-      </w:r>
-      <w:r>
+        <w:t>x5, x0, loop</w:t>
+      </w:r>
+    </w:p>
+    <w:p>
+      <w:pPr>
+        <w:spacing w:after="0" w:line="240" w:lineRule="auto"/>
+        <w:ind w:left="720"/>
         <w:rPr>
           <w:rFonts w:ascii="Courier New" w:eastAsia="Times New Roman" w:hAnsi="Courier New" w:cs="Courier New"/>
           <w:sz w:val="20"/>
           <w:szCs w:val="20"/>
         </w:rPr>
-        <w:t xml:space="preserve">  </w:t>
-      </w:r>
+      </w:pPr>
       <w:r>
         <w:rPr>
           <w:rFonts w:ascii="Courier New" w:eastAsia="Times New Roman" w:hAnsi="Courier New" w:cs="Courier New"/>
           <w:sz w:val="20"/>
           <w:szCs w:val="20"/>
         </w:rPr>
-        <w:t>x5, x0, loop</w:t>
-      </w:r>
-    </w:p>
-    <w:p>
-      <w:pPr>
-        <w:spacing w:after="0" w:line="240" w:lineRule="auto"/>
-        <w:ind w:left="720"/>
+        <w:t xml:space="preserve">done:   j       </w:t>
+      </w:r>
+      <w:r>
         <w:rPr>
           <w:rFonts w:ascii="Courier New" w:eastAsia="Times New Roman" w:hAnsi="Courier New" w:cs="Courier New"/>
           <w:sz w:val="20"/>
           <w:szCs w:val="20"/>
         </w:rPr>
-      </w:pPr>
+        <w:t xml:space="preserve">  </w:t>
+      </w:r>
       <w:r>
         <w:rPr>
           <w:rFonts w:ascii="Courier New" w:eastAsia="Times New Roman" w:hAnsi="Courier New" w:cs="Courier New"/>
           <w:sz w:val="20"/>
           <w:szCs w:val="20"/>
         </w:rPr>
-        <w:t xml:space="preserve">done:   j       </w:t>
-      </w:r>
-      <w:r>
+        <w:t>done            # infinite loop (breakpoint)</w:t>
+      </w:r>
+    </w:p>
+    <w:p>
+      <w:pPr>
+        <w:spacing w:after="0" w:line="240" w:lineRule="auto"/>
+        <w:ind w:left="720"/>
         <w:rPr>
           <w:rFonts w:ascii="Courier New" w:eastAsia="Times New Roman" w:hAnsi="Courier New" w:cs="Courier New"/>
           <w:sz w:val="20"/>
           <w:szCs w:val="20"/>
         </w:rPr>
-        <w:t xml:space="preserve">  </w:t>
-      </w:r>
-      <w:r>
+      </w:pPr>
+    </w:p>
+    <w:p>
+      <w:pPr>
+        <w:spacing w:after="0" w:line="240" w:lineRule="auto"/>
+        <w:ind w:left="720"/>
         <w:rPr>
           <w:rFonts w:ascii="Courier New" w:eastAsia="Times New Roman" w:hAnsi="Courier New" w:cs="Courier New"/>
           <w:sz w:val="20"/>
           <w:szCs w:val="20"/>
         </w:rPr>
-        <w:t>done            # infinite loop (breakpoint)</w:t>
-      </w:r>
-    </w:p>
-    <w:p>
-      <w:pPr>
-        <w:spacing w:after="0" w:line="240" w:lineRule="auto"/>
-        <w:ind w:left="720"/>
+      </w:pPr>
+      <w:r>
         <w:rPr>
           <w:rFonts w:ascii="Courier New" w:eastAsia="Times New Roman" w:hAnsi="Courier New" w:cs="Courier New"/>
           <w:sz w:val="20"/>
           <w:szCs w:val="20"/>
         </w:rPr>
-      </w:pPr>
-    </w:p>
-    <w:p>
-      <w:pPr>
-        <w:spacing w:after="0" w:line="240" w:lineRule="auto"/>
-        <w:ind w:left="720"/>
+        <w:t>#   initialize data in the array</w:t>
+      </w:r>
+      <w:r>
         <w:rPr>
           <w:rFonts w:ascii="Courier New" w:eastAsia="Times New Roman" w:hAnsi="Courier New" w:cs="Courier New"/>
           <w:sz w:val="20"/>
           <w:szCs w:val="20"/>
         </w:rPr>
+        <w:t xml:space="preserve"> [assumed to start at 0x10000000]</w:t>
+      </w:r>
+    </w:p>
+    <w:p>
+      <w:pPr>
+        <w:spacing w:after="0" w:line="240" w:lineRule="auto"/>
+        <w:ind w:left="720"/>
+        <w:rPr>
+          <w:rFonts w:ascii="Times New Roman" w:eastAsia="Times New Roman" w:hAnsi="Times New Roman" w:cs="Times New Roman"/>
+          <w:sz w:val="24"/>
+          <w:szCs w:val="24"/>
+        </w:rPr>
       </w:pPr>
       <w:r>
         <w:rPr>
@@ -1734,70 +1611,7 @@
           <w:sz w:val="20"/>
           <w:szCs w:val="20"/>
         </w:rPr>
-        <w:t xml:space="preserve">#   </w:t>
-      </w:r>
-      <w:proofErr w:type="gramStart"/>
-      <w:r>
-        <w:rPr>
-          <w:rFonts w:ascii="Courier New" w:eastAsia="Times New Roman" w:hAnsi="Courier New" w:cs="Courier New"/>
-          <w:sz w:val="20"/>
-          <w:szCs w:val="20"/>
-        </w:rPr>
-        <w:t>initialize</w:t>
-      </w:r>
-      <w:proofErr w:type="gramEnd"/>
-      <w:r>
-        <w:rPr>
-          <w:rFonts w:ascii="Courier New" w:eastAsia="Times New Roman" w:hAnsi="Courier New" w:cs="Courier New"/>
-          <w:sz w:val="20"/>
-          <w:szCs w:val="20"/>
-        </w:rPr>
-        <w:t xml:space="preserve"> data in the array</w:t>
-      </w:r>
-      <w:r>
-        <w:rPr>
-          <w:rFonts w:ascii="Courier New" w:eastAsia="Times New Roman" w:hAnsi="Courier New" w:cs="Courier New"/>
-          <w:sz w:val="20"/>
-          <w:szCs w:val="20"/>
-        </w:rPr>
-        <w:t xml:space="preserve"> [assumed to start at 0x10000000]</w:t>
-      </w:r>
-    </w:p>
-    <w:p>
-      <w:pPr>
-        <w:spacing w:after="0" w:line="240" w:lineRule="auto"/>
-        <w:ind w:left="720"/>
-        <w:rPr>
-          <w:rFonts w:ascii="Times New Roman" w:eastAsia="Times New Roman" w:hAnsi="Times New Roman" w:cs="Times New Roman"/>
-          <w:sz w:val="24"/>
-          <w:szCs w:val="24"/>
-        </w:rPr>
-      </w:pPr>
-      <w:r>
-        <w:rPr>
-          <w:rFonts w:ascii="Courier New" w:eastAsia="Times New Roman" w:hAnsi="Courier New" w:cs="Courier New"/>
-          <w:sz w:val="20"/>
-          <w:szCs w:val="20"/>
-        </w:rPr>
-        <w:t>array:</w:t>
-      </w:r>
-      <w:proofErr w:type="gramStart"/>
-      <w:r>
-        <w:rPr>
-          <w:rFonts w:ascii="Courier New" w:eastAsia="Times New Roman" w:hAnsi="Courier New" w:cs="Courier New"/>
-          <w:sz w:val="20"/>
-          <w:szCs w:val="20"/>
-        </w:rPr>
-        <w:t xml:space="preserve">  .word</w:t>
-      </w:r>
-      <w:proofErr w:type="gramEnd"/>
-      <w:r>
-        <w:rPr>
-          <w:rFonts w:ascii="Courier New" w:eastAsia="Times New Roman" w:hAnsi="Courier New" w:cs="Courier New"/>
-          <w:sz w:val="20"/>
-          <w:szCs w:val="20"/>
-        </w:rPr>
-        <w:t xml:space="preserve"> 0x5, 0x4, 0x10, 0x3, 0x12, 0x1, 0x7, 0x4, 0x8, 0x2</w:t>
+        <w:t>array:  .word 0x5, 0x4, 0x10, 0x3, 0x12, 0x1, 0x7, 0x4, 0x8, 0x2</w:t>
       </w:r>
     </w:p>
     <w:p>
@@ -1929,10 +1743,10 @@
           <w:shd w:val="clear" w:color="auto" w:fill="FFFFFF"/>
         </w:rPr>
         <w:drawing>
-          <wp:inline distT="0" distB="0" distL="0" distR="0" wp14:anchorId="0A738B80" wp14:editId="2FE8A4AA">
-            <wp:extent cx="5943600" cy="3060065"/>
-            <wp:effectExtent l="0" t="0" r="0" b="6985"/>
-            <wp:docPr id="1875576803" name="Picture 1"/>
+          <wp:inline distT="0" distB="0" distL="0" distR="0" wp14:anchorId="570B0DFA" wp14:editId="658340A0">
+            <wp:extent cx="5943600" cy="3037840"/>
+            <wp:effectExtent l="0" t="0" r="0" b="0"/>
+            <wp:docPr id="1708667812" name="Picture 1"/>
             <wp:cNvGraphicFramePr>
               <a:graphicFrameLocks xmlns:a="http://schemas.openxmlformats.org/drawingml/2006/main" noChangeAspect="1"/>
             </wp:cNvGraphicFramePr>
@@ -1940,7 +1754,7 @@
               <a:graphicData uri="http://schemas.openxmlformats.org/drawingml/2006/picture">
                 <pic:pic xmlns:pic="http://schemas.openxmlformats.org/drawingml/2006/picture">
                   <pic:nvPicPr>
-                    <pic:cNvPr id="1875576803" name=""/>
+                    <pic:cNvPr id="1708667812" name=""/>
                     <pic:cNvPicPr/>
                   </pic:nvPicPr>
                   <pic:blipFill>
@@ -1952,7 +1766,7 @@
                   <pic:spPr>
                     <a:xfrm>
                       <a:off x="0" y="0"/>
-                      <a:ext cx="5943600" cy="3060065"/>
+                      <a:ext cx="5943600" cy="3037840"/>
                     </a:xfrm>
                     <a:prstGeom prst="rect">
                       <a:avLst/>
@@ -2134,21 +1948,9 @@
                 <w:szCs w:val="21"/>
                 <w:shd w:val="clear" w:color="auto" w:fill="FFFFFF"/>
               </w:rPr>
-              <w:t>riscv_</w:t>
-            </w:r>
-            <w:proofErr w:type="gramStart"/>
-            <w:r>
-              <w:rPr>
-                <w:rFonts w:ascii="Helvetica" w:eastAsia="Times New Roman" w:hAnsi="Helvetica" w:cs="Helvetica"/>
-                <w:color w:val="333333"/>
-                <w:sz w:val="21"/>
-                <w:szCs w:val="21"/>
-                <w:shd w:val="clear" w:color="auto" w:fill="FFFFFF"/>
-              </w:rPr>
-              <w:t>multicycle.vhdl</w:t>
+              <w:t>riscv_multicycle.vhdl</w:t>
             </w:r>
             <w:proofErr w:type="spellEnd"/>
-            <w:proofErr w:type="gramEnd"/>
             <w:r>
               <w:rPr>
                 <w:rFonts w:ascii="Helvetica" w:eastAsia="Times New Roman" w:hAnsi="Helvetica" w:cs="Helvetica"/>
@@ -2212,21 +2014,9 @@
                 <w:szCs w:val="21"/>
                 <w:shd w:val="clear" w:color="auto" w:fill="FFFFFF"/>
               </w:rPr>
-              <w:t>pc_</w:t>
-            </w:r>
-            <w:proofErr w:type="gramStart"/>
-            <w:r>
-              <w:rPr>
-                <w:rFonts w:ascii="Helvetica" w:eastAsia="Times New Roman" w:hAnsi="Helvetica" w:cs="Helvetica"/>
-                <w:color w:val="333333"/>
-                <w:sz w:val="21"/>
-                <w:szCs w:val="21"/>
-                <w:shd w:val="clear" w:color="auto" w:fill="FFFFFF"/>
-              </w:rPr>
-              <w:t>live.vhdl</w:t>
+              <w:t>pc_live.vhdl</w:t>
             </w:r>
             <w:proofErr w:type="spellEnd"/>
-            <w:proofErr w:type="gramEnd"/>
           </w:p>
         </w:tc>
         <w:tc>
@@ -2280,21 +2070,9 @@
                 <w:szCs w:val="21"/>
                 <w:shd w:val="clear" w:color="auto" w:fill="FFFFFF"/>
               </w:rPr>
-              <w:t>instr_</w:t>
-            </w:r>
-            <w:proofErr w:type="gramStart"/>
-            <w:r>
-              <w:rPr>
-                <w:rFonts w:ascii="Helvetica" w:eastAsia="Times New Roman" w:hAnsi="Helvetica" w:cs="Helvetica"/>
-                <w:color w:val="333333"/>
-                <w:sz w:val="21"/>
-                <w:szCs w:val="21"/>
-                <w:shd w:val="clear" w:color="auto" w:fill="FFFFFF"/>
-              </w:rPr>
-              <w:t>mem.vhdl</w:t>
+              <w:t>instr_mem.vhdl</w:t>
             </w:r>
             <w:proofErr w:type="spellEnd"/>
-            <w:proofErr w:type="gramEnd"/>
           </w:p>
         </w:tc>
         <w:tc>
@@ -2348,21 +2126,9 @@
                 <w:szCs w:val="21"/>
                 <w:shd w:val="clear" w:color="auto" w:fill="FFFFFF"/>
               </w:rPr>
-              <w:t>reg_</w:t>
-            </w:r>
-            <w:proofErr w:type="gramStart"/>
-            <w:r>
-              <w:rPr>
-                <w:rFonts w:ascii="Helvetica" w:eastAsia="Times New Roman" w:hAnsi="Helvetica" w:cs="Helvetica"/>
-                <w:color w:val="333333"/>
-                <w:sz w:val="21"/>
-                <w:szCs w:val="21"/>
-                <w:shd w:val="clear" w:color="auto" w:fill="FFFFFF"/>
-              </w:rPr>
-              <w:t>file.vhdl</w:t>
+              <w:t>reg_file.vhdl</w:t>
             </w:r>
             <w:proofErr w:type="spellEnd"/>
-            <w:proofErr w:type="gramEnd"/>
           </w:p>
         </w:tc>
         <w:tc>
@@ -2426,21 +2192,9 @@
                 <w:szCs w:val="21"/>
                 <w:shd w:val="clear" w:color="auto" w:fill="FFFFFF"/>
               </w:rPr>
-              <w:t>control_</w:t>
-            </w:r>
-            <w:proofErr w:type="gramStart"/>
-            <w:r>
-              <w:rPr>
-                <w:rFonts w:ascii="Helvetica" w:eastAsia="Times New Roman" w:hAnsi="Helvetica" w:cs="Helvetica"/>
-                <w:color w:val="333333"/>
-                <w:sz w:val="21"/>
-                <w:szCs w:val="21"/>
-                <w:shd w:val="clear" w:color="auto" w:fill="FFFFFF"/>
-              </w:rPr>
-              <w:t>unit.vhdl</w:t>
+              <w:t>control_unit.vhdl</w:t>
             </w:r>
             <w:proofErr w:type="spellEnd"/>
-            <w:proofErr w:type="gramEnd"/>
           </w:p>
         </w:tc>
         <w:tc>
@@ -2726,21 +2480,9 @@
                 <w:szCs w:val="21"/>
                 <w:shd w:val="clear" w:color="auto" w:fill="FFFFFF"/>
               </w:rPr>
-              <w:t>mmediate_</w:t>
-            </w:r>
-            <w:proofErr w:type="gramStart"/>
-            <w:r>
-              <w:rPr>
-                <w:rFonts w:ascii="Helvetica" w:eastAsia="Times New Roman" w:hAnsi="Helvetica" w:cs="Helvetica"/>
-                <w:color w:val="333333"/>
-                <w:sz w:val="21"/>
-                <w:szCs w:val="21"/>
-                <w:shd w:val="clear" w:color="auto" w:fill="FFFFFF"/>
-              </w:rPr>
-              <w:t>generator.vhdl</w:t>
+              <w:t>mmediate_generator.vhdl</w:t>
             </w:r>
             <w:proofErr w:type="spellEnd"/>
-            <w:proofErr w:type="gramEnd"/>
           </w:p>
         </w:tc>
         <w:tc>
@@ -2814,21 +2556,9 @@
                 <w:szCs w:val="21"/>
                 <w:shd w:val="clear" w:color="auto" w:fill="FFFFFF"/>
               </w:rPr>
-              <w:t>alu_</w:t>
-            </w:r>
-            <w:proofErr w:type="gramStart"/>
-            <w:r>
-              <w:rPr>
-                <w:rFonts w:ascii="Helvetica" w:eastAsia="Times New Roman" w:hAnsi="Helvetica" w:cs="Helvetica"/>
-                <w:color w:val="333333"/>
-                <w:sz w:val="21"/>
-                <w:szCs w:val="21"/>
-                <w:shd w:val="clear" w:color="auto" w:fill="FFFFFF"/>
-              </w:rPr>
-              <w:t>control.vhdl</w:t>
+              <w:t>alu_control.vhdl</w:t>
             </w:r>
             <w:proofErr w:type="spellEnd"/>
-            <w:proofErr w:type="gramEnd"/>
           </w:p>
         </w:tc>
         <w:tc>
@@ -2906,7 +2636,6 @@
               </w:rPr>
             </w:pPr>
             <w:proofErr w:type="spellStart"/>
-            <w:proofErr w:type="gramStart"/>
             <w:r>
               <w:rPr>
                 <w:rFonts w:ascii="Helvetica" w:eastAsia="Times New Roman" w:hAnsi="Helvetica" w:cs="Helvetica"/>
@@ -2918,7 +2647,6 @@
               <w:t>alu.vhdl</w:t>
             </w:r>
             <w:proofErr w:type="spellEnd"/>
-            <w:proofErr w:type="gramEnd"/>
           </w:p>
         </w:tc>
         <w:tc>
@@ -2994,21 +2722,9 @@
                 <w:szCs w:val="21"/>
                 <w:shd w:val="clear" w:color="auto" w:fill="FFFFFF"/>
               </w:rPr>
-              <w:t>data_</w:t>
-            </w:r>
-            <w:proofErr w:type="gramStart"/>
-            <w:r>
-              <w:rPr>
-                <w:rFonts w:ascii="Helvetica" w:eastAsia="Times New Roman" w:hAnsi="Helvetica" w:cs="Helvetica"/>
-                <w:color w:val="333333"/>
-                <w:sz w:val="21"/>
-                <w:szCs w:val="21"/>
-                <w:shd w:val="clear" w:color="auto" w:fill="FFFFFF"/>
-              </w:rPr>
-              <w:t>mem.vhdl</w:t>
+              <w:t>data_mem.vhdl</w:t>
             </w:r>
             <w:proofErr w:type="spellEnd"/>
-            <w:proofErr w:type="gramEnd"/>
           </w:p>
         </w:tc>
         <w:tc>
@@ -3072,21 +2788,9 @@
                 <w:szCs w:val="21"/>
                 <w:shd w:val="clear" w:color="auto" w:fill="FFFFFF"/>
               </w:rPr>
-              <w:t>tb_riscv_</w:t>
-            </w:r>
-            <w:proofErr w:type="gramStart"/>
-            <w:r>
-              <w:rPr>
-                <w:rFonts w:ascii="Helvetica" w:eastAsia="Times New Roman" w:hAnsi="Helvetica" w:cs="Helvetica"/>
-                <w:color w:val="333333"/>
-                <w:sz w:val="21"/>
-                <w:szCs w:val="21"/>
-                <w:shd w:val="clear" w:color="auto" w:fill="FFFFFF"/>
-              </w:rPr>
-              <w:t>multicycle.vhdl</w:t>
+              <w:t>tb_riscv_multicycle.vhdl</w:t>
             </w:r>
             <w:proofErr w:type="spellEnd"/>
-            <w:proofErr w:type="gramEnd"/>
           </w:p>
         </w:tc>
         <w:tc>
@@ -3170,21 +2874,9 @@
                 <w:szCs w:val="21"/>
                 <w:shd w:val="clear" w:color="auto" w:fill="FFFFFF"/>
               </w:rPr>
-              <w:t>_multicycle_</w:t>
-            </w:r>
-            <w:proofErr w:type="gramStart"/>
-            <w:r>
-              <w:rPr>
-                <w:rFonts w:ascii="Helvetica" w:eastAsia="Times New Roman" w:hAnsi="Helvetica" w:cs="Helvetica"/>
-                <w:color w:val="333333"/>
-                <w:sz w:val="21"/>
-                <w:szCs w:val="21"/>
-                <w:shd w:val="clear" w:color="auto" w:fill="FFFFFF"/>
-              </w:rPr>
-              <w:t>behav.wcfg</w:t>
+              <w:t>_multicycle_behav.wcfg</w:t>
             </w:r>
             <w:proofErr w:type="spellEnd"/>
-            <w:proofErr w:type="gramEnd"/>
           </w:p>
         </w:tc>
         <w:tc>
@@ -3599,9 +3291,9 @@
                 <w:szCs w:val="21"/>
                 <w:shd w:val="clear" w:color="auto" w:fill="FFFFFF"/>
               </w:rPr>
-              <w:t xml:space="preserve">     </w:t>
-            </w:r>
-            <w:proofErr w:type="gramStart"/>
+              <w:t xml:space="preserve">     #  </w:t>
+            </w:r>
+            <w:proofErr w:type="spellStart"/>
             <w:r>
               <w:rPr>
                 <w:rFonts w:ascii="Helvetica" w:eastAsia="Times New Roman" w:hAnsi="Helvetica" w:cs="Helvetica"/>
@@ -3612,23 +3304,9 @@
                 <w:szCs w:val="21"/>
                 <w:shd w:val="clear" w:color="auto" w:fill="FFFFFF"/>
               </w:rPr>
-              <w:t xml:space="preserve">#  </w:t>
-            </w:r>
-            <w:proofErr w:type="spellStart"/>
-            <w:r>
-              <w:rPr>
-                <w:rFonts w:ascii="Helvetica" w:eastAsia="Times New Roman" w:hAnsi="Helvetica" w:cs="Helvetica"/>
-                <w:i/>
-                <w:iCs/>
-                <w:color w:val="333333"/>
-                <w:sz w:val="21"/>
-                <w:szCs w:val="21"/>
-                <w:shd w:val="clear" w:color="auto" w:fill="FFFFFF"/>
-              </w:rPr>
               <w:t>rd</w:t>
             </w:r>
             <w:proofErr w:type="spellEnd"/>
-            <w:proofErr w:type="gramEnd"/>
             <w:r>
               <w:rPr>
                 <w:rFonts w:ascii="Helvetica" w:eastAsia="Times New Roman" w:hAnsi="Helvetica" w:cs="Helvetica"/>
@@ -4192,9 +3870,9 @@
                 <w:szCs w:val="21"/>
                 <w:shd w:val="clear" w:color="auto" w:fill="FFFFFF"/>
               </w:rPr>
-              <w:t xml:space="preserve">        </w:t>
-            </w:r>
-            <w:proofErr w:type="gramStart"/>
+              <w:t xml:space="preserve">        #  </w:t>
+            </w:r>
+            <w:proofErr w:type="spellStart"/>
             <w:r>
               <w:rPr>
                 <w:rFonts w:ascii="Helvetica" w:eastAsia="Times New Roman" w:hAnsi="Helvetica" w:cs="Helvetica"/>
@@ -4205,23 +3883,9 @@
                 <w:szCs w:val="21"/>
                 <w:shd w:val="clear" w:color="auto" w:fill="FFFFFF"/>
               </w:rPr>
-              <w:t xml:space="preserve">#  </w:t>
-            </w:r>
-            <w:proofErr w:type="spellStart"/>
-            <w:r>
-              <w:rPr>
-                <w:rFonts w:ascii="Helvetica" w:eastAsia="Times New Roman" w:hAnsi="Helvetica" w:cs="Helvetica"/>
-                <w:i/>
-                <w:iCs/>
-                <w:color w:val="333333"/>
-                <w:sz w:val="21"/>
-                <w:szCs w:val="21"/>
-                <w:shd w:val="clear" w:color="auto" w:fill="FFFFFF"/>
-              </w:rPr>
               <w:t>rd</w:t>
             </w:r>
             <w:proofErr w:type="spellEnd"/>
-            <w:proofErr w:type="gramEnd"/>
             <w:r>
               <w:rPr>
                 <w:rFonts w:ascii="Helvetica" w:eastAsia="Times New Roman" w:hAnsi="Helvetica" w:cs="Helvetica"/>
@@ -4823,9 +4487,9 @@
                 <w:szCs w:val="21"/>
                 <w:shd w:val="clear" w:color="auto" w:fill="FFFFFF"/>
               </w:rPr>
-              <w:t xml:space="preserve">        </w:t>
-            </w:r>
-            <w:proofErr w:type="gramStart"/>
+              <w:t xml:space="preserve">        #  </w:t>
+            </w:r>
+            <w:proofErr w:type="spellStart"/>
             <w:r>
               <w:rPr>
                 <w:rFonts w:ascii="Helvetica" w:eastAsia="Times New Roman" w:hAnsi="Helvetica" w:cs="Helvetica"/>
@@ -4836,9 +4500,9 @@
                 <w:szCs w:val="21"/>
                 <w:shd w:val="clear" w:color="auto" w:fill="FFFFFF"/>
               </w:rPr>
-              <w:t xml:space="preserve">#  </w:t>
-            </w:r>
-            <w:proofErr w:type="spellStart"/>
+              <w:t>rd</w:t>
+            </w:r>
+            <w:proofErr w:type="spellEnd"/>
             <w:r>
               <w:rPr>
                 <w:rFonts w:ascii="Helvetica" w:eastAsia="Times New Roman" w:hAnsi="Helvetica" w:cs="Helvetica"/>
@@ -4849,10 +4513,8 @@
                 <w:szCs w:val="21"/>
                 <w:shd w:val="clear" w:color="auto" w:fill="FFFFFF"/>
               </w:rPr>
-              <w:t>rd</w:t>
-            </w:r>
-            <w:proofErr w:type="spellEnd"/>
-            <w:proofErr w:type="gramEnd"/>
+              <w:t xml:space="preserve"> = </w:t>
+            </w:r>
             <w:r>
               <w:rPr>
                 <w:rFonts w:ascii="Helvetica" w:eastAsia="Times New Roman" w:hAnsi="Helvetica" w:cs="Helvetica"/>
@@ -4863,22 +4525,8 @@
                 <w:szCs w:val="21"/>
                 <w:shd w:val="clear" w:color="auto" w:fill="FFFFFF"/>
               </w:rPr>
-              <w:t xml:space="preserve"> = </w:t>
-            </w:r>
-            <w:proofErr w:type="gramStart"/>
-            <w:r>
-              <w:rPr>
-                <w:rFonts w:ascii="Helvetica" w:eastAsia="Times New Roman" w:hAnsi="Helvetica" w:cs="Helvetica"/>
-                <w:i/>
-                <w:iCs/>
-                <w:color w:val="333333"/>
-                <w:sz w:val="21"/>
-                <w:szCs w:val="21"/>
-                <w:shd w:val="clear" w:color="auto" w:fill="FFFFFF"/>
-              </w:rPr>
               <w:t>memory[</w:t>
             </w:r>
-            <w:proofErr w:type="gramEnd"/>
             <w:r>
               <w:rPr>
                 <w:rFonts w:ascii="Helvetica" w:eastAsia="Times New Roman" w:hAnsi="Helvetica" w:cs="Helvetica"/>
@@ -5542,9 +5190,8 @@
                 <w:szCs w:val="21"/>
                 <w:shd w:val="clear" w:color="auto" w:fill="FFFFFF"/>
               </w:rPr>
-              <w:t xml:space="preserve">        </w:t>
-            </w:r>
-            <w:proofErr w:type="gramStart"/>
+              <w:t xml:space="preserve">        #  </w:t>
+            </w:r>
             <w:r>
               <w:rPr>
                 <w:rFonts w:ascii="Helvetica" w:eastAsia="Times New Roman" w:hAnsi="Helvetica" w:cs="Helvetica"/>
@@ -5555,32 +5202,7 @@
                 <w:szCs w:val="21"/>
                 <w:shd w:val="clear" w:color="auto" w:fill="FFFFFF"/>
               </w:rPr>
-              <w:t xml:space="preserve">#  </w:t>
-            </w:r>
-            <w:r>
-              <w:rPr>
-                <w:rFonts w:ascii="Helvetica" w:eastAsia="Times New Roman" w:hAnsi="Helvetica" w:cs="Helvetica"/>
-                <w:i/>
-                <w:iCs/>
-                <w:color w:val="333333"/>
-                <w:sz w:val="21"/>
-                <w:szCs w:val="21"/>
-                <w:shd w:val="clear" w:color="auto" w:fill="FFFFFF"/>
-              </w:rPr>
-              <w:t>PC</w:t>
-            </w:r>
-            <w:proofErr w:type="gramEnd"/>
-            <w:r>
-              <w:rPr>
-                <w:rFonts w:ascii="Helvetica" w:eastAsia="Times New Roman" w:hAnsi="Helvetica" w:cs="Helvetica"/>
-                <w:i/>
-                <w:iCs/>
-                <w:color w:val="333333"/>
-                <w:sz w:val="21"/>
-                <w:szCs w:val="21"/>
-                <w:shd w:val="clear" w:color="auto" w:fill="FFFFFF"/>
-              </w:rPr>
-              <w:t xml:space="preserve"> = PC + 4 + </w:t>
+              <w:t xml:space="preserve">PC = PC + 4 + </w:t>
             </w:r>
             <w:proofErr w:type="spellStart"/>
             <w:r>
@@ -5726,7 +5348,6 @@
               <w:t>&lt;</w:t>
             </w:r>
             <w:proofErr w:type="spellStart"/>
-            <w:proofErr w:type="gramStart"/>
             <w:r>
               <w:rPr>
                 <w:rFonts w:ascii="Helvetica" w:eastAsia="Times New Roman" w:hAnsi="Helvetica" w:cs="Helvetica"/>
@@ -5746,51 +5367,127 @@
                 <w:szCs w:val="21"/>
                 <w:shd w:val="clear" w:color="auto" w:fill="FFFFFF"/>
               </w:rPr>
+              <w:t>[1</w:t>
+            </w:r>
+            <w:r>
+              <w:rPr>
+                <w:rFonts w:ascii="Helvetica" w:eastAsia="Times New Roman" w:hAnsi="Helvetica" w:cs="Helvetica"/>
+                <w:color w:val="333333"/>
+                <w:sz w:val="21"/>
+                <w:szCs w:val="21"/>
+                <w:shd w:val="clear" w:color="auto" w:fill="FFFFFF"/>
+              </w:rPr>
+              <w:t>1</w:t>
+            </w:r>
+            <w:r>
+              <w:rPr>
+                <w:rFonts w:ascii="Helvetica" w:eastAsia="Times New Roman" w:hAnsi="Helvetica" w:cs="Helvetica"/>
+                <w:color w:val="333333"/>
+                <w:sz w:val="21"/>
+                <w:szCs w:val="21"/>
+                <w:shd w:val="clear" w:color="auto" w:fill="FFFFFF"/>
+              </w:rPr>
+              <w:t xml:space="preserve">]&gt; </w:t>
+            </w:r>
+            <w:r>
+              <w:rPr>
+                <w:rFonts w:ascii="Helvetica" w:eastAsia="Times New Roman" w:hAnsi="Helvetica" w:cs="Helvetica"/>
+                <w:color w:val="333333"/>
+                <w:sz w:val="21"/>
+                <w:szCs w:val="21"/>
+                <w:shd w:val="clear" w:color="auto" w:fill="FFFFFF"/>
+              </w:rPr>
+              <w:t>&lt;</w:t>
+            </w:r>
+            <w:proofErr w:type="spellStart"/>
+            <w:r>
+              <w:rPr>
+                <w:rFonts w:ascii="Helvetica" w:eastAsia="Times New Roman" w:hAnsi="Helvetica" w:cs="Helvetica"/>
+                <w:color w:val="333333"/>
+                <w:sz w:val="21"/>
+                <w:szCs w:val="21"/>
+                <w:shd w:val="clear" w:color="auto" w:fill="FFFFFF"/>
+              </w:rPr>
+              <w:t>imm</w:t>
+            </w:r>
+            <w:proofErr w:type="spellEnd"/>
+            <w:r>
+              <w:rPr>
+                <w:rFonts w:ascii="Helvetica" w:eastAsia="Times New Roman" w:hAnsi="Helvetica" w:cs="Helvetica"/>
+                <w:color w:val="333333"/>
+                <w:sz w:val="21"/>
+                <w:szCs w:val="21"/>
+                <w:shd w:val="clear" w:color="auto" w:fill="FFFFFF"/>
+              </w:rPr>
               <w:t>[</w:t>
             </w:r>
-            <w:proofErr w:type="gramEnd"/>
-            <w:r>
-              <w:rPr>
-                <w:rFonts w:ascii="Helvetica" w:eastAsia="Times New Roman" w:hAnsi="Helvetica" w:cs="Helvetica"/>
-                <w:color w:val="333333"/>
-                <w:sz w:val="21"/>
-                <w:szCs w:val="21"/>
-                <w:shd w:val="clear" w:color="auto" w:fill="FFFFFF"/>
-              </w:rPr>
-              <w:t>1</w:t>
-            </w:r>
-            <w:r>
-              <w:rPr>
-                <w:rFonts w:ascii="Helvetica" w:eastAsia="Times New Roman" w:hAnsi="Helvetica" w:cs="Helvetica"/>
-                <w:color w:val="333333"/>
-                <w:sz w:val="21"/>
-                <w:szCs w:val="21"/>
-                <w:shd w:val="clear" w:color="auto" w:fill="FFFFFF"/>
-              </w:rPr>
-              <w:t>1</w:t>
-            </w:r>
-            <w:r>
-              <w:rPr>
-                <w:rFonts w:ascii="Helvetica" w:eastAsia="Times New Roman" w:hAnsi="Helvetica" w:cs="Helvetica"/>
-                <w:color w:val="333333"/>
-                <w:sz w:val="21"/>
-                <w:szCs w:val="21"/>
-                <w:shd w:val="clear" w:color="auto" w:fill="FFFFFF"/>
-              </w:rPr>
-              <w:t xml:space="preserve">]&gt; </w:t>
-            </w:r>
-            <w:r>
-              <w:rPr>
-                <w:rFonts w:ascii="Helvetica" w:eastAsia="Times New Roman" w:hAnsi="Helvetica" w:cs="Helvetica"/>
-                <w:color w:val="333333"/>
-                <w:sz w:val="21"/>
-                <w:szCs w:val="21"/>
-                <w:shd w:val="clear" w:color="auto" w:fill="FFFFFF"/>
-              </w:rPr>
-              <w:t>&lt;</w:t>
+            <w:r>
+              <w:rPr>
+                <w:rFonts w:ascii="Helvetica" w:eastAsia="Times New Roman" w:hAnsi="Helvetica" w:cs="Helvetica"/>
+                <w:color w:val="333333"/>
+                <w:sz w:val="21"/>
+                <w:szCs w:val="21"/>
+                <w:shd w:val="clear" w:color="auto" w:fill="FFFFFF"/>
+              </w:rPr>
+              <w:t>9</w:t>
+            </w:r>
+            <w:r>
+              <w:rPr>
+                <w:rFonts w:ascii="Helvetica" w:eastAsia="Times New Roman" w:hAnsi="Helvetica" w:cs="Helvetica"/>
+                <w:color w:val="333333"/>
+                <w:sz w:val="21"/>
+                <w:szCs w:val="21"/>
+                <w:shd w:val="clear" w:color="auto" w:fill="FFFFFF"/>
+              </w:rPr>
+              <w:t>:</w:t>
+            </w:r>
+            <w:r>
+              <w:rPr>
+                <w:rFonts w:ascii="Helvetica" w:eastAsia="Times New Roman" w:hAnsi="Helvetica" w:cs="Helvetica"/>
+                <w:color w:val="333333"/>
+                <w:sz w:val="21"/>
+                <w:szCs w:val="21"/>
+                <w:shd w:val="clear" w:color="auto" w:fill="FFFFFF"/>
+              </w:rPr>
+              <w:t>4</w:t>
+            </w:r>
+            <w:r>
+              <w:rPr>
+                <w:rFonts w:ascii="Helvetica" w:eastAsia="Times New Roman" w:hAnsi="Helvetica" w:cs="Helvetica"/>
+                <w:color w:val="333333"/>
+                <w:sz w:val="21"/>
+                <w:szCs w:val="21"/>
+                <w:shd w:val="clear" w:color="auto" w:fill="FFFFFF"/>
+              </w:rPr>
+              <w:t>]&gt; &lt;5-bit rs2&gt;</w:t>
+            </w:r>
+            <w:r>
+              <w:t xml:space="preserve"> </w:t>
+            </w:r>
+            <w:r>
+              <w:rPr>
+                <w:rFonts w:ascii="Helvetica" w:eastAsia="Times New Roman" w:hAnsi="Helvetica" w:cs="Helvetica"/>
+                <w:color w:val="333333"/>
+                <w:sz w:val="21"/>
+                <w:szCs w:val="21"/>
+                <w:shd w:val="clear" w:color="auto" w:fill="FFFFFF"/>
+              </w:rPr>
+              <w:t>&lt;5-bit rs1&gt;</w:t>
+            </w:r>
+            <w:r>
+              <w:t xml:space="preserve"> </w:t>
+            </w:r>
+            <w:r>
+              <w:rPr>
+                <w:rFonts w:ascii="Helvetica" w:eastAsia="Times New Roman" w:hAnsi="Helvetica" w:cs="Helvetica"/>
+                <w:color w:val="333333"/>
+                <w:sz w:val="21"/>
+                <w:szCs w:val="21"/>
+                <w:shd w:val="clear" w:color="auto" w:fill="FFFFFF"/>
+              </w:rPr>
+              <w:t>&lt;3-bit funct3&gt; &lt;</w:t>
             </w:r>
             <w:proofErr w:type="spellStart"/>
-            <w:proofErr w:type="gramStart"/>
             <w:r>
               <w:rPr>
                 <w:rFonts w:ascii="Helvetica" w:eastAsia="Times New Roman" w:hAnsi="Helvetica" w:cs="Helvetica"/>
@@ -5812,97 +5509,6 @@
               </w:rPr>
               <w:t>[</w:t>
             </w:r>
-            <w:proofErr w:type="gramEnd"/>
-            <w:r>
-              <w:rPr>
-                <w:rFonts w:ascii="Helvetica" w:eastAsia="Times New Roman" w:hAnsi="Helvetica" w:cs="Helvetica"/>
-                <w:color w:val="333333"/>
-                <w:sz w:val="21"/>
-                <w:szCs w:val="21"/>
-                <w:shd w:val="clear" w:color="auto" w:fill="FFFFFF"/>
-              </w:rPr>
-              <w:t>9</w:t>
-            </w:r>
-            <w:r>
-              <w:rPr>
-                <w:rFonts w:ascii="Helvetica" w:eastAsia="Times New Roman" w:hAnsi="Helvetica" w:cs="Helvetica"/>
-                <w:color w:val="333333"/>
-                <w:sz w:val="21"/>
-                <w:szCs w:val="21"/>
-                <w:shd w:val="clear" w:color="auto" w:fill="FFFFFF"/>
-              </w:rPr>
-              <w:t>:</w:t>
-            </w:r>
-            <w:r>
-              <w:rPr>
-                <w:rFonts w:ascii="Helvetica" w:eastAsia="Times New Roman" w:hAnsi="Helvetica" w:cs="Helvetica"/>
-                <w:color w:val="333333"/>
-                <w:sz w:val="21"/>
-                <w:szCs w:val="21"/>
-                <w:shd w:val="clear" w:color="auto" w:fill="FFFFFF"/>
-              </w:rPr>
-              <w:t>4</w:t>
-            </w:r>
-            <w:r>
-              <w:rPr>
-                <w:rFonts w:ascii="Helvetica" w:eastAsia="Times New Roman" w:hAnsi="Helvetica" w:cs="Helvetica"/>
-                <w:color w:val="333333"/>
-                <w:sz w:val="21"/>
-                <w:szCs w:val="21"/>
-                <w:shd w:val="clear" w:color="auto" w:fill="FFFFFF"/>
-              </w:rPr>
-              <w:t>]&gt; &lt;5-bit rs2&gt;</w:t>
-            </w:r>
-            <w:r>
-              <w:t xml:space="preserve"> </w:t>
-            </w:r>
-            <w:r>
-              <w:rPr>
-                <w:rFonts w:ascii="Helvetica" w:eastAsia="Times New Roman" w:hAnsi="Helvetica" w:cs="Helvetica"/>
-                <w:color w:val="333333"/>
-                <w:sz w:val="21"/>
-                <w:szCs w:val="21"/>
-                <w:shd w:val="clear" w:color="auto" w:fill="FFFFFF"/>
-              </w:rPr>
-              <w:t>&lt;5-bit rs1&gt;</w:t>
-            </w:r>
-            <w:r>
-              <w:t xml:space="preserve"> </w:t>
-            </w:r>
-            <w:r>
-              <w:rPr>
-                <w:rFonts w:ascii="Helvetica" w:eastAsia="Times New Roman" w:hAnsi="Helvetica" w:cs="Helvetica"/>
-                <w:color w:val="333333"/>
-                <w:sz w:val="21"/>
-                <w:szCs w:val="21"/>
-                <w:shd w:val="clear" w:color="auto" w:fill="FFFFFF"/>
-              </w:rPr>
-              <w:t>&lt;3-bit funct3&gt; &lt;</w:t>
-            </w:r>
-            <w:proofErr w:type="spellStart"/>
-            <w:proofErr w:type="gramStart"/>
-            <w:r>
-              <w:rPr>
-                <w:rFonts w:ascii="Helvetica" w:eastAsia="Times New Roman" w:hAnsi="Helvetica" w:cs="Helvetica"/>
-                <w:color w:val="333333"/>
-                <w:sz w:val="21"/>
-                <w:szCs w:val="21"/>
-                <w:shd w:val="clear" w:color="auto" w:fill="FFFFFF"/>
-              </w:rPr>
-              <w:t>imm</w:t>
-            </w:r>
-            <w:proofErr w:type="spellEnd"/>
-            <w:r>
-              <w:rPr>
-                <w:rFonts w:ascii="Helvetica" w:eastAsia="Times New Roman" w:hAnsi="Helvetica" w:cs="Helvetica"/>
-                <w:color w:val="333333"/>
-                <w:sz w:val="21"/>
-                <w:szCs w:val="21"/>
-                <w:shd w:val="clear" w:color="auto" w:fill="FFFFFF"/>
-              </w:rPr>
-              <w:t>[</w:t>
-            </w:r>
-            <w:proofErr w:type="gramEnd"/>
             <w:r>
               <w:rPr>
                 <w:rFonts w:ascii="Helvetica" w:eastAsia="Times New Roman" w:hAnsi="Helvetica" w:cs="Helvetica"/>
@@ -5965,7 +5571,6 @@
               <w:t>&lt;</w:t>
             </w:r>
             <w:proofErr w:type="spellStart"/>
-            <w:proofErr w:type="gramStart"/>
             <w:r>
               <w:rPr>
                 <w:rFonts w:ascii="Helvetica" w:eastAsia="Times New Roman" w:hAnsi="Helvetica" w:cs="Helvetica"/>
@@ -5985,18 +5590,7 @@
                 <w:szCs w:val="21"/>
                 <w:shd w:val="clear" w:color="auto" w:fill="FFFFFF"/>
               </w:rPr>
-              <w:t>[</w:t>
-            </w:r>
-            <w:proofErr w:type="gramEnd"/>
-            <w:r>
-              <w:rPr>
-                <w:rFonts w:ascii="Helvetica" w:eastAsia="Times New Roman" w:hAnsi="Helvetica" w:cs="Helvetica"/>
-                <w:color w:val="333333"/>
-                <w:sz w:val="21"/>
-                <w:szCs w:val="21"/>
-                <w:shd w:val="clear" w:color="auto" w:fill="FFFFFF"/>
-              </w:rPr>
-              <w:t>1</w:t>
+              <w:t>[1</w:t>
             </w:r>
             <w:r>
               <w:rPr>
@@ -6131,7 +5725,6 @@
                 <w:shd w:val="clear" w:color="auto" w:fill="FFFFFF"/>
               </w:rPr>
             </w:pPr>
-            <w:proofErr w:type="gramStart"/>
             <w:r>
               <w:rPr>
                 <w:rFonts w:ascii="Helvetica" w:hAnsi="Helvetica" w:cs="Helvetica"/>
@@ -6140,9 +5733,9 @@
                 <w:szCs w:val="21"/>
                 <w:shd w:val="clear" w:color="auto" w:fill="FFFFFF"/>
               </w:rPr>
-              <w:t>So</w:t>
-            </w:r>
-            <w:proofErr w:type="gramEnd"/>
+              <w:t>So the final PC = PC + 4 + (sign extend)(</w:t>
+            </w:r>
+            <w:proofErr w:type="spellStart"/>
             <w:r>
               <w:rPr>
                 <w:rFonts w:ascii="Helvetica" w:hAnsi="Helvetica" w:cs="Helvetica"/>
@@ -6151,9 +5744,9 @@
                 <w:szCs w:val="21"/>
                 <w:shd w:val="clear" w:color="auto" w:fill="FFFFFF"/>
               </w:rPr>
-              <w:t xml:space="preserve"> the final PC = PC + 4 + (sign </w:t>
-            </w:r>
-            <w:proofErr w:type="gramStart"/>
+              <w:t>imm</w:t>
+            </w:r>
+            <w:proofErr w:type="spellEnd"/>
             <w:r>
               <w:rPr>
                 <w:rFonts w:ascii="Helvetica" w:hAnsi="Helvetica" w:cs="Helvetica"/>
@@ -6162,31 +5755,8 @@
                 <w:szCs w:val="21"/>
                 <w:shd w:val="clear" w:color="auto" w:fill="FFFFFF"/>
               </w:rPr>
-              <w:t>extend)(</w:t>
-            </w:r>
-            <w:proofErr w:type="spellStart"/>
-            <w:r>
-              <w:rPr>
-                <w:rFonts w:ascii="Helvetica" w:hAnsi="Helvetica" w:cs="Helvetica"/>
-                <w:color w:val="333333"/>
-                <w:sz w:val="21"/>
-                <w:szCs w:val="21"/>
-                <w:shd w:val="clear" w:color="auto" w:fill="FFFFFF"/>
-              </w:rPr>
-              <w:t>imm</w:t>
-            </w:r>
-            <w:proofErr w:type="spellEnd"/>
-            <w:r>
-              <w:rPr>
-                <w:rFonts w:ascii="Helvetica" w:hAnsi="Helvetica" w:cs="Helvetica"/>
-                <w:color w:val="333333"/>
-                <w:sz w:val="21"/>
-                <w:szCs w:val="21"/>
-                <w:shd w:val="clear" w:color="auto" w:fill="FFFFFF"/>
-              </w:rPr>
               <w:t>[</w:t>
             </w:r>
-            <w:proofErr w:type="gramEnd"/>
             <w:r>
               <w:rPr>
                 <w:rFonts w:ascii="Helvetica" w:hAnsi="Helvetica" w:cs="Helvetica"/>
@@ -6239,7 +5809,6 @@
               <w:t xml:space="preserve">Note: for our implementation, </w:t>
             </w:r>
             <w:proofErr w:type="spellStart"/>
-            <w:proofErr w:type="gramStart"/>
             <w:r>
               <w:rPr>
                 <w:rFonts w:ascii="Helvetica" w:hAnsi="Helvetica" w:cs="Helvetica"/>
@@ -6261,7 +5830,6 @@
               </w:rPr>
               <w:t>[</w:t>
             </w:r>
-            <w:proofErr w:type="gramEnd"/>
             <w:r>
               <w:rPr>
                 <w:rFonts w:ascii="Helvetica" w:hAnsi="Helvetica" w:cs="Helvetica"/>
@@ -6379,6 +5947,18 @@
           <w:color w:val="333333"/>
           <w:sz w:val="21"/>
           <w:szCs w:val="21"/>
+          <w:shd w:val="clear" w:color="auto" w:fill="FFFFFF"/>
+        </w:rPr>
+      </w:pPr>
+    </w:p>
+    <w:p>
+      <w:pPr>
+        <w:spacing w:after="0" w:line="240" w:lineRule="auto"/>
+        <w:rPr>
+          <w:rFonts w:ascii="Helvetica" w:eastAsia="Times New Roman" w:hAnsi="Helvetica" w:cs="Helvetica"/>
+          <w:color w:val="333333"/>
+          <w:sz w:val="21"/>
+          <w:szCs w:val="21"/>
           <w:highlight w:val="yellow"/>
           <w:shd w:val="clear" w:color="auto" w:fill="FFFFFF"/>
         </w:rPr>
@@ -6391,6 +5971,7 @@
           <w:szCs w:val="21"/>
           <w:shd w:val="clear" w:color="auto" w:fill="FFFFFF"/>
         </w:rPr>
+        <w:lastRenderedPageBreak/>
         <w:t>Custom Instructions</w:t>
       </w:r>
       <w:r>
@@ -6403,18 +5984,16 @@
         </w:rPr>
         <w:t xml:space="preserve"> [replacing </w:t>
       </w:r>
-      <w:proofErr w:type="spellStart"/>
-      <w:r>
-        <w:rPr>
-          <w:rFonts w:ascii="Helvetica" w:eastAsia="Times New Roman" w:hAnsi="Helvetica" w:cs="Helvetica"/>
-          <w:color w:val="333333"/>
-          <w:sz w:val="21"/>
-          <w:szCs w:val="21"/>
-          <w:shd w:val="clear" w:color="auto" w:fill="FFFFFF"/>
-        </w:rPr>
-        <w:t>Psuedo</w:t>
-      </w:r>
-      <w:proofErr w:type="spellEnd"/>
+      <w:r>
+        <w:rPr>
+          <w:rFonts w:ascii="Helvetica" w:eastAsia="Times New Roman" w:hAnsi="Helvetica" w:cs="Helvetica"/>
+          <w:color w:val="333333"/>
+          <w:sz w:val="21"/>
+          <w:szCs w:val="21"/>
+          <w:shd w:val="clear" w:color="auto" w:fill="FFFFFF"/>
+        </w:rPr>
+        <w:t>Pseudo</w:t>
+      </w:r>
       <w:r>
         <w:rPr>
           <w:rFonts w:ascii="Helvetica" w:eastAsia="Times New Roman" w:hAnsi="Helvetica" w:cs="Helvetica"/>
@@ -6469,7 +6048,6 @@
                 <w:szCs w:val="21"/>
                 <w:shd w:val="clear" w:color="auto" w:fill="FFFFFF"/>
               </w:rPr>
-              <w:lastRenderedPageBreak/>
               <w:t>J</w:t>
             </w:r>
           </w:p>
@@ -6546,20 +6124,8 @@
                 <w:szCs w:val="21"/>
                 <w:shd w:val="clear" w:color="auto" w:fill="FFFFFF"/>
               </w:rPr>
-              <w:t xml:space="preserve"> </w:t>
-            </w:r>
-            <w:proofErr w:type="gramStart"/>
-            <w:r>
-              <w:rPr>
-                <w:rFonts w:ascii="Helvetica" w:eastAsia="Times New Roman" w:hAnsi="Helvetica" w:cs="Helvetica"/>
-                <w:color w:val="333333"/>
-                <w:sz w:val="21"/>
-                <w:szCs w:val="21"/>
-                <w:shd w:val="clear" w:color="auto" w:fill="FFFFFF"/>
-              </w:rPr>
-              <w:t>where</w:t>
-            </w:r>
-            <w:proofErr w:type="gramEnd"/>
+              <w:t xml:space="preserve"> where</w:t>
+            </w:r>
           </w:p>
           <w:p>
             <w:pPr>
@@ -6704,7 +6270,6 @@
               <w:t xml:space="preserve">, </w:t>
             </w:r>
             <w:proofErr w:type="spellStart"/>
-            <w:proofErr w:type="gramStart"/>
             <w:r>
               <w:rPr>
                 <w:rFonts w:ascii="Helvetica" w:eastAsia="Times New Roman" w:hAnsi="Helvetica" w:cs="Helvetica"/>
@@ -6728,20 +6293,7 @@
                 <w:szCs w:val="21"/>
                 <w:shd w:val="clear" w:color="auto" w:fill="FFFFFF"/>
               </w:rPr>
-              <w:t xml:space="preserve">  #</w:t>
-            </w:r>
-            <w:proofErr w:type="gramEnd"/>
-            <w:r>
-              <w:rPr>
-                <w:rFonts w:ascii="Helvetica" w:eastAsia="Times New Roman" w:hAnsi="Helvetica" w:cs="Helvetica"/>
-                <w:i/>
-                <w:iCs/>
-                <w:color w:val="333333"/>
-                <w:sz w:val="21"/>
-                <w:szCs w:val="21"/>
-                <w:shd w:val="clear" w:color="auto" w:fill="FFFFFF"/>
-              </w:rPr>
-              <w:t xml:space="preserve"> jump to PC = PC + 4 +</w:t>
+              <w:t xml:space="preserve">  # jump to PC = PC + 4 +</w:t>
             </w:r>
             <w:r>
               <w:rPr>
@@ -6945,9 +6497,8 @@
                 <w:szCs w:val="21"/>
                 <w:shd w:val="clear" w:color="auto" w:fill="FFFFFF"/>
               </w:rPr>
-              <w:t xml:space="preserve">        </w:t>
-            </w:r>
-            <w:proofErr w:type="gramStart"/>
+              <w:t xml:space="preserve">        #  </w:t>
+            </w:r>
             <w:r>
               <w:rPr>
                 <w:rFonts w:ascii="Helvetica" w:eastAsia="Times New Roman" w:hAnsi="Helvetica" w:cs="Helvetica"/>
@@ -6958,32 +6509,7 @@
                 <w:szCs w:val="21"/>
                 <w:shd w:val="clear" w:color="auto" w:fill="FFFFFF"/>
               </w:rPr>
-              <w:t xml:space="preserve">#  </w:t>
-            </w:r>
-            <w:r>
-              <w:rPr>
-                <w:rFonts w:ascii="Helvetica" w:eastAsia="Times New Roman" w:hAnsi="Helvetica" w:cs="Helvetica"/>
-                <w:i/>
-                <w:iCs/>
-                <w:color w:val="333333"/>
-                <w:sz w:val="21"/>
-                <w:szCs w:val="21"/>
-                <w:shd w:val="clear" w:color="auto" w:fill="FFFFFF"/>
-              </w:rPr>
-              <w:t>PC</w:t>
-            </w:r>
-            <w:proofErr w:type="gramEnd"/>
-            <w:r>
-              <w:rPr>
-                <w:rFonts w:ascii="Helvetica" w:eastAsia="Times New Roman" w:hAnsi="Helvetica" w:cs="Helvetica"/>
-                <w:i/>
-                <w:iCs/>
-                <w:color w:val="333333"/>
-                <w:sz w:val="21"/>
-                <w:szCs w:val="21"/>
-                <w:shd w:val="clear" w:color="auto" w:fill="FFFFFF"/>
-              </w:rPr>
-              <w:t xml:space="preserve"> = PC + 4 + </w:t>
+              <w:t xml:space="preserve">PC = PC + 4 + </w:t>
             </w:r>
             <w:proofErr w:type="spellStart"/>
             <w:r>
@@ -7117,7 +6643,6 @@
               <w:t xml:space="preserve">    “&lt;</w:t>
             </w:r>
             <w:proofErr w:type="spellStart"/>
-            <w:proofErr w:type="gramStart"/>
             <w:r>
               <w:rPr>
                 <w:rFonts w:ascii="Helvetica" w:eastAsia="Times New Roman" w:hAnsi="Helvetica" w:cs="Helvetica"/>
@@ -7137,18 +6662,7 @@
                 <w:szCs w:val="21"/>
                 <w:shd w:val="clear" w:color="auto" w:fill="FFFFFF"/>
               </w:rPr>
-              <w:t>[</w:t>
-            </w:r>
-            <w:proofErr w:type="gramEnd"/>
-            <w:r>
-              <w:rPr>
-                <w:rFonts w:ascii="Helvetica" w:eastAsia="Times New Roman" w:hAnsi="Helvetica" w:cs="Helvetica"/>
-                <w:color w:val="333333"/>
-                <w:sz w:val="21"/>
-                <w:szCs w:val="21"/>
-                <w:shd w:val="clear" w:color="auto" w:fill="FFFFFF"/>
-              </w:rPr>
-              <w:t>20]</w:t>
+              <w:t>[20]</w:t>
             </w:r>
             <w:r>
               <w:rPr>
@@ -7171,7 +6685,6 @@
               <w:t>&lt;</w:t>
             </w:r>
             <w:proofErr w:type="spellStart"/>
-            <w:proofErr w:type="gramStart"/>
             <w:r>
               <w:rPr>
                 <w:rFonts w:ascii="Helvetica" w:eastAsia="Times New Roman" w:hAnsi="Helvetica" w:cs="Helvetica"/>
@@ -7191,18 +6704,7 @@
                 <w:szCs w:val="21"/>
                 <w:shd w:val="clear" w:color="auto" w:fill="FFFFFF"/>
               </w:rPr>
-              <w:t>[</w:t>
-            </w:r>
-            <w:proofErr w:type="gramEnd"/>
-            <w:r>
-              <w:rPr>
-                <w:rFonts w:ascii="Helvetica" w:eastAsia="Times New Roman" w:hAnsi="Helvetica" w:cs="Helvetica"/>
-                <w:color w:val="333333"/>
-                <w:sz w:val="21"/>
-                <w:szCs w:val="21"/>
-                <w:shd w:val="clear" w:color="auto" w:fill="FFFFFF"/>
-              </w:rPr>
-              <w:t>10</w:t>
+              <w:t>[10</w:t>
             </w:r>
             <w:r>
               <w:rPr>
@@ -7235,7 +6737,6 @@
               <w:t>&lt;</w:t>
             </w:r>
             <w:proofErr w:type="spellStart"/>
-            <w:proofErr w:type="gramStart"/>
             <w:r>
               <w:rPr>
                 <w:rFonts w:ascii="Helvetica" w:eastAsia="Times New Roman" w:hAnsi="Helvetica" w:cs="Helvetica"/>
@@ -7255,18 +6756,7 @@
                 <w:szCs w:val="21"/>
                 <w:shd w:val="clear" w:color="auto" w:fill="FFFFFF"/>
               </w:rPr>
-              <w:t>[</w:t>
-            </w:r>
-            <w:proofErr w:type="gramEnd"/>
-            <w:r>
-              <w:rPr>
-                <w:rFonts w:ascii="Helvetica" w:eastAsia="Times New Roman" w:hAnsi="Helvetica" w:cs="Helvetica"/>
-                <w:color w:val="333333"/>
-                <w:sz w:val="21"/>
-                <w:szCs w:val="21"/>
-                <w:shd w:val="clear" w:color="auto" w:fill="FFFFFF"/>
-              </w:rPr>
-              <w:t>11]&gt;</w:t>
+              <w:t>[11]&gt;</w:t>
             </w:r>
             <w:r>
               <w:rPr>
@@ -7279,7 +6769,6 @@
               <w:t xml:space="preserve"> &lt;</w:t>
             </w:r>
             <w:proofErr w:type="spellStart"/>
-            <w:proofErr w:type="gramStart"/>
             <w:r>
               <w:rPr>
                 <w:rFonts w:ascii="Helvetica" w:eastAsia="Times New Roman" w:hAnsi="Helvetica" w:cs="Helvetica"/>
@@ -7299,18 +6788,7 @@
                 <w:szCs w:val="21"/>
                 <w:shd w:val="clear" w:color="auto" w:fill="FFFFFF"/>
               </w:rPr>
-              <w:t>[</w:t>
-            </w:r>
-            <w:proofErr w:type="gramEnd"/>
-            <w:r>
-              <w:rPr>
-                <w:rFonts w:ascii="Helvetica" w:eastAsia="Times New Roman" w:hAnsi="Helvetica" w:cs="Helvetica"/>
-                <w:color w:val="333333"/>
-                <w:sz w:val="21"/>
-                <w:szCs w:val="21"/>
-                <w:shd w:val="clear" w:color="auto" w:fill="FFFFFF"/>
-              </w:rPr>
-              <w:t>19:12]&gt;</w:t>
+              <w:t>[19:12]&gt;</w:t>
             </w:r>
             <w:r>
               <w:rPr>
@@ -7460,7 +6938,6 @@
                 <w:shd w:val="clear" w:color="auto" w:fill="FFFFFF"/>
               </w:rPr>
             </w:pPr>
-            <w:proofErr w:type="gramStart"/>
             <w:r>
               <w:rPr>
                 <w:rFonts w:ascii="Helvetica" w:hAnsi="Helvetica" w:cs="Helvetica"/>
@@ -7469,9 +6946,9 @@
                 <w:szCs w:val="21"/>
                 <w:shd w:val="clear" w:color="auto" w:fill="FFFFFF"/>
               </w:rPr>
-              <w:t>So</w:t>
-            </w:r>
-            <w:proofErr w:type="gramEnd"/>
+              <w:t>So the final PC = PC + 4 + (sign extend)(</w:t>
+            </w:r>
+            <w:proofErr w:type="spellStart"/>
             <w:r>
               <w:rPr>
                 <w:rFonts w:ascii="Helvetica" w:hAnsi="Helvetica" w:cs="Helvetica"/>
@@ -7480,9 +6957,9 @@
                 <w:szCs w:val="21"/>
                 <w:shd w:val="clear" w:color="auto" w:fill="FFFFFF"/>
               </w:rPr>
-              <w:t xml:space="preserve"> the final PC = PC + 4 + (sign </w:t>
-            </w:r>
-            <w:proofErr w:type="gramStart"/>
+              <w:t>imm</w:t>
+            </w:r>
+            <w:proofErr w:type="spellEnd"/>
             <w:r>
               <w:rPr>
                 <w:rFonts w:ascii="Helvetica" w:hAnsi="Helvetica" w:cs="Helvetica"/>
@@ -7491,40 +6968,7 @@
                 <w:szCs w:val="21"/>
                 <w:shd w:val="clear" w:color="auto" w:fill="FFFFFF"/>
               </w:rPr>
-              <w:t>extend)(</w:t>
-            </w:r>
-            <w:proofErr w:type="spellStart"/>
-            <w:r>
-              <w:rPr>
-                <w:rFonts w:ascii="Helvetica" w:hAnsi="Helvetica" w:cs="Helvetica"/>
-                <w:color w:val="333333"/>
-                <w:sz w:val="21"/>
-                <w:szCs w:val="21"/>
-                <w:shd w:val="clear" w:color="auto" w:fill="FFFFFF"/>
-              </w:rPr>
-              <w:t>imm</w:t>
-            </w:r>
-            <w:proofErr w:type="spellEnd"/>
-            <w:r>
-              <w:rPr>
-                <w:rFonts w:ascii="Helvetica" w:hAnsi="Helvetica" w:cs="Helvetica"/>
-                <w:color w:val="333333"/>
-                <w:sz w:val="21"/>
-                <w:szCs w:val="21"/>
-                <w:shd w:val="clear" w:color="auto" w:fill="FFFFFF"/>
-              </w:rPr>
-              <w:t>[</w:t>
-            </w:r>
-            <w:proofErr w:type="gramEnd"/>
-            <w:r>
-              <w:rPr>
-                <w:rFonts w:ascii="Helvetica" w:hAnsi="Helvetica" w:cs="Helvetica"/>
-                <w:color w:val="333333"/>
-                <w:sz w:val="21"/>
-                <w:szCs w:val="21"/>
-                <w:shd w:val="clear" w:color="auto" w:fill="FFFFFF"/>
-              </w:rPr>
-              <w:t>20:1])</w:t>
+              <w:t>[20:1])</w:t>
             </w:r>
           </w:p>
           <w:p>
@@ -7548,7 +6992,6 @@
               <w:t xml:space="preserve">Note: for our implementation, </w:t>
             </w:r>
             <w:proofErr w:type="spellStart"/>
-            <w:proofErr w:type="gramStart"/>
             <w:r>
               <w:rPr>
                 <w:rFonts w:ascii="Helvetica" w:hAnsi="Helvetica" w:cs="Helvetica"/>
@@ -7568,18 +7011,7 @@
                 <w:szCs w:val="21"/>
                 <w:shd w:val="clear" w:color="auto" w:fill="FFFFFF"/>
               </w:rPr>
-              <w:t>[</w:t>
-            </w:r>
-            <w:proofErr w:type="gramEnd"/>
-            <w:r>
-              <w:rPr>
-                <w:rFonts w:ascii="Helvetica" w:hAnsi="Helvetica" w:cs="Helvetica"/>
-                <w:color w:val="333333"/>
-                <w:sz w:val="21"/>
-                <w:szCs w:val="21"/>
-                <w:shd w:val="clear" w:color="auto" w:fill="FFFFFF"/>
-              </w:rPr>
-              <w:t>20:1] points to a byte</w:t>
+              <w:t>[20:1] points to a byte</w:t>
             </w:r>
             <w:r>
               <w:rPr>
@@ -7685,20 +7117,8 @@
                 <w:szCs w:val="21"/>
                 <w:shd w:val="clear" w:color="auto" w:fill="FFFFFF"/>
               </w:rPr>
-              <w:t xml:space="preserve"> </w:t>
-            </w:r>
-            <w:proofErr w:type="gramStart"/>
-            <w:r>
-              <w:rPr>
-                <w:rFonts w:ascii="Helvetica" w:eastAsia="Times New Roman" w:hAnsi="Helvetica" w:cs="Helvetica"/>
-                <w:color w:val="333333"/>
-                <w:sz w:val="21"/>
-                <w:szCs w:val="21"/>
-                <w:shd w:val="clear" w:color="auto" w:fill="FFFFFF"/>
-              </w:rPr>
-              <w:t>where</w:t>
-            </w:r>
-            <w:proofErr w:type="gramEnd"/>
+              <w:t xml:space="preserve"> where</w:t>
+            </w:r>
           </w:p>
           <w:p>
             <w:pPr>
@@ -8379,29 +7799,7 @@
                 <w:szCs w:val="21"/>
                 <w:shd w:val="clear" w:color="auto" w:fill="FFFFFF"/>
               </w:rPr>
-              <w:t xml:space="preserve"> Since we cannot have a load with a 32-bit immediate value, this pseudo-instruction is </w:t>
-            </w:r>
-            <w:proofErr w:type="gramStart"/>
-            <w:r>
-              <w:rPr>
-                <w:rFonts w:ascii="Helvetica" w:eastAsia="Times New Roman" w:hAnsi="Helvetica" w:cs="Helvetica"/>
-                <w:color w:val="333333"/>
-                <w:sz w:val="21"/>
-                <w:szCs w:val="21"/>
-                <w:shd w:val="clear" w:color="auto" w:fill="FFFFFF"/>
-              </w:rPr>
-              <w:t>replace</w:t>
-            </w:r>
-            <w:proofErr w:type="gramEnd"/>
-            <w:r>
-              <w:rPr>
-                <w:rFonts w:ascii="Helvetica" w:eastAsia="Times New Roman" w:hAnsi="Helvetica" w:cs="Helvetica"/>
-                <w:color w:val="333333"/>
-                <w:sz w:val="21"/>
-                <w:szCs w:val="21"/>
-                <w:shd w:val="clear" w:color="auto" w:fill="FFFFFF"/>
-              </w:rPr>
-              <w:t xml:space="preserve"> with two instructions</w:t>
+              <w:t xml:space="preserve"> Since we cannot have a load with a 32-bit immediate value, this pseudo-instruction is replace with two instructions</w:t>
             </w:r>
             <w:r>
               <w:rPr>
@@ -8496,33 +7894,7 @@
                 <w:szCs w:val="21"/>
                 <w:shd w:val="clear" w:color="auto" w:fill="FFFFFF"/>
               </w:rPr>
-              <w:t xml:space="preserve">, </w:t>
-            </w:r>
-            <w:proofErr w:type="gramStart"/>
-            <w:r>
-              <w:rPr>
-                <w:rFonts w:ascii="Helvetica" w:eastAsia="Times New Roman" w:hAnsi="Helvetica" w:cs="Helvetica"/>
-                <w:i/>
-                <w:iCs/>
-                <w:color w:val="333333"/>
-                <w:sz w:val="21"/>
-                <w:szCs w:val="21"/>
-                <w:shd w:val="clear" w:color="auto" w:fill="FFFFFF"/>
-              </w:rPr>
-              <w:t>offset[</w:t>
-            </w:r>
-            <w:proofErr w:type="gramEnd"/>
-            <w:r>
-              <w:rPr>
-                <w:rFonts w:ascii="Helvetica" w:eastAsia="Times New Roman" w:hAnsi="Helvetica" w:cs="Helvetica"/>
-                <w:i/>
-                <w:iCs/>
-                <w:color w:val="333333"/>
-                <w:sz w:val="21"/>
-                <w:szCs w:val="21"/>
-                <w:shd w:val="clear" w:color="auto" w:fill="FFFFFF"/>
-              </w:rPr>
-              <w:t>31:12]</w:t>
+              <w:t>, offset[31:12]</w:t>
             </w:r>
           </w:p>
           <w:p>
@@ -8550,7 +7922,6 @@
               <w:t xml:space="preserve">     </w:t>
             </w:r>
             <w:proofErr w:type="spellStart"/>
-            <w:proofErr w:type="gramStart"/>
             <w:r>
               <w:rPr>
                 <w:rFonts w:ascii="Helvetica" w:eastAsia="Times New Roman" w:hAnsi="Helvetica" w:cs="Helvetica"/>
@@ -8586,9 +7957,8 @@
                 <w:szCs w:val="21"/>
                 <w:shd w:val="clear" w:color="auto" w:fill="FFFFFF"/>
               </w:rPr>
-              <w:t>x</w:t>
-            </w:r>
-            <w:proofErr w:type="gramEnd"/>
+              <w:t>x5</w:t>
+            </w:r>
             <w:r>
               <w:rPr>
                 <w:rFonts w:ascii="Helvetica" w:eastAsia="Times New Roman" w:hAnsi="Helvetica" w:cs="Helvetica"/>
@@ -8599,7 +7969,7 @@
                 <w:szCs w:val="21"/>
                 <w:shd w:val="clear" w:color="auto" w:fill="FFFFFF"/>
               </w:rPr>
-              <w:t>5</w:t>
+              <w:t xml:space="preserve">, </w:t>
             </w:r>
             <w:r>
               <w:rPr>
@@ -8611,7 +7981,7 @@
                 <w:szCs w:val="21"/>
                 <w:shd w:val="clear" w:color="auto" w:fill="FFFFFF"/>
               </w:rPr>
-              <w:t xml:space="preserve">, </w:t>
+              <w:t>x5</w:t>
             </w:r>
             <w:r>
               <w:rPr>
@@ -8623,45 +7993,7 @@
                 <w:szCs w:val="21"/>
                 <w:shd w:val="clear" w:color="auto" w:fill="FFFFFF"/>
               </w:rPr>
-              <w:t>x5</w:t>
-            </w:r>
-            <w:r>
-              <w:rPr>
-                <w:rFonts w:ascii="Helvetica" w:eastAsia="Times New Roman" w:hAnsi="Helvetica" w:cs="Helvetica"/>
-                <w:i/>
-                <w:iCs/>
-                <w:color w:val="333333"/>
-                <w:sz w:val="21"/>
-                <w:szCs w:val="21"/>
-                <w:shd w:val="clear" w:color="auto" w:fill="FFFFFF"/>
-              </w:rPr>
-              <w:t xml:space="preserve">, </w:t>
-            </w:r>
-            <w:proofErr w:type="gramStart"/>
-            <w:r>
-              <w:rPr>
-                <w:rFonts w:ascii="Helvetica" w:eastAsia="Times New Roman" w:hAnsi="Helvetica" w:cs="Helvetica"/>
-                <w:i/>
-                <w:iCs/>
-                <w:color w:val="333333"/>
-                <w:sz w:val="21"/>
-                <w:szCs w:val="21"/>
-                <w:shd w:val="clear" w:color="auto" w:fill="FFFFFF"/>
-              </w:rPr>
-              <w:t>offset[</w:t>
-            </w:r>
-            <w:proofErr w:type="gramEnd"/>
-            <w:r>
-              <w:rPr>
-                <w:rFonts w:ascii="Helvetica" w:eastAsia="Times New Roman" w:hAnsi="Helvetica" w:cs="Helvetica"/>
-                <w:i/>
-                <w:iCs/>
-                <w:color w:val="333333"/>
-                <w:sz w:val="21"/>
-                <w:szCs w:val="21"/>
-                <w:shd w:val="clear" w:color="auto" w:fill="FFFFFF"/>
-              </w:rPr>
-              <w:t>11:0</w:t>
+              <w:t>, offset[11:0</w:t>
             </w:r>
             <w:r>
               <w:rPr>
@@ -8763,7 +8095,6 @@
               </w:rPr>
               <w:t>Format</w:t>
             </w:r>
-            <w:proofErr w:type="gramStart"/>
             <w:r>
               <w:rPr>
                 <w:rFonts w:ascii="Helvetica" w:eastAsia="Times New Roman" w:hAnsi="Helvetica" w:cs="Helvetica"/>
@@ -8784,7 +8115,6 @@
               </w:rPr>
               <w:t>“</w:t>
             </w:r>
-            <w:proofErr w:type="gramEnd"/>
             <w:r>
               <w:rPr>
                 <w:rFonts w:ascii="Helvetica" w:eastAsia="Times New Roman" w:hAnsi="Helvetica" w:cs="Helvetica"/>
@@ -9631,21 +8961,9 @@
           <w:szCs w:val="21"/>
           <w:shd w:val="clear" w:color="auto" w:fill="FFFFFF"/>
         </w:rPr>
-        <w:t>alu_</w:t>
-      </w:r>
-      <w:proofErr w:type="gramStart"/>
-      <w:r>
-        <w:rPr>
-          <w:rFonts w:ascii="Helvetica" w:eastAsia="Times New Roman" w:hAnsi="Helvetica" w:cs="Helvetica"/>
-          <w:color w:val="333333"/>
-          <w:sz w:val="21"/>
-          <w:szCs w:val="21"/>
-          <w:shd w:val="clear" w:color="auto" w:fill="FFFFFF"/>
-        </w:rPr>
-        <w:t>control.vhdl</w:t>
+        <w:t>alu_control.vhdl</w:t>
       </w:r>
       <w:proofErr w:type="spellEnd"/>
-      <w:proofErr w:type="gramEnd"/>
       <w:r>
         <w:rPr>
           <w:rFonts w:ascii="Helvetica" w:eastAsia="Times New Roman" w:hAnsi="Helvetica" w:cs="Helvetica"/>
@@ -9657,7 +8975,6 @@
         <w:t xml:space="preserve"> and </w:t>
       </w:r>
       <w:proofErr w:type="spellStart"/>
-      <w:proofErr w:type="gramStart"/>
       <w:r>
         <w:rPr>
           <w:rFonts w:ascii="Helvetica" w:eastAsia="Times New Roman" w:hAnsi="Helvetica" w:cs="Helvetica"/>
@@ -9669,7 +8986,6 @@
         <w:t>alu.vhdl</w:t>
       </w:r>
       <w:proofErr w:type="spellEnd"/>
-      <w:proofErr w:type="gramEnd"/>
     </w:p>
     <w:p>
       <w:pPr>
@@ -9703,20 +9019,9 @@
           <w:sz w:val="21"/>
           <w:szCs w:val="21"/>
         </w:rPr>
-        <w:t>instru_</w:t>
-      </w:r>
-      <w:proofErr w:type="gramStart"/>
-      <w:r>
-        <w:rPr>
-          <w:rFonts w:ascii="Helvetica" w:eastAsia="Times New Roman" w:hAnsi="Helvetica" w:cs="Helvetica"/>
-          <w:color w:val="333333"/>
-          <w:sz w:val="21"/>
-          <w:szCs w:val="21"/>
-        </w:rPr>
-        <w:t>mem.vhdl</w:t>
+        <w:t>instru_mem.vhdl</w:t>
       </w:r>
       <w:proofErr w:type="spellEnd"/>
-      <w:proofErr w:type="gramEnd"/>
       <w:r>
         <w:rPr>
           <w:rFonts w:ascii="Helvetica" w:eastAsia="Times New Roman" w:hAnsi="Helvetica" w:cs="Helvetica"/>
@@ -9798,21 +9103,9 @@
           <w:szCs w:val="21"/>
           <w:shd w:val="clear" w:color="auto" w:fill="FFFFFF"/>
         </w:rPr>
-        <w:t>riscv_</w:t>
-      </w:r>
-      <w:proofErr w:type="gramStart"/>
-      <w:r>
-        <w:rPr>
-          <w:rFonts w:ascii="Helvetica" w:eastAsia="Times New Roman" w:hAnsi="Helvetica" w:cs="Helvetica"/>
-          <w:color w:val="333333"/>
-          <w:sz w:val="21"/>
-          <w:szCs w:val="21"/>
-          <w:shd w:val="clear" w:color="auto" w:fill="FFFFFF"/>
-        </w:rPr>
-        <w:t>multicycle.vhdl</w:t>
+        <w:t>riscv_multicycle.vhdl</w:t>
       </w:r>
       <w:proofErr w:type="spellEnd"/>
-      <w:proofErr w:type="gramEnd"/>
     </w:p>
     <w:p>
       <w:pPr>
@@ -9942,17 +9235,7 @@
           <w:sz w:val="21"/>
           <w:szCs w:val="21"/>
         </w:rPr>
-        <w:t>tb_riscv_</w:t>
-      </w:r>
-      <w:proofErr w:type="gramStart"/>
-      <w:r>
-        <w:rPr>
-          <w:rFonts w:ascii="Helvetica" w:eastAsia="Times New Roman" w:hAnsi="Helvetica" w:cs="Helvetica"/>
-          <w:color w:val="333333"/>
-          <w:sz w:val="21"/>
-          <w:szCs w:val="21"/>
-        </w:rPr>
-        <w:t>multi</w:t>
+        <w:t>tb_riscv_multi</w:t>
       </w:r>
       <w:r>
         <w:rPr>
@@ -9964,7 +9247,6 @@
         <w:t>cycle.vhdl</w:t>
       </w:r>
       <w:proofErr w:type="spellEnd"/>
-      <w:proofErr w:type="gramEnd"/>
       <w:r>
         <w:rPr>
           <w:rFonts w:ascii="Helvetica" w:eastAsia="Times New Roman" w:hAnsi="Helvetica" w:cs="Helvetica"/>
@@ -10009,20 +9291,9 @@
           <w:sz w:val="21"/>
           <w:szCs w:val="21"/>
         </w:rPr>
-        <w:t>tb_riscv_multicycle_</w:t>
-      </w:r>
-      <w:proofErr w:type="gramStart"/>
-      <w:r>
-        <w:rPr>
-          <w:rFonts w:ascii="Helvetica" w:eastAsia="Times New Roman" w:hAnsi="Helvetica" w:cs="Helvetica"/>
-          <w:color w:val="333333"/>
-          <w:sz w:val="21"/>
-          <w:szCs w:val="21"/>
-        </w:rPr>
-        <w:t>behav.wcfg</w:t>
+        <w:t>tb_riscv_multicycle_behav.wcfg</w:t>
       </w:r>
       <w:proofErr w:type="spellEnd"/>
-      <w:proofErr w:type="gramEnd"/>
       <w:r>
         <w:rPr>
           <w:rFonts w:ascii="Helvetica" w:eastAsia="Times New Roman" w:hAnsi="Helvetica" w:cs="Helvetica"/>
@@ -10252,9 +9523,9 @@
           <w:sz w:val="21"/>
           <w:szCs w:val="21"/>
         </w:rPr>
-        <w:t>alu_input_</w:t>
-      </w:r>
-      <w:proofErr w:type="gramStart"/>
+        <w:t>alu_input_a</w:t>
+      </w:r>
+      <w:proofErr w:type="spellEnd"/>
       <w:r>
         <w:rPr>
           <w:rFonts w:ascii="Helvetica" w:eastAsia="Times New Roman" w:hAnsi="Helvetica" w:cs="Helvetica"/>
@@ -10264,9 +9535,9 @@
           <w:sz w:val="21"/>
           <w:szCs w:val="21"/>
         </w:rPr>
-        <w:t>a</w:t>
-      </w:r>
-      <w:proofErr w:type="spellEnd"/>
+        <w:t xml:space="preserve">,  </w:t>
+      </w:r>
+      <w:proofErr w:type="spellStart"/>
       <w:r>
         <w:rPr>
           <w:rFonts w:ascii="Helvetica" w:eastAsia="Times New Roman" w:hAnsi="Helvetica" w:cs="Helvetica"/>
@@ -10276,9 +9547,9 @@
           <w:sz w:val="21"/>
           <w:szCs w:val="21"/>
         </w:rPr>
-        <w:t xml:space="preserve">,  </w:t>
-      </w:r>
-      <w:proofErr w:type="spellStart"/>
+        <w:t>alu_input_b</w:t>
+      </w:r>
+      <w:proofErr w:type="spellEnd"/>
       <w:r>
         <w:rPr>
           <w:rFonts w:ascii="Helvetica" w:eastAsia="Times New Roman" w:hAnsi="Helvetica" w:cs="Helvetica"/>
@@ -10288,9 +9559,9 @@
           <w:sz w:val="21"/>
           <w:szCs w:val="21"/>
         </w:rPr>
-        <w:t>alu</w:t>
-      </w:r>
-      <w:proofErr w:type="gramEnd"/>
+        <w:t xml:space="preserve">, </w:t>
+      </w:r>
+      <w:proofErr w:type="spellStart"/>
       <w:r>
         <w:rPr>
           <w:rFonts w:ascii="Helvetica" w:eastAsia="Times New Roman" w:hAnsi="Helvetica" w:cs="Helvetica"/>
@@ -10300,7 +9571,7 @@
           <w:sz w:val="21"/>
           <w:szCs w:val="21"/>
         </w:rPr>
-        <w:t>_input_b</w:t>
+        <w:t>alu_result</w:t>
       </w:r>
       <w:proofErr w:type="spellEnd"/>
       <w:r>
@@ -10324,7 +9595,7 @@
           <w:sz w:val="21"/>
           <w:szCs w:val="21"/>
         </w:rPr>
-        <w:t>alu_result</w:t>
+        <w:t>alu_src</w:t>
       </w:r>
       <w:proofErr w:type="spellEnd"/>
       <w:r>
@@ -10348,46 +9619,9 @@
           <w:sz w:val="21"/>
           <w:szCs w:val="21"/>
         </w:rPr>
-        <w:t>alu_</w:t>
-      </w:r>
-      <w:proofErr w:type="gramStart"/>
-      <w:r>
-        <w:rPr>
-          <w:rFonts w:ascii="Helvetica" w:eastAsia="Times New Roman" w:hAnsi="Helvetica" w:cs="Helvetica"/>
-          <w:i/>
-          <w:iCs/>
-          <w:color w:val="333333"/>
-          <w:sz w:val="21"/>
-          <w:szCs w:val="21"/>
-        </w:rPr>
-        <w:t>src</w:t>
+        <w:t>reg_write</w:t>
       </w:r>
       <w:proofErr w:type="spellEnd"/>
-      <w:r>
-        <w:rPr>
-          <w:rFonts w:ascii="Helvetica" w:eastAsia="Times New Roman" w:hAnsi="Helvetica" w:cs="Helvetica"/>
-          <w:i/>
-          <w:iCs/>
-          <w:color w:val="333333"/>
-          <w:sz w:val="21"/>
-          <w:szCs w:val="21"/>
-        </w:rPr>
-        <w:t xml:space="preserve">, </w:t>
-      </w:r>
-      <w:proofErr w:type="spellStart"/>
-      <w:r>
-        <w:rPr>
-          <w:rFonts w:ascii="Helvetica" w:eastAsia="Times New Roman" w:hAnsi="Helvetica" w:cs="Helvetica"/>
-          <w:i/>
-          <w:iCs/>
-          <w:color w:val="333333"/>
-          <w:sz w:val="21"/>
-          <w:szCs w:val="21"/>
-        </w:rPr>
-        <w:t>reg_write</w:t>
-      </w:r>
-      <w:proofErr w:type="spellEnd"/>
-      <w:proofErr w:type="gramEnd"/>
       <w:r>
         <w:rPr>
           <w:rFonts w:ascii="Helvetica" w:eastAsia="Times New Roman" w:hAnsi="Helvetica" w:cs="Helvetica"/>
@@ -10540,20 +9774,9 @@
           <w:sz w:val="21"/>
           <w:szCs w:val="21"/>
         </w:rPr>
-        <w:t>instru_</w:t>
-      </w:r>
-      <w:proofErr w:type="gramStart"/>
-      <w:r>
-        <w:rPr>
-          <w:rFonts w:ascii="Helvetica" w:eastAsia="Times New Roman" w:hAnsi="Helvetica" w:cs="Helvetica"/>
-          <w:color w:val="333333"/>
-          <w:sz w:val="21"/>
-          <w:szCs w:val="21"/>
-        </w:rPr>
-        <w:t>mem.vhdl</w:t>
+        <w:t>instru_mem.vhdl</w:t>
       </w:r>
       <w:proofErr w:type="spellEnd"/>
-      <w:proofErr w:type="gramEnd"/>
       <w:r>
         <w:rPr>
           <w:rFonts w:ascii="Helvetica" w:eastAsia="Times New Roman" w:hAnsi="Helvetica" w:cs="Helvetica"/>
@@ -10944,9 +10167,9 @@
           <w:sz w:val="21"/>
           <w:szCs w:val="21"/>
         </w:rPr>
-        <w:t>alu_input_</w:t>
-      </w:r>
-      <w:proofErr w:type="gramStart"/>
+        <w:t>alu_input_a</w:t>
+      </w:r>
+      <w:proofErr w:type="spellEnd"/>
       <w:r>
         <w:rPr>
           <w:rFonts w:ascii="Helvetica" w:eastAsia="Times New Roman" w:hAnsi="Helvetica" w:cs="Helvetica"/>
@@ -10956,9 +10179,9 @@
           <w:sz w:val="21"/>
           <w:szCs w:val="21"/>
         </w:rPr>
-        <w:t>a</w:t>
-      </w:r>
-      <w:proofErr w:type="spellEnd"/>
+        <w:t xml:space="preserve">,  </w:t>
+      </w:r>
+      <w:proofErr w:type="spellStart"/>
       <w:r>
         <w:rPr>
           <w:rFonts w:ascii="Helvetica" w:eastAsia="Times New Roman" w:hAnsi="Helvetica" w:cs="Helvetica"/>
@@ -10968,9 +10191,9 @@
           <w:sz w:val="21"/>
           <w:szCs w:val="21"/>
         </w:rPr>
-        <w:t xml:space="preserve">,  </w:t>
-      </w:r>
-      <w:proofErr w:type="spellStart"/>
+        <w:t>alu_input_b</w:t>
+      </w:r>
+      <w:proofErr w:type="spellEnd"/>
       <w:r>
         <w:rPr>
           <w:rFonts w:ascii="Helvetica" w:eastAsia="Times New Roman" w:hAnsi="Helvetica" w:cs="Helvetica"/>
@@ -10980,9 +10203,9 @@
           <w:sz w:val="21"/>
           <w:szCs w:val="21"/>
         </w:rPr>
-        <w:t>alu</w:t>
-      </w:r>
-      <w:proofErr w:type="gramEnd"/>
+        <w:t xml:space="preserve">, </w:t>
+      </w:r>
+      <w:proofErr w:type="spellStart"/>
       <w:r>
         <w:rPr>
           <w:rFonts w:ascii="Helvetica" w:eastAsia="Times New Roman" w:hAnsi="Helvetica" w:cs="Helvetica"/>
@@ -10992,7 +10215,7 @@
           <w:sz w:val="21"/>
           <w:szCs w:val="21"/>
         </w:rPr>
-        <w:t>_input_b</w:t>
+        <w:t>alu_result</w:t>
       </w:r>
       <w:proofErr w:type="spellEnd"/>
       <w:r>
@@ -11016,7 +10239,7 @@
           <w:sz w:val="21"/>
           <w:szCs w:val="21"/>
         </w:rPr>
-        <w:t>alu_result</w:t>
+        <w:t>alu_src</w:t>
       </w:r>
       <w:proofErr w:type="spellEnd"/>
       <w:r>
@@ -11040,9 +10263,9 @@
           <w:sz w:val="21"/>
           <w:szCs w:val="21"/>
         </w:rPr>
-        <w:t>alu_</w:t>
-      </w:r>
-      <w:proofErr w:type="gramStart"/>
+        <w:t>reg_write</w:t>
+      </w:r>
+      <w:proofErr w:type="spellEnd"/>
       <w:r>
         <w:rPr>
           <w:rFonts w:ascii="Helvetica" w:eastAsia="Times New Roman" w:hAnsi="Helvetica" w:cs="Helvetica"/>
@@ -11052,9 +10275,9 @@
           <w:sz w:val="21"/>
           <w:szCs w:val="21"/>
         </w:rPr>
-        <w:t>src</w:t>
-      </w:r>
-      <w:proofErr w:type="spellEnd"/>
+        <w:t xml:space="preserve">, </w:t>
+      </w:r>
+      <w:proofErr w:type="spellStart"/>
       <w:r>
         <w:rPr>
           <w:rFonts w:ascii="Helvetica" w:eastAsia="Times New Roman" w:hAnsi="Helvetica" w:cs="Helvetica"/>
@@ -11064,9 +10287,9 @@
           <w:sz w:val="21"/>
           <w:szCs w:val="21"/>
         </w:rPr>
-        <w:t xml:space="preserve">, </w:t>
-      </w:r>
-      <w:proofErr w:type="spellStart"/>
+        <w:t>reg_write_chip</w:t>
+      </w:r>
+      <w:proofErr w:type="spellEnd"/>
       <w:r>
         <w:rPr>
           <w:rFonts w:ascii="Helvetica" w:eastAsia="Times New Roman" w:hAnsi="Helvetica" w:cs="Helvetica"/>
@@ -11076,43 +10299,6 @@
           <w:sz w:val="21"/>
           <w:szCs w:val="21"/>
         </w:rPr>
-        <w:t>reg_write</w:t>
-      </w:r>
-      <w:proofErr w:type="spellEnd"/>
-      <w:proofErr w:type="gramEnd"/>
-      <w:r>
-        <w:rPr>
-          <w:rFonts w:ascii="Helvetica" w:eastAsia="Times New Roman" w:hAnsi="Helvetica" w:cs="Helvetica"/>
-          <w:i/>
-          <w:iCs/>
-          <w:color w:val="333333"/>
-          <w:sz w:val="21"/>
-          <w:szCs w:val="21"/>
-        </w:rPr>
-        <w:t xml:space="preserve">, </w:t>
-      </w:r>
-      <w:proofErr w:type="spellStart"/>
-      <w:r>
-        <w:rPr>
-          <w:rFonts w:ascii="Helvetica" w:eastAsia="Times New Roman" w:hAnsi="Helvetica" w:cs="Helvetica"/>
-          <w:i/>
-          <w:iCs/>
-          <w:color w:val="333333"/>
-          <w:sz w:val="21"/>
-          <w:szCs w:val="21"/>
-        </w:rPr>
-        <w:t>reg_write_chip</w:t>
-      </w:r>
-      <w:proofErr w:type="spellEnd"/>
-      <w:r>
-        <w:rPr>
-          <w:rFonts w:ascii="Helvetica" w:eastAsia="Times New Roman" w:hAnsi="Helvetica" w:cs="Helvetica"/>
-          <w:i/>
-          <w:iCs/>
-          <w:color w:val="333333"/>
-          <w:sz w:val="21"/>
-          <w:szCs w:val="21"/>
-        </w:rPr>
         <w:t>, display_x5</w:t>
       </w:r>
     </w:p>
@@ -11164,23 +10350,9 @@
           <w:szCs w:val="21"/>
           <w:highlight w:val="yellow"/>
         </w:rPr>
-        <w:t>instru_</w:t>
-      </w:r>
-      <w:proofErr w:type="gramStart"/>
-      <w:r>
-        <w:rPr>
-          <w:rFonts w:ascii="Helvetica" w:eastAsia="Times New Roman" w:hAnsi="Helvetica" w:cs="Helvetica"/>
-          <w:b/>
-          <w:bCs/>
-          <w:color w:val="333333"/>
-          <w:sz w:val="21"/>
-          <w:szCs w:val="21"/>
-          <w:highlight w:val="yellow"/>
-        </w:rPr>
-        <w:t>mem.vhdl</w:t>
+        <w:t>instru_mem.vhdl</w:t>
       </w:r>
       <w:proofErr w:type="spellEnd"/>
-      <w:proofErr w:type="gramEnd"/>
       <w:r>
         <w:rPr>
           <w:rFonts w:ascii="Helvetica" w:eastAsia="Times New Roman" w:hAnsi="Helvetica" w:cs="Helvetica"/>
@@ -11289,20 +10461,9 @@
           <w:sz w:val="21"/>
           <w:szCs w:val="21"/>
         </w:rPr>
-        <w:t>instru_</w:t>
-      </w:r>
-      <w:proofErr w:type="gramStart"/>
-      <w:r>
-        <w:rPr>
-          <w:rFonts w:ascii="Helvetica" w:eastAsia="Times New Roman" w:hAnsi="Helvetica" w:cs="Helvetica"/>
-          <w:color w:val="333333"/>
-          <w:sz w:val="21"/>
-          <w:szCs w:val="21"/>
-        </w:rPr>
-        <w:t>mem.vhdl</w:t>
+        <w:t>instru_mem.vhdl</w:t>
       </w:r>
       <w:proofErr w:type="spellEnd"/>
-      <w:proofErr w:type="gramEnd"/>
       <w:r>
         <w:rPr>
           <w:rFonts w:ascii="Helvetica" w:eastAsia="Times New Roman" w:hAnsi="Helvetica" w:cs="Helvetica"/>
@@ -11319,27 +10480,7 @@
           <w:sz w:val="21"/>
           <w:szCs w:val="21"/>
         </w:rPr>
-        <w:t xml:space="preserve">to implement the 9 lines of the main program. This will require creating the 32-bit assembly </w:t>
-      </w:r>
-      <w:proofErr w:type="gramStart"/>
-      <w:r>
-        <w:rPr>
-          <w:rFonts w:ascii="Helvetica" w:eastAsia="Times New Roman" w:hAnsi="Helvetica" w:cs="Helvetica"/>
-          <w:color w:val="333333"/>
-          <w:sz w:val="21"/>
-          <w:szCs w:val="21"/>
-        </w:rPr>
-        <w:t>code word</w:t>
-      </w:r>
-      <w:proofErr w:type="gramEnd"/>
-      <w:r>
-        <w:rPr>
-          <w:rFonts w:ascii="Helvetica" w:eastAsia="Times New Roman" w:hAnsi="Helvetica" w:cs="Helvetica"/>
-          <w:color w:val="333333"/>
-          <w:sz w:val="21"/>
-          <w:szCs w:val="21"/>
-        </w:rPr>
-        <w:t xml:space="preserve"> for each instruction. [</w:t>
+        <w:t>to implement the 9 lines of the main program. This will require creating the 32-bit assembly code word for each instruction. [</w:t>
       </w:r>
       <w:r>
         <w:rPr>
@@ -11369,20 +10510,9 @@
           <w:sz w:val="21"/>
           <w:szCs w:val="21"/>
         </w:rPr>
-        <w:t>data_</w:t>
-      </w:r>
-      <w:proofErr w:type="gramStart"/>
-      <w:r>
-        <w:rPr>
-          <w:rFonts w:ascii="Helvetica" w:eastAsia="Times New Roman" w:hAnsi="Helvetica" w:cs="Helvetica"/>
-          <w:color w:val="333333"/>
-          <w:sz w:val="21"/>
-          <w:szCs w:val="21"/>
-        </w:rPr>
-        <w:t>mem.vhdl</w:t>
+        <w:t>data_mem.vhdl</w:t>
       </w:r>
       <w:proofErr w:type="spellEnd"/>
-      <w:proofErr w:type="gramEnd"/>
       <w:r>
         <w:rPr>
           <w:rFonts w:ascii="Helvetica" w:eastAsia="Times New Roman" w:hAnsi="Helvetica" w:cs="Helvetica"/>
@@ -11505,23 +10635,9 @@
           <w:szCs w:val="21"/>
           <w:highlight w:val="yellow"/>
         </w:rPr>
-        <w:t>instru_</w:t>
-      </w:r>
-      <w:proofErr w:type="gramStart"/>
-      <w:r>
-        <w:rPr>
-          <w:rFonts w:ascii="Helvetica" w:eastAsia="Times New Roman" w:hAnsi="Helvetica" w:cs="Helvetica"/>
-          <w:b/>
-          <w:bCs/>
-          <w:color w:val="333333"/>
-          <w:sz w:val="21"/>
-          <w:szCs w:val="21"/>
-          <w:highlight w:val="yellow"/>
-        </w:rPr>
-        <w:t>mem.vhdl</w:t>
+        <w:t>instru_mem.vhdl</w:t>
       </w:r>
       <w:proofErr w:type="spellEnd"/>
-      <w:proofErr w:type="gramEnd"/>
       <w:r>
         <w:rPr>
           <w:rFonts w:ascii="Helvetica" w:eastAsia="Times New Roman" w:hAnsi="Helvetica" w:cs="Helvetica"/>
@@ -12234,9 +11350,9 @@
           <w:highlight w:val="yellow"/>
           <w:shd w:val="clear" w:color="auto" w:fill="FFFFFF"/>
         </w:rPr>
-        <w:t xml:space="preserve">Turn in your simulation plot </w:t>
-      </w:r>
-      <w:proofErr w:type="gramStart"/>
+        <w:t xml:space="preserve">Turn in your simulation plot in </w:t>
+      </w:r>
+      <w:proofErr w:type="spellStart"/>
       <w:r>
         <w:rPr>
           <w:rFonts w:ascii="Helvetica" w:eastAsia="Times New Roman" w:hAnsi="Helvetica" w:cs="Helvetica"/>
@@ -12248,24 +11364,9 @@
           <w:highlight w:val="yellow"/>
           <w:shd w:val="clear" w:color="auto" w:fill="FFFFFF"/>
         </w:rPr>
-        <w:t xml:space="preserve">in </w:t>
-      </w:r>
-      <w:proofErr w:type="spellStart"/>
-      <w:r>
-        <w:rPr>
-          <w:rFonts w:ascii="Helvetica" w:eastAsia="Times New Roman" w:hAnsi="Helvetica" w:cs="Helvetica"/>
-          <w:b/>
-          <w:bCs/>
-          <w:color w:val="333333"/>
-          <w:sz w:val="21"/>
-          <w:szCs w:val="21"/>
-          <w:highlight w:val="yellow"/>
-          <w:shd w:val="clear" w:color="auto" w:fill="FFFFFF"/>
-        </w:rPr>
         <w:t>gradescope</w:t>
       </w:r>
       <w:proofErr w:type="spellEnd"/>
-      <w:proofErr w:type="gramEnd"/>
       <w:r>
         <w:rPr>
           <w:rFonts w:ascii="Helvetica" w:eastAsia="Times New Roman" w:hAnsi="Helvetica" w:cs="Helvetica"/>
@@ -12927,21 +12028,9 @@
                 <w:szCs w:val="21"/>
                 <w:shd w:val="clear" w:color="auto" w:fill="FFFFFF"/>
               </w:rPr>
-              <w:t>alu_</w:t>
-            </w:r>
-            <w:proofErr w:type="gramStart"/>
-            <w:r>
-              <w:rPr>
-                <w:rFonts w:ascii="Helvetica" w:eastAsia="Times New Roman" w:hAnsi="Helvetica" w:cs="Helvetica"/>
-                <w:color w:val="333333"/>
-                <w:sz w:val="21"/>
-                <w:szCs w:val="21"/>
-                <w:shd w:val="clear" w:color="auto" w:fill="FFFFFF"/>
-              </w:rPr>
-              <w:t>control.vhdl</w:t>
+              <w:t>alu_control.vhdl</w:t>
             </w:r>
             <w:proofErr w:type="spellEnd"/>
-            <w:proofErr w:type="gramEnd"/>
             <w:r>
               <w:rPr>
                 <w:rFonts w:ascii="Helvetica" w:eastAsia="Times New Roman" w:hAnsi="Helvetica" w:cs="Helvetica"/>
@@ -12953,7 +12042,6 @@
               <w:t xml:space="preserve"> and </w:t>
             </w:r>
             <w:proofErr w:type="spellStart"/>
-            <w:proofErr w:type="gramStart"/>
             <w:r>
               <w:rPr>
                 <w:rFonts w:ascii="Helvetica" w:eastAsia="Times New Roman" w:hAnsi="Helvetica" w:cs="Helvetica"/>
@@ -12965,7 +12053,6 @@
               <w:t>alu.vhdl</w:t>
             </w:r>
             <w:proofErr w:type="spellEnd"/>
-            <w:proofErr w:type="gramEnd"/>
           </w:p>
         </w:tc>
         <w:tc>
@@ -13082,21 +12169,9 @@
                 <w:szCs w:val="21"/>
                 <w:shd w:val="clear" w:color="auto" w:fill="FFFFFF"/>
               </w:rPr>
-              <w:t>riscv_</w:t>
-            </w:r>
-            <w:proofErr w:type="gramStart"/>
-            <w:r>
-              <w:rPr>
-                <w:rFonts w:ascii="Helvetica" w:eastAsia="Times New Roman" w:hAnsi="Helvetica" w:cs="Helvetica"/>
-                <w:color w:val="333333"/>
-                <w:sz w:val="21"/>
-                <w:szCs w:val="21"/>
-                <w:shd w:val="clear" w:color="auto" w:fill="FFFFFF"/>
-              </w:rPr>
-              <w:t>multicycle.vhdl</w:t>
+              <w:t>riscv_multicycle.vhdl</w:t>
             </w:r>
             <w:proofErr w:type="spellEnd"/>
-            <w:proofErr w:type="gramEnd"/>
           </w:p>
         </w:tc>
         <w:tc>
@@ -14011,18 +13086,7 @@
           <w:szCs w:val="21"/>
           <w:shd w:val="clear" w:color="auto" w:fill="FFFFFF"/>
         </w:rPr>
-        <w:t xml:space="preserve"> or search engines is “level 2: Use of GenAI for brainstorming or idea generation.” For example, you can prompt GenAI on how to implement basic hardware in VHDL, such as “how to you implement a 32-bit register in VHDL?” “How to you implement a multiplexer using </w:t>
-      </w:r>
-      <w:proofErr w:type="gramStart"/>
-      <w:r>
-        <w:rPr>
-          <w:rFonts w:ascii="Helvetica" w:eastAsia="Times New Roman" w:hAnsi="Helvetica" w:cs="Helvetica"/>
-          <w:color w:val="333333"/>
-          <w:sz w:val="21"/>
-          <w:szCs w:val="21"/>
-          <w:shd w:val="clear" w:color="auto" w:fill="FFFFFF"/>
-        </w:rPr>
-        <w:t xml:space="preserve">the </w:t>
+        <w:t xml:space="preserve"> or search engines is “level 2: Use of GenAI for brainstorming or idea generation.” For example, you can prompt GenAI on how to implement basic hardware in VHDL, such as “how to you implement a 32-bit register in VHDL?” “How to you implement a multiplexer using the </w:t>
       </w:r>
       <w:r>
         <w:rPr>
@@ -14036,38 +13100,15 @@
         </w:rPr>
         <w:t>when</w:t>
       </w:r>
-      <w:proofErr w:type="gramEnd"/>
-      <w:r>
-        <w:rPr>
-          <w:rFonts w:ascii="Helvetica" w:eastAsia="Times New Roman" w:hAnsi="Helvetica" w:cs="Helvetica"/>
-          <w:color w:val="333333"/>
-          <w:sz w:val="21"/>
-          <w:szCs w:val="21"/>
-          <w:shd w:val="clear" w:color="auto" w:fill="FFFFFF"/>
-        </w:rPr>
-        <w:t xml:space="preserve"> statement?</w:t>
-      </w:r>
-      <w:proofErr w:type="gramStart"/>
-      <w:r>
-        <w:rPr>
-          <w:rFonts w:ascii="Helvetica" w:eastAsia="Times New Roman" w:hAnsi="Helvetica" w:cs="Helvetica"/>
-          <w:color w:val="333333"/>
-          <w:sz w:val="21"/>
-          <w:szCs w:val="21"/>
-          <w:shd w:val="clear" w:color="auto" w:fill="FFFFFF"/>
-        </w:rPr>
-        <w:t>”, or</w:t>
-      </w:r>
-      <w:proofErr w:type="gramEnd"/>
-      <w:r>
-        <w:rPr>
-          <w:rFonts w:ascii="Helvetica" w:eastAsia="Times New Roman" w:hAnsi="Helvetica" w:cs="Helvetica"/>
-          <w:color w:val="333333"/>
-          <w:sz w:val="21"/>
-          <w:szCs w:val="21"/>
-          <w:shd w:val="clear" w:color="auto" w:fill="FFFFFF"/>
-        </w:rPr>
-        <w:t xml:space="preserve"> ask basic questions about the RISC-V Stage 1 multicycle architecture, like “why is the ALU controller separate from the Control Unit in RISC-V?”; however, any coding must be your own work.  Do not ask GenAI to produce specific code for this assignment, like “Given this VHDL code for the ALU, add the SUBI function.”</w:t>
+      <w:r>
+        <w:rPr>
+          <w:rFonts w:ascii="Helvetica" w:eastAsia="Times New Roman" w:hAnsi="Helvetica" w:cs="Helvetica"/>
+          <w:color w:val="333333"/>
+          <w:sz w:val="21"/>
+          <w:szCs w:val="21"/>
+          <w:shd w:val="clear" w:color="auto" w:fill="FFFFFF"/>
+        </w:rPr>
+        <w:t xml:space="preserve"> statement?”, or ask basic questions about the RISC-V Stage 1 multicycle architecture, like “why is the ALU controller separate from the Control Unit in RISC-V?”; however, any coding must be your own work.  Do not ask GenAI to produce specific code for this assignment, like “Given this VHDL code for the ALU, add the SUBI function.”</w:t>
       </w:r>
     </w:p>
     <w:p>
@@ -14215,25 +13256,7 @@
           <w:color w:val="333333"/>
           <w:shd w:val="clear" w:color="auto" w:fill="FFFFFF"/>
         </w:rPr>
-        <w:t xml:space="preserve">The only collaboration allowed with classmates is for general questions, such has how to implement VHDL code, like “how to make a process statement to implement a register”, not for specific coding in this assignment, or for general concepts regarding the blocks in the block diagram.  All coding must be your own work.  Do not look at each other’s code.  You are not allowed to have another student look at your code to help with debugging, </w:t>
-      </w:r>
-      <w:proofErr w:type="gramStart"/>
-      <w:r>
-        <w:rPr>
-          <w:rFonts w:ascii="Helvetica" w:eastAsia="Times New Roman" w:hAnsi="Helvetica" w:cs="Helvetica"/>
-          <w:color w:val="333333"/>
-          <w:shd w:val="clear" w:color="auto" w:fill="FFFFFF"/>
-        </w:rPr>
-        <w:t>unless</w:t>
-      </w:r>
-      <w:proofErr w:type="gramEnd"/>
-      <w:r>
-        <w:rPr>
-          <w:rFonts w:ascii="Helvetica" w:eastAsia="Times New Roman" w:hAnsi="Helvetica" w:cs="Helvetica"/>
-          <w:color w:val="333333"/>
-          <w:shd w:val="clear" w:color="auto" w:fill="FFFFFF"/>
-        </w:rPr>
-        <w:t xml:space="preserve"> given specific authorization from your instructor.</w:t>
+        <w:t>The only collaboration allowed with classmates is for general questions, such has how to implement VHDL code, like “how to make a process statement to implement a register”, not for specific coding in this assignment, or for general concepts regarding the blocks in the block diagram.  All coding must be your own work.  Do not look at each other’s code.  You are not allowed to have another student look at your code to help with debugging, unless given specific authorization from your instructor.</w:t>
       </w:r>
       <w:r>
         <w:rPr>

</xml_diff>

<commit_message>
updated immediate generator for BNE
</commit_message>
<xml_diff>
--- a/book/finalproject/Final_Project_Assignment_Stage1.docx
+++ b/book/finalproject/Final_Project_Assignment_Stage1.docx
@@ -378,7 +378,7 @@
         <w:ind w:left="720"/>
         <w:rPr>
           <w:rFonts w:ascii="Helvetica" w:eastAsia="Times New Roman" w:hAnsi="Helvetica" w:cs="Helvetica"/>
-          <w:color w:val="333333"/>
+          <w:color w:val="A6A6A6" w:themeColor="background1" w:themeShade="A6"/>
           <w:sz w:val="21"/>
           <w:szCs w:val="21"/>
           <w:shd w:val="clear" w:color="auto" w:fill="FFFFFF"/>
@@ -389,29 +389,186 @@
           <w:rFonts w:ascii="Helvetica" w:eastAsia="Times New Roman" w:hAnsi="Helvetica" w:cs="Helvetica"/>
           <w:b/>
           <w:bCs/>
-          <w:color w:val="333333"/>
-          <w:sz w:val="21"/>
-          <w:szCs w:val="21"/>
-          <w:shd w:val="clear" w:color="auto" w:fill="FFFFFF"/>
-        </w:rPr>
-        <w:t xml:space="preserve">Stage </w:t>
-      </w:r>
+          <w:color w:val="A6A6A6" w:themeColor="background1" w:themeShade="A6"/>
+          <w:sz w:val="21"/>
+          <w:szCs w:val="21"/>
+          <w:shd w:val="clear" w:color="auto" w:fill="FFFFFF"/>
+        </w:rPr>
+        <w:t>Stage 2</w:t>
+      </w:r>
+      <w:r>
+        <w:rPr>
+          <w:rFonts w:ascii="Helvetica" w:eastAsia="Times New Roman" w:hAnsi="Helvetica" w:cs="Helvetica"/>
+          <w:color w:val="A6A6A6" w:themeColor="background1" w:themeShade="A6"/>
+          <w:sz w:val="21"/>
+          <w:szCs w:val="21"/>
+          <w:shd w:val="clear" w:color="auto" w:fill="FFFFFF"/>
+        </w:rPr>
+        <w:t xml:space="preserve">: 5-cycle </w:t>
+      </w:r>
+      <w:r>
+        <w:rPr>
+          <w:rFonts w:ascii="Helvetica" w:eastAsia="Times New Roman" w:hAnsi="Helvetica" w:cs="Helvetica"/>
+          <w:color w:val="A6A6A6" w:themeColor="background1" w:themeShade="A6"/>
+          <w:sz w:val="21"/>
+          <w:szCs w:val="21"/>
+          <w:shd w:val="clear" w:color="auto" w:fill="FFFFFF"/>
+        </w:rPr>
+        <w:t>Pipelined</w:t>
+      </w:r>
+      <w:r>
+        <w:rPr>
+          <w:rFonts w:ascii="Helvetica" w:eastAsia="Times New Roman" w:hAnsi="Helvetica" w:cs="Helvetica"/>
+          <w:color w:val="A6A6A6" w:themeColor="background1" w:themeShade="A6"/>
+          <w:sz w:val="21"/>
+          <w:szCs w:val="21"/>
+          <w:shd w:val="clear" w:color="auto" w:fill="FFFFFF"/>
+        </w:rPr>
+        <w:t xml:space="preserve"> Architecture: </w:t>
+      </w:r>
+      <w:r>
+        <w:rPr>
+          <w:rFonts w:ascii="Helvetica" w:eastAsia="Times New Roman" w:hAnsi="Helvetica" w:cs="Helvetica"/>
+          <w:color w:val="A6A6A6" w:themeColor="background1" w:themeShade="A6"/>
+          <w:sz w:val="21"/>
+          <w:szCs w:val="21"/>
+          <w:shd w:val="clear" w:color="auto" w:fill="FFFFFF"/>
+        </w:rPr>
+        <w:t>Add</w:t>
+      </w:r>
+      <w:r>
+        <w:rPr>
+          <w:rFonts w:ascii="Helvetica" w:eastAsia="Times New Roman" w:hAnsi="Helvetica" w:cs="Helvetica"/>
+          <w:color w:val="A6A6A6" w:themeColor="background1" w:themeShade="A6"/>
+          <w:sz w:val="21"/>
+          <w:szCs w:val="21"/>
+          <w:shd w:val="clear" w:color="auto" w:fill="FFFFFF"/>
+        </w:rPr>
+        <w:t xml:space="preserve"> intermediate registers (</w:t>
+      </w:r>
+      <w:r>
+        <w:rPr>
+          <w:rFonts w:ascii="Helvetica" w:eastAsia="Times New Roman" w:hAnsi="Helvetica" w:cs="Helvetica"/>
+          <w:color w:val="A6A6A6" w:themeColor="background1" w:themeShade="A6"/>
+          <w:sz w:val="21"/>
+          <w:szCs w:val="21"/>
+          <w:shd w:val="clear" w:color="auto" w:fill="FFFFFF"/>
+        </w:rPr>
+        <w:t>IF_ID, ID_EX, EX_MEM, MEM_WB</w:t>
+      </w:r>
+      <w:r>
+        <w:rPr>
+          <w:rFonts w:ascii="Helvetica" w:eastAsia="Times New Roman" w:hAnsi="Helvetica" w:cs="Helvetica"/>
+          <w:color w:val="A6A6A6" w:themeColor="background1" w:themeShade="A6"/>
+          <w:sz w:val="21"/>
+          <w:szCs w:val="21"/>
+          <w:shd w:val="clear" w:color="auto" w:fill="FFFFFF"/>
+        </w:rPr>
+        <w:t>) to the Stage 1 architecture, so it is now pipelined</w:t>
+      </w:r>
+      <w:r>
+        <w:rPr>
+          <w:rFonts w:ascii="Helvetica" w:eastAsia="Times New Roman" w:hAnsi="Helvetica" w:cs="Helvetica"/>
+          <w:color w:val="A6A6A6" w:themeColor="background1" w:themeShade="A6"/>
+          <w:sz w:val="21"/>
+          <w:szCs w:val="21"/>
+          <w:shd w:val="clear" w:color="auto" w:fill="FFFFFF"/>
+        </w:rPr>
+        <w:t xml:space="preserve">.  However, this stage does NOT have hazard detection and does NOT </w:t>
+      </w:r>
+      <w:proofErr w:type="gramStart"/>
+      <w:r>
+        <w:rPr>
+          <w:rFonts w:ascii="Helvetica" w:eastAsia="Times New Roman" w:hAnsi="Helvetica" w:cs="Helvetica"/>
+          <w:color w:val="A6A6A6" w:themeColor="background1" w:themeShade="A6"/>
+          <w:sz w:val="21"/>
+          <w:szCs w:val="21"/>
+          <w:shd w:val="clear" w:color="auto" w:fill="FFFFFF"/>
+        </w:rPr>
+        <w:t>stall to prevent</w:t>
+      </w:r>
+      <w:proofErr w:type="gramEnd"/>
+      <w:r>
+        <w:rPr>
+          <w:rFonts w:ascii="Helvetica" w:eastAsia="Times New Roman" w:hAnsi="Helvetica" w:cs="Helvetica"/>
+          <w:color w:val="A6A6A6" w:themeColor="background1" w:themeShade="A6"/>
+          <w:sz w:val="21"/>
+          <w:szCs w:val="21"/>
+          <w:shd w:val="clear" w:color="auto" w:fill="FFFFFF"/>
+        </w:rPr>
+        <w:t xml:space="preserve"> hazards.  </w:t>
+      </w:r>
+      <w:r>
+        <w:rPr>
+          <w:rFonts w:ascii="Helvetica" w:eastAsia="Times New Roman" w:hAnsi="Helvetica" w:cs="Helvetica"/>
+          <w:color w:val="A6A6A6" w:themeColor="background1" w:themeShade="A6"/>
+          <w:sz w:val="21"/>
+          <w:szCs w:val="21"/>
+          <w:shd w:val="clear" w:color="auto" w:fill="FFFFFF"/>
+        </w:rPr>
+        <w:t>You</w:t>
+      </w:r>
+      <w:r>
+        <w:rPr>
+          <w:rFonts w:ascii="Helvetica" w:eastAsia="Times New Roman" w:hAnsi="Helvetica" w:cs="Helvetica"/>
+          <w:color w:val="A6A6A6" w:themeColor="background1" w:themeShade="A6"/>
+          <w:sz w:val="21"/>
+          <w:szCs w:val="21"/>
+          <w:shd w:val="clear" w:color="auto" w:fill="FFFFFF"/>
+        </w:rPr>
+        <w:t xml:space="preserve"> will need to add NOPs to the code to ensure proper execution.</w:t>
+      </w:r>
+      <w:r>
+        <w:rPr>
+          <w:rFonts w:ascii="Helvetica" w:eastAsia="Times New Roman" w:hAnsi="Helvetica" w:cs="Helvetica"/>
+          <w:color w:val="A6A6A6" w:themeColor="background1" w:themeShade="A6"/>
+          <w:sz w:val="21"/>
+          <w:szCs w:val="21"/>
+          <w:shd w:val="clear" w:color="auto" w:fill="FFFFFF"/>
+        </w:rPr>
+        <w:t xml:space="preserve"> See Figure C.19</w:t>
+      </w:r>
+    </w:p>
+    <w:p>
+      <w:pPr>
+        <w:spacing w:after="0" w:line="240" w:lineRule="auto"/>
+        <w:rPr>
+          <w:rFonts w:ascii="Helvetica" w:eastAsia="Times New Roman" w:hAnsi="Helvetica" w:cs="Helvetica"/>
+          <w:color w:val="A6A6A6" w:themeColor="background1" w:themeShade="A6"/>
+          <w:sz w:val="21"/>
+          <w:szCs w:val="21"/>
+          <w:shd w:val="clear" w:color="auto" w:fill="FFFFFF"/>
+        </w:rPr>
+      </w:pPr>
+    </w:p>
+    <w:p>
+      <w:pPr>
+        <w:spacing w:after="0" w:line="240" w:lineRule="auto"/>
+        <w:ind w:left="720"/>
+        <w:rPr>
+          <w:rFonts w:ascii="Helvetica" w:eastAsia="Times New Roman" w:hAnsi="Helvetica" w:cs="Helvetica"/>
+          <w:color w:val="A6A6A6" w:themeColor="background1" w:themeShade="A6"/>
+          <w:sz w:val="21"/>
+          <w:szCs w:val="21"/>
+          <w:shd w:val="clear" w:color="auto" w:fill="FFFFFF"/>
+        </w:rPr>
+      </w:pPr>
       <w:r>
         <w:rPr>
           <w:rFonts w:ascii="Helvetica" w:eastAsia="Times New Roman" w:hAnsi="Helvetica" w:cs="Helvetica"/>
           <w:b/>
           <w:bCs/>
-          <w:color w:val="333333"/>
-          <w:sz w:val="21"/>
-          <w:szCs w:val="21"/>
-          <w:shd w:val="clear" w:color="auto" w:fill="FFFFFF"/>
-        </w:rPr>
-        <w:t>2</w:t>
-      </w:r>
-      <w:r>
-        <w:rPr>
-          <w:rFonts w:ascii="Helvetica" w:eastAsia="Times New Roman" w:hAnsi="Helvetica" w:cs="Helvetica"/>
-          <w:color w:val="333333"/>
+          <w:color w:val="A6A6A6" w:themeColor="background1" w:themeShade="A6"/>
+          <w:sz w:val="21"/>
+          <w:szCs w:val="21"/>
+          <w:shd w:val="clear" w:color="auto" w:fill="FFFFFF"/>
+        </w:rPr>
+        <w:t>Stage 3</w:t>
+      </w:r>
+      <w:r>
+        <w:rPr>
+          <w:rFonts w:ascii="Helvetica" w:eastAsia="Times New Roman" w:hAnsi="Helvetica" w:cs="Helvetica"/>
+          <w:color w:val="A6A6A6" w:themeColor="background1" w:themeShade="A6"/>
           <w:sz w:val="21"/>
           <w:szCs w:val="21"/>
           <w:shd w:val="clear" w:color="auto" w:fill="FFFFFF"/>
@@ -421,7 +578,7 @@
       <w:r>
         <w:rPr>
           <w:rFonts w:ascii="Helvetica" w:eastAsia="Times New Roman" w:hAnsi="Helvetica" w:cs="Helvetica"/>
-          <w:color w:val="333333"/>
+          <w:color w:val="A6A6A6" w:themeColor="background1" w:themeShade="A6"/>
           <w:sz w:val="21"/>
           <w:szCs w:val="21"/>
           <w:shd w:val="clear" w:color="auto" w:fill="FFFFFF"/>
@@ -431,102 +588,148 @@
       <w:r>
         <w:rPr>
           <w:rFonts w:ascii="Helvetica" w:eastAsia="Times New Roman" w:hAnsi="Helvetica" w:cs="Helvetica"/>
-          <w:color w:val="333333"/>
-          <w:sz w:val="21"/>
-          <w:szCs w:val="21"/>
-          <w:shd w:val="clear" w:color="auto" w:fill="FFFFFF"/>
-        </w:rPr>
-        <w:t xml:space="preserve"> Architecture: </w:t>
-      </w:r>
-      <w:r>
-        <w:rPr>
-          <w:rFonts w:ascii="Helvetica" w:eastAsia="Times New Roman" w:hAnsi="Helvetica" w:cs="Helvetica"/>
-          <w:color w:val="333333"/>
-          <w:sz w:val="21"/>
-          <w:szCs w:val="21"/>
-          <w:shd w:val="clear" w:color="auto" w:fill="FFFFFF"/>
-        </w:rPr>
-        <w:t>Add</w:t>
-      </w:r>
-      <w:r>
-        <w:rPr>
-          <w:rFonts w:ascii="Helvetica" w:eastAsia="Times New Roman" w:hAnsi="Helvetica" w:cs="Helvetica"/>
-          <w:color w:val="333333"/>
-          <w:sz w:val="21"/>
-          <w:szCs w:val="21"/>
-          <w:shd w:val="clear" w:color="auto" w:fill="FFFFFF"/>
-        </w:rPr>
-        <w:t xml:space="preserve"> intermediate registers (</w:t>
-      </w:r>
-      <w:r>
-        <w:rPr>
-          <w:rFonts w:ascii="Helvetica" w:eastAsia="Times New Roman" w:hAnsi="Helvetica" w:cs="Helvetica"/>
-          <w:color w:val="333333"/>
-          <w:sz w:val="21"/>
-          <w:szCs w:val="21"/>
-          <w:shd w:val="clear" w:color="auto" w:fill="FFFFFF"/>
-        </w:rPr>
-        <w:t>IF_ID, ID_EX,</w:t>
-      </w:r>
-      <w:r>
-        <w:rPr>
-          <w:rFonts w:ascii="Helvetica" w:eastAsia="Times New Roman" w:hAnsi="Helvetica" w:cs="Helvetica"/>
-          <w:color w:val="333333"/>
-          <w:sz w:val="21"/>
-          <w:szCs w:val="21"/>
-          <w:shd w:val="clear" w:color="auto" w:fill="FFFFFF"/>
-        </w:rPr>
-        <w:t xml:space="preserve"> EX_MEM, MEM_WB</w:t>
-      </w:r>
-      <w:r>
-        <w:rPr>
-          <w:rFonts w:ascii="Helvetica" w:eastAsia="Times New Roman" w:hAnsi="Helvetica" w:cs="Helvetica"/>
-          <w:color w:val="333333"/>
-          <w:sz w:val="21"/>
-          <w:szCs w:val="21"/>
-          <w:shd w:val="clear" w:color="auto" w:fill="FFFFFF"/>
-        </w:rPr>
-        <w:t>) to the Stage 1 architecture, so it is now pipelined</w:t>
-      </w:r>
-      <w:r>
-        <w:rPr>
-          <w:rFonts w:ascii="Helvetica" w:eastAsia="Times New Roman" w:hAnsi="Helvetica" w:cs="Helvetica"/>
-          <w:color w:val="333333"/>
-          <w:sz w:val="21"/>
-          <w:szCs w:val="21"/>
-          <w:shd w:val="clear" w:color="auto" w:fill="FFFFFF"/>
-        </w:rPr>
-        <w:t xml:space="preserve">.  However, this stage does NOT have hazard detection and does NOT stall to prevent hazards.  </w:t>
-      </w:r>
-      <w:r>
-        <w:rPr>
-          <w:rFonts w:ascii="Helvetica" w:eastAsia="Times New Roman" w:hAnsi="Helvetica" w:cs="Helvetica"/>
-          <w:color w:val="333333"/>
-          <w:sz w:val="21"/>
-          <w:szCs w:val="21"/>
-          <w:shd w:val="clear" w:color="auto" w:fill="FFFFFF"/>
-        </w:rPr>
-        <w:t>You</w:t>
-      </w:r>
-      <w:r>
-        <w:rPr>
-          <w:rFonts w:ascii="Helvetica" w:eastAsia="Times New Roman" w:hAnsi="Helvetica" w:cs="Helvetica"/>
-          <w:color w:val="333333"/>
-          <w:sz w:val="21"/>
-          <w:szCs w:val="21"/>
-          <w:shd w:val="clear" w:color="auto" w:fill="FFFFFF"/>
-        </w:rPr>
-        <w:t xml:space="preserve"> will need to add NOPs to the code to ensure proper execution.</w:t>
-      </w:r>
-      <w:r>
-        <w:rPr>
-          <w:rFonts w:ascii="Helvetica" w:eastAsia="Times New Roman" w:hAnsi="Helvetica" w:cs="Helvetica"/>
-          <w:color w:val="333333"/>
-          <w:sz w:val="21"/>
-          <w:szCs w:val="21"/>
-          <w:shd w:val="clear" w:color="auto" w:fill="FFFFFF"/>
-        </w:rPr>
-        <w:t xml:space="preserve"> See Figure C.19</w:t>
+          <w:color w:val="A6A6A6" w:themeColor="background1" w:themeShade="A6"/>
+          <w:sz w:val="21"/>
+          <w:szCs w:val="21"/>
+          <w:shd w:val="clear" w:color="auto" w:fill="FFFFFF"/>
+        </w:rPr>
+        <w:t xml:space="preserve"> Architecture</w:t>
+      </w:r>
+      <w:r>
+        <w:rPr>
+          <w:rFonts w:ascii="Helvetica" w:eastAsia="Times New Roman" w:hAnsi="Helvetica" w:cs="Helvetica"/>
+          <w:color w:val="A6A6A6" w:themeColor="background1" w:themeShade="A6"/>
+          <w:sz w:val="21"/>
+          <w:szCs w:val="21"/>
+          <w:shd w:val="clear" w:color="auto" w:fill="FFFFFF"/>
+        </w:rPr>
+        <w:t xml:space="preserve"> with Stall mitigation</w:t>
+      </w:r>
+      <w:r>
+        <w:rPr>
+          <w:rFonts w:ascii="Helvetica" w:eastAsia="Times New Roman" w:hAnsi="Helvetica" w:cs="Helvetica"/>
+          <w:color w:val="A6A6A6" w:themeColor="background1" w:themeShade="A6"/>
+          <w:sz w:val="21"/>
+          <w:szCs w:val="21"/>
+          <w:shd w:val="clear" w:color="auto" w:fill="FFFFFF"/>
+        </w:rPr>
+        <w:t xml:space="preserve">: convert </w:t>
+      </w:r>
+      <w:proofErr w:type="gramStart"/>
+      <w:r>
+        <w:rPr>
+          <w:rFonts w:ascii="Helvetica" w:eastAsia="Times New Roman" w:hAnsi="Helvetica" w:cs="Helvetica"/>
+          <w:color w:val="A6A6A6" w:themeColor="background1" w:themeShade="A6"/>
+          <w:sz w:val="21"/>
+          <w:szCs w:val="21"/>
+          <w:shd w:val="clear" w:color="auto" w:fill="FFFFFF"/>
+        </w:rPr>
+        <w:t xml:space="preserve">the </w:t>
+      </w:r>
+      <w:r>
+        <w:rPr>
+          <w:rFonts w:ascii="Helvetica" w:eastAsia="Times New Roman" w:hAnsi="Helvetica" w:cs="Helvetica"/>
+          <w:color w:val="A6A6A6" w:themeColor="background1" w:themeShade="A6"/>
+          <w:sz w:val="21"/>
+          <w:szCs w:val="21"/>
+          <w:shd w:val="clear" w:color="auto" w:fill="FFFFFF"/>
+        </w:rPr>
+        <w:t>stage</w:t>
+      </w:r>
+      <w:proofErr w:type="gramEnd"/>
+      <w:r>
+        <w:rPr>
+          <w:rFonts w:ascii="Helvetica" w:eastAsia="Times New Roman" w:hAnsi="Helvetica" w:cs="Helvetica"/>
+          <w:color w:val="A6A6A6" w:themeColor="background1" w:themeShade="A6"/>
+          <w:sz w:val="21"/>
+          <w:szCs w:val="21"/>
+          <w:shd w:val="clear" w:color="auto" w:fill="FFFFFF"/>
+        </w:rPr>
+        <w:t xml:space="preserve"> 2 architecture to </w:t>
+      </w:r>
+      <w:proofErr w:type="gramStart"/>
+      <w:r>
+        <w:rPr>
+          <w:rFonts w:ascii="Helvetica" w:eastAsia="Times New Roman" w:hAnsi="Helvetica" w:cs="Helvetica"/>
+          <w:color w:val="A6A6A6" w:themeColor="background1" w:themeShade="A6"/>
+          <w:sz w:val="21"/>
+          <w:szCs w:val="21"/>
+          <w:shd w:val="clear" w:color="auto" w:fill="FFFFFF"/>
+        </w:rPr>
+        <w:t>a pipelined</w:t>
+      </w:r>
+      <w:proofErr w:type="gramEnd"/>
+      <w:r>
+        <w:rPr>
+          <w:rFonts w:ascii="Helvetica" w:eastAsia="Times New Roman" w:hAnsi="Helvetica" w:cs="Helvetica"/>
+          <w:color w:val="A6A6A6" w:themeColor="background1" w:themeShade="A6"/>
+          <w:sz w:val="21"/>
+          <w:szCs w:val="21"/>
+          <w:shd w:val="clear" w:color="auto" w:fill="FFFFFF"/>
+        </w:rPr>
+        <w:t xml:space="preserve"> architecture </w:t>
+      </w:r>
+      <w:r>
+        <w:rPr>
+          <w:rFonts w:ascii="Helvetica" w:eastAsia="Times New Roman" w:hAnsi="Helvetica" w:cs="Helvetica"/>
+          <w:color w:val="A6A6A6" w:themeColor="background1" w:themeShade="A6"/>
+          <w:sz w:val="21"/>
+          <w:szCs w:val="21"/>
+          <w:shd w:val="clear" w:color="auto" w:fill="FFFFFF"/>
+        </w:rPr>
+        <w:t xml:space="preserve">that </w:t>
+      </w:r>
+      <w:r>
+        <w:rPr>
+          <w:rFonts w:ascii="Helvetica" w:eastAsia="Times New Roman" w:hAnsi="Helvetica" w:cs="Helvetica"/>
+          <w:color w:val="A6A6A6" w:themeColor="background1" w:themeShade="A6"/>
+          <w:sz w:val="21"/>
+          <w:szCs w:val="21"/>
+          <w:shd w:val="clear" w:color="auto" w:fill="FFFFFF"/>
+        </w:rPr>
+        <w:t>has hazard detection</w:t>
+      </w:r>
+      <w:r>
+        <w:rPr>
+          <w:rFonts w:ascii="Helvetica" w:eastAsia="Times New Roman" w:hAnsi="Helvetica" w:cs="Helvetica"/>
+          <w:color w:val="A6A6A6" w:themeColor="background1" w:themeShade="A6"/>
+          <w:sz w:val="21"/>
+          <w:szCs w:val="21"/>
+          <w:shd w:val="clear" w:color="auto" w:fill="FFFFFF"/>
+        </w:rPr>
+        <w:t xml:space="preserve"> and stalls appropriately to ensure proper </w:t>
+      </w:r>
+      <w:proofErr w:type="gramStart"/>
+      <w:r>
+        <w:rPr>
+          <w:rFonts w:ascii="Helvetica" w:eastAsia="Times New Roman" w:hAnsi="Helvetica" w:cs="Helvetica"/>
+          <w:color w:val="A6A6A6" w:themeColor="background1" w:themeShade="A6"/>
+          <w:sz w:val="21"/>
+          <w:szCs w:val="21"/>
+          <w:shd w:val="clear" w:color="auto" w:fill="FFFFFF"/>
+        </w:rPr>
+        <w:t>execution</w:t>
+      </w:r>
+      <w:r>
+        <w:rPr>
+          <w:rFonts w:ascii="Helvetica" w:eastAsia="Times New Roman" w:hAnsi="Helvetica" w:cs="Helvetica"/>
+          <w:color w:val="A6A6A6" w:themeColor="background1" w:themeShade="A6"/>
+          <w:sz w:val="21"/>
+          <w:szCs w:val="21"/>
+          <w:shd w:val="clear" w:color="auto" w:fill="FFFFFF"/>
+        </w:rPr>
+        <w:t>, but</w:t>
+      </w:r>
+      <w:proofErr w:type="gramEnd"/>
+      <w:r>
+        <w:rPr>
+          <w:rFonts w:ascii="Helvetica" w:eastAsia="Times New Roman" w:hAnsi="Helvetica" w:cs="Helvetica"/>
+          <w:color w:val="A6A6A6" w:themeColor="background1" w:themeShade="A6"/>
+          <w:sz w:val="21"/>
+          <w:szCs w:val="21"/>
+          <w:shd w:val="clear" w:color="auto" w:fill="FFFFFF"/>
+        </w:rPr>
+        <w:t xml:space="preserve"> does NOT have forwarding.</w:t>
       </w:r>
     </w:p>
     <w:p>
@@ -534,7 +737,7 @@
         <w:spacing w:after="0" w:line="240" w:lineRule="auto"/>
         <w:rPr>
           <w:rFonts w:ascii="Helvetica" w:eastAsia="Times New Roman" w:hAnsi="Helvetica" w:cs="Helvetica"/>
-          <w:color w:val="333333"/>
+          <w:color w:val="A6A6A6" w:themeColor="background1" w:themeShade="A6"/>
           <w:sz w:val="21"/>
           <w:szCs w:val="21"/>
           <w:shd w:val="clear" w:color="auto" w:fill="FFFFFF"/>
@@ -547,7 +750,7 @@
         <w:ind w:left="720"/>
         <w:rPr>
           <w:rFonts w:ascii="Helvetica" w:eastAsia="Times New Roman" w:hAnsi="Helvetica" w:cs="Helvetica"/>
-          <w:color w:val="333333"/>
+          <w:color w:val="A6A6A6" w:themeColor="background1" w:themeShade="A6"/>
           <w:sz w:val="21"/>
           <w:szCs w:val="21"/>
           <w:shd w:val="clear" w:color="auto" w:fill="FFFFFF"/>
@@ -558,29 +761,17 @@
           <w:rFonts w:ascii="Helvetica" w:eastAsia="Times New Roman" w:hAnsi="Helvetica" w:cs="Helvetica"/>
           <w:b/>
           <w:bCs/>
-          <w:color w:val="333333"/>
-          <w:sz w:val="21"/>
-          <w:szCs w:val="21"/>
-          <w:shd w:val="clear" w:color="auto" w:fill="FFFFFF"/>
-        </w:rPr>
-        <w:t xml:space="preserve">Stage </w:t>
-      </w:r>
-      <w:r>
-        <w:rPr>
-          <w:rFonts w:ascii="Helvetica" w:eastAsia="Times New Roman" w:hAnsi="Helvetica" w:cs="Helvetica"/>
-          <w:b/>
-          <w:bCs/>
-          <w:color w:val="333333"/>
-          <w:sz w:val="21"/>
-          <w:szCs w:val="21"/>
-          <w:shd w:val="clear" w:color="auto" w:fill="FFFFFF"/>
-        </w:rPr>
-        <w:t>3</w:t>
-      </w:r>
-      <w:r>
-        <w:rPr>
-          <w:rFonts w:ascii="Helvetica" w:eastAsia="Times New Roman" w:hAnsi="Helvetica" w:cs="Helvetica"/>
-          <w:color w:val="333333"/>
+          <w:color w:val="A6A6A6" w:themeColor="background1" w:themeShade="A6"/>
+          <w:sz w:val="21"/>
+          <w:szCs w:val="21"/>
+          <w:shd w:val="clear" w:color="auto" w:fill="FFFFFF"/>
+        </w:rPr>
+        <w:t>Stage 4</w:t>
+      </w:r>
+      <w:r>
+        <w:rPr>
+          <w:rFonts w:ascii="Helvetica" w:eastAsia="Times New Roman" w:hAnsi="Helvetica" w:cs="Helvetica"/>
+          <w:color w:val="A6A6A6" w:themeColor="background1" w:themeShade="A6"/>
           <w:sz w:val="21"/>
           <w:szCs w:val="21"/>
           <w:shd w:val="clear" w:color="auto" w:fill="FFFFFF"/>
@@ -590,7 +781,7 @@
       <w:r>
         <w:rPr>
           <w:rFonts w:ascii="Helvetica" w:eastAsia="Times New Roman" w:hAnsi="Helvetica" w:cs="Helvetica"/>
-          <w:color w:val="333333"/>
+          <w:color w:val="A6A6A6" w:themeColor="background1" w:themeShade="A6"/>
           <w:sz w:val="21"/>
           <w:szCs w:val="21"/>
           <w:shd w:val="clear" w:color="auto" w:fill="FFFFFF"/>
@@ -600,7 +791,7 @@
       <w:r>
         <w:rPr>
           <w:rFonts w:ascii="Helvetica" w:eastAsia="Times New Roman" w:hAnsi="Helvetica" w:cs="Helvetica"/>
-          <w:color w:val="333333"/>
+          <w:color w:val="A6A6A6" w:themeColor="background1" w:themeShade="A6"/>
           <w:sz w:val="21"/>
           <w:szCs w:val="21"/>
           <w:shd w:val="clear" w:color="auto" w:fill="FFFFFF"/>
@@ -610,77 +801,90 @@
       <w:r>
         <w:rPr>
           <w:rFonts w:ascii="Helvetica" w:eastAsia="Times New Roman" w:hAnsi="Helvetica" w:cs="Helvetica"/>
-          <w:color w:val="333333"/>
-          <w:sz w:val="21"/>
-          <w:szCs w:val="21"/>
-          <w:shd w:val="clear" w:color="auto" w:fill="FFFFFF"/>
-        </w:rPr>
-        <w:t xml:space="preserve"> with Stall mitigation</w:t>
-      </w:r>
-      <w:r>
-        <w:rPr>
-          <w:rFonts w:ascii="Helvetica" w:eastAsia="Times New Roman" w:hAnsi="Helvetica" w:cs="Helvetica"/>
-          <w:color w:val="333333"/>
-          <w:sz w:val="21"/>
-          <w:szCs w:val="21"/>
-          <w:shd w:val="clear" w:color="auto" w:fill="FFFFFF"/>
-        </w:rPr>
-        <w:t xml:space="preserve">: convert the </w:t>
-      </w:r>
-      <w:r>
-        <w:rPr>
-          <w:rFonts w:ascii="Helvetica" w:eastAsia="Times New Roman" w:hAnsi="Helvetica" w:cs="Helvetica"/>
-          <w:color w:val="333333"/>
-          <w:sz w:val="21"/>
-          <w:szCs w:val="21"/>
-          <w:shd w:val="clear" w:color="auto" w:fill="FFFFFF"/>
-        </w:rPr>
-        <w:t xml:space="preserve">stage 2 architecture to a pipelined architecture </w:t>
-      </w:r>
-      <w:r>
-        <w:rPr>
-          <w:rFonts w:ascii="Helvetica" w:eastAsia="Times New Roman" w:hAnsi="Helvetica" w:cs="Helvetica"/>
-          <w:color w:val="333333"/>
-          <w:sz w:val="21"/>
-          <w:szCs w:val="21"/>
-          <w:shd w:val="clear" w:color="auto" w:fill="FFFFFF"/>
-        </w:rPr>
-        <w:t xml:space="preserve">that </w:t>
-      </w:r>
-      <w:r>
-        <w:rPr>
-          <w:rFonts w:ascii="Helvetica" w:eastAsia="Times New Roman" w:hAnsi="Helvetica" w:cs="Helvetica"/>
-          <w:color w:val="333333"/>
-          <w:sz w:val="21"/>
-          <w:szCs w:val="21"/>
-          <w:shd w:val="clear" w:color="auto" w:fill="FFFFFF"/>
-        </w:rPr>
-        <w:t>has hazard detection</w:t>
-      </w:r>
-      <w:r>
-        <w:rPr>
-          <w:rFonts w:ascii="Helvetica" w:eastAsia="Times New Roman" w:hAnsi="Helvetica" w:cs="Helvetica"/>
-          <w:color w:val="333333"/>
-          <w:sz w:val="21"/>
-          <w:szCs w:val="21"/>
-          <w:shd w:val="clear" w:color="auto" w:fill="FFFFFF"/>
-        </w:rPr>
-        <w:t xml:space="preserve"> and stalls appropriately to ensure proper execution</w:t>
-      </w:r>
-      <w:r>
-        <w:rPr>
-          <w:rFonts w:ascii="Helvetica" w:eastAsia="Times New Roman" w:hAnsi="Helvetica" w:cs="Helvetica"/>
-          <w:color w:val="333333"/>
-          <w:sz w:val="21"/>
-          <w:szCs w:val="21"/>
-          <w:shd w:val="clear" w:color="auto" w:fill="FFFFFF"/>
-        </w:rPr>
-        <w:t>, but does NOT have forwarding.</w:t>
+          <w:color w:val="A6A6A6" w:themeColor="background1" w:themeShade="A6"/>
+          <w:sz w:val="21"/>
+          <w:szCs w:val="21"/>
+          <w:shd w:val="clear" w:color="auto" w:fill="FFFFFF"/>
+        </w:rPr>
+        <w:t xml:space="preserve"> with Forwarding</w:t>
+      </w:r>
+      <w:r>
+        <w:rPr>
+          <w:rFonts w:ascii="Helvetica" w:eastAsia="Times New Roman" w:hAnsi="Helvetica" w:cs="Helvetica"/>
+          <w:color w:val="A6A6A6" w:themeColor="background1" w:themeShade="A6"/>
+          <w:sz w:val="21"/>
+          <w:szCs w:val="21"/>
+          <w:shd w:val="clear" w:color="auto" w:fill="FFFFFF"/>
+        </w:rPr>
+        <w:t xml:space="preserve">: </w:t>
+      </w:r>
+      <w:r>
+        <w:rPr>
+          <w:rFonts w:ascii="Helvetica" w:eastAsia="Times New Roman" w:hAnsi="Helvetica" w:cs="Helvetica"/>
+          <w:color w:val="A6A6A6" w:themeColor="background1" w:themeShade="A6"/>
+          <w:sz w:val="21"/>
+          <w:szCs w:val="21"/>
+          <w:shd w:val="clear" w:color="auto" w:fill="FFFFFF"/>
+        </w:rPr>
+        <w:t>convert the stage 3 architecture to a pipelined architecture that has hazard detection and stalls appropriately</w:t>
+      </w:r>
+      <w:r>
+        <w:rPr>
+          <w:rFonts w:ascii="Helvetica" w:eastAsia="Times New Roman" w:hAnsi="Helvetica" w:cs="Helvetica"/>
+          <w:color w:val="A6A6A6" w:themeColor="background1" w:themeShade="A6"/>
+          <w:sz w:val="21"/>
+          <w:szCs w:val="21"/>
+          <w:shd w:val="clear" w:color="auto" w:fill="FFFFFF"/>
+        </w:rPr>
+        <w:t xml:space="preserve">, plus </w:t>
+      </w:r>
+      <w:r>
+        <w:rPr>
+          <w:rFonts w:ascii="Helvetica" w:eastAsia="Times New Roman" w:hAnsi="Helvetica" w:cs="Helvetica"/>
+          <w:color w:val="A6A6A6" w:themeColor="background1" w:themeShade="A6"/>
+          <w:sz w:val="21"/>
+          <w:szCs w:val="21"/>
+          <w:shd w:val="clear" w:color="auto" w:fill="FFFFFF"/>
+        </w:rPr>
+        <w:t>has forwarding</w:t>
+      </w:r>
+      <w:r>
+        <w:rPr>
+          <w:rFonts w:ascii="Helvetica" w:eastAsia="Times New Roman" w:hAnsi="Helvetica" w:cs="Helvetica"/>
+          <w:color w:val="A6A6A6" w:themeColor="background1" w:themeShade="A6"/>
+          <w:sz w:val="21"/>
+          <w:szCs w:val="21"/>
+          <w:shd w:val="clear" w:color="auto" w:fill="FFFFFF"/>
+        </w:rPr>
+        <w:t xml:space="preserve"> and branch decision moved to the ID stage, </w:t>
+      </w:r>
+      <w:proofErr w:type="gramStart"/>
+      <w:r>
+        <w:rPr>
+          <w:rFonts w:ascii="Helvetica" w:eastAsia="Times New Roman" w:hAnsi="Helvetica" w:cs="Helvetica"/>
+          <w:color w:val="A6A6A6" w:themeColor="background1" w:themeShade="A6"/>
+          <w:sz w:val="21"/>
+          <w:szCs w:val="21"/>
+          <w:shd w:val="clear" w:color="auto" w:fill="FFFFFF"/>
+        </w:rPr>
+        <w:t>similar to</w:t>
+      </w:r>
+      <w:proofErr w:type="gramEnd"/>
+      <w:r>
+        <w:rPr>
+          <w:rFonts w:ascii="Helvetica" w:eastAsia="Times New Roman" w:hAnsi="Helvetica" w:cs="Helvetica"/>
+          <w:color w:val="A6A6A6" w:themeColor="background1" w:themeShade="A6"/>
+          <w:sz w:val="21"/>
+          <w:szCs w:val="21"/>
+          <w:shd w:val="clear" w:color="auto" w:fill="FFFFFF"/>
+        </w:rPr>
+        <w:t xml:space="preserve"> Figure C.25.</w:t>
       </w:r>
     </w:p>
     <w:p>
       <w:pPr>
         <w:spacing w:after="0" w:line="240" w:lineRule="auto"/>
+        <w:ind w:firstLine="720"/>
         <w:rPr>
           <w:rFonts w:ascii="Helvetica" w:eastAsia="Times New Roman" w:hAnsi="Helvetica" w:cs="Helvetica"/>
           <w:color w:val="333333"/>
@@ -693,146 +897,6 @@
     <w:p>
       <w:pPr>
         <w:spacing w:after="0" w:line="240" w:lineRule="auto"/>
-        <w:ind w:left="720"/>
-        <w:rPr>
-          <w:rFonts w:ascii="Helvetica" w:eastAsia="Times New Roman" w:hAnsi="Helvetica" w:cs="Helvetica"/>
-          <w:color w:val="333333"/>
-          <w:sz w:val="21"/>
-          <w:szCs w:val="21"/>
-          <w:shd w:val="clear" w:color="auto" w:fill="FFFFFF"/>
-        </w:rPr>
-      </w:pPr>
-      <w:r>
-        <w:rPr>
-          <w:rFonts w:ascii="Helvetica" w:eastAsia="Times New Roman" w:hAnsi="Helvetica" w:cs="Helvetica"/>
-          <w:b/>
-          <w:bCs/>
-          <w:color w:val="333333"/>
-          <w:sz w:val="21"/>
-          <w:szCs w:val="21"/>
-          <w:shd w:val="clear" w:color="auto" w:fill="FFFFFF"/>
-        </w:rPr>
-        <w:t xml:space="preserve">Stage </w:t>
-      </w:r>
-      <w:r>
-        <w:rPr>
-          <w:rFonts w:ascii="Helvetica" w:eastAsia="Times New Roman" w:hAnsi="Helvetica" w:cs="Helvetica"/>
-          <w:b/>
-          <w:bCs/>
-          <w:color w:val="333333"/>
-          <w:sz w:val="21"/>
-          <w:szCs w:val="21"/>
-          <w:shd w:val="clear" w:color="auto" w:fill="FFFFFF"/>
-        </w:rPr>
-        <w:t>4</w:t>
-      </w:r>
-      <w:r>
-        <w:rPr>
-          <w:rFonts w:ascii="Helvetica" w:eastAsia="Times New Roman" w:hAnsi="Helvetica" w:cs="Helvetica"/>
-          <w:color w:val="333333"/>
-          <w:sz w:val="21"/>
-          <w:szCs w:val="21"/>
-          <w:shd w:val="clear" w:color="auto" w:fill="FFFFFF"/>
-        </w:rPr>
-        <w:t xml:space="preserve">: 5-cycle </w:t>
-      </w:r>
-      <w:r>
-        <w:rPr>
-          <w:rFonts w:ascii="Helvetica" w:eastAsia="Times New Roman" w:hAnsi="Helvetica" w:cs="Helvetica"/>
-          <w:color w:val="333333"/>
-          <w:sz w:val="21"/>
-          <w:szCs w:val="21"/>
-          <w:shd w:val="clear" w:color="auto" w:fill="FFFFFF"/>
-        </w:rPr>
-        <w:t>Pipelined</w:t>
-      </w:r>
-      <w:r>
-        <w:rPr>
-          <w:rFonts w:ascii="Helvetica" w:eastAsia="Times New Roman" w:hAnsi="Helvetica" w:cs="Helvetica"/>
-          <w:color w:val="333333"/>
-          <w:sz w:val="21"/>
-          <w:szCs w:val="21"/>
-          <w:shd w:val="clear" w:color="auto" w:fill="FFFFFF"/>
-        </w:rPr>
-        <w:t xml:space="preserve"> Architecture</w:t>
-      </w:r>
-      <w:r>
-        <w:rPr>
-          <w:rFonts w:ascii="Helvetica" w:eastAsia="Times New Roman" w:hAnsi="Helvetica" w:cs="Helvetica"/>
-          <w:color w:val="333333"/>
-          <w:sz w:val="21"/>
-          <w:szCs w:val="21"/>
-          <w:shd w:val="clear" w:color="auto" w:fill="FFFFFF"/>
-        </w:rPr>
-        <w:t xml:space="preserve"> with Forwarding</w:t>
-      </w:r>
-      <w:r>
-        <w:rPr>
-          <w:rFonts w:ascii="Helvetica" w:eastAsia="Times New Roman" w:hAnsi="Helvetica" w:cs="Helvetica"/>
-          <w:color w:val="333333"/>
-          <w:sz w:val="21"/>
-          <w:szCs w:val="21"/>
-          <w:shd w:val="clear" w:color="auto" w:fill="FFFFFF"/>
-        </w:rPr>
-        <w:t xml:space="preserve">: </w:t>
-      </w:r>
-      <w:r>
-        <w:rPr>
-          <w:rFonts w:ascii="Helvetica" w:eastAsia="Times New Roman" w:hAnsi="Helvetica" w:cs="Helvetica"/>
-          <w:color w:val="333333"/>
-          <w:sz w:val="21"/>
-          <w:szCs w:val="21"/>
-          <w:shd w:val="clear" w:color="auto" w:fill="FFFFFF"/>
-        </w:rPr>
-        <w:t>convert the stage 3 architecture to a pipelined architecture that has hazard detection and stalls appropriately</w:t>
-      </w:r>
-      <w:r>
-        <w:rPr>
-          <w:rFonts w:ascii="Helvetica" w:eastAsia="Times New Roman" w:hAnsi="Helvetica" w:cs="Helvetica"/>
-          <w:color w:val="333333"/>
-          <w:sz w:val="21"/>
-          <w:szCs w:val="21"/>
-          <w:shd w:val="clear" w:color="auto" w:fill="FFFFFF"/>
-        </w:rPr>
-        <w:t xml:space="preserve">, plus </w:t>
-      </w:r>
-      <w:r>
-        <w:rPr>
-          <w:rFonts w:ascii="Helvetica" w:eastAsia="Times New Roman" w:hAnsi="Helvetica" w:cs="Helvetica"/>
-          <w:color w:val="333333"/>
-          <w:sz w:val="21"/>
-          <w:szCs w:val="21"/>
-          <w:shd w:val="clear" w:color="auto" w:fill="FFFFFF"/>
-        </w:rPr>
-        <w:t>has forwarding</w:t>
-      </w:r>
-      <w:r>
-        <w:rPr>
-          <w:rFonts w:ascii="Helvetica" w:eastAsia="Times New Roman" w:hAnsi="Helvetica" w:cs="Helvetica"/>
-          <w:color w:val="333333"/>
-          <w:sz w:val="21"/>
-          <w:szCs w:val="21"/>
-          <w:shd w:val="clear" w:color="auto" w:fill="FFFFFF"/>
-        </w:rPr>
-        <w:t xml:space="preserve"> and branch decision moved to the ID stage, similar to Figure C.25.</w:t>
-      </w:r>
-    </w:p>
-    <w:p>
-      <w:pPr>
-        <w:spacing w:after="0" w:line="240" w:lineRule="auto"/>
-        <w:ind w:firstLine="720"/>
-        <w:rPr>
-          <w:rFonts w:ascii="Helvetica" w:eastAsia="Times New Roman" w:hAnsi="Helvetica" w:cs="Helvetica"/>
-          <w:color w:val="333333"/>
-          <w:sz w:val="21"/>
-          <w:szCs w:val="21"/>
-          <w:shd w:val="clear" w:color="auto" w:fill="FFFFFF"/>
-        </w:rPr>
-      </w:pPr>
-    </w:p>
-    <w:p>
-      <w:pPr>
-        <w:spacing w:after="0" w:line="240" w:lineRule="auto"/>
         <w:rPr>
           <w:rFonts w:ascii="Helvetica" w:eastAsia="Times New Roman" w:hAnsi="Helvetica" w:cs="Helvetica"/>
           <w:color w:val="333333"/>
@@ -953,7 +1017,29 @@
           <w:szCs w:val="21"/>
           <w:shd w:val="clear" w:color="auto" w:fill="FFFFFF"/>
         </w:rPr>
-        <w:t>, which is similar to LA,</w:t>
+        <w:t xml:space="preserve">, which is </w:t>
+      </w:r>
+      <w:proofErr w:type="gramStart"/>
+      <w:r>
+        <w:rPr>
+          <w:rFonts w:ascii="Helvetica" w:eastAsia="Times New Roman" w:hAnsi="Helvetica" w:cs="Helvetica"/>
+          <w:color w:val="333333"/>
+          <w:sz w:val="21"/>
+          <w:szCs w:val="21"/>
+          <w:shd w:val="clear" w:color="auto" w:fill="FFFFFF"/>
+        </w:rPr>
+        <w:t>similar to</w:t>
+      </w:r>
+      <w:proofErr w:type="gramEnd"/>
+      <w:r>
+        <w:rPr>
+          <w:rFonts w:ascii="Helvetica" w:eastAsia="Times New Roman" w:hAnsi="Helvetica" w:cs="Helvetica"/>
+          <w:color w:val="333333"/>
+          <w:sz w:val="21"/>
+          <w:szCs w:val="21"/>
+          <w:shd w:val="clear" w:color="auto" w:fill="FFFFFF"/>
+        </w:rPr>
+        <w:t xml:space="preserve"> LA,</w:t>
       </w:r>
       <w:r>
         <w:rPr>
@@ -1272,326 +1358,362 @@
           <w:sz w:val="20"/>
           <w:szCs w:val="20"/>
         </w:rPr>
-        <w:t>x7, 0(x6)       # x7 = initial value</w:t>
-      </w:r>
-    </w:p>
-    <w:p>
-      <w:pPr>
-        <w:spacing w:after="0" w:line="240" w:lineRule="auto"/>
-        <w:ind w:left="720"/>
+        <w:t>x7, 0(</w:t>
+      </w:r>
+      <w:proofErr w:type="gramStart"/>
+      <w:r>
         <w:rPr>
           <w:rFonts w:ascii="Courier New" w:eastAsia="Times New Roman" w:hAnsi="Courier New" w:cs="Courier New"/>
           <w:sz w:val="20"/>
           <w:szCs w:val="20"/>
         </w:rPr>
-      </w:pPr>
+        <w:t>x6)       #</w:t>
+      </w:r>
+      <w:proofErr w:type="gramEnd"/>
       <w:r>
         <w:rPr>
           <w:rFonts w:ascii="Courier New" w:eastAsia="Times New Roman" w:hAnsi="Courier New" w:cs="Courier New"/>
           <w:sz w:val="20"/>
           <w:szCs w:val="20"/>
         </w:rPr>
-        <w:t xml:space="preserve">loop:   </w:t>
-      </w:r>
-      <w:proofErr w:type="spellStart"/>
-      <w:r>
+        <w:t xml:space="preserve"> x7 = initial value</w:t>
+      </w:r>
+    </w:p>
+    <w:p>
+      <w:pPr>
+        <w:spacing w:after="0" w:line="240" w:lineRule="auto"/>
+        <w:ind w:left="720"/>
         <w:rPr>
           <w:rFonts w:ascii="Courier New" w:eastAsia="Times New Roman" w:hAnsi="Courier New" w:cs="Courier New"/>
           <w:sz w:val="20"/>
           <w:szCs w:val="20"/>
         </w:rPr>
-        <w:t>addi</w:t>
-      </w:r>
-      <w:proofErr w:type="spellEnd"/>
+      </w:pPr>
       <w:r>
         <w:rPr>
           <w:rFonts w:ascii="Courier New" w:eastAsia="Times New Roman" w:hAnsi="Courier New" w:cs="Courier New"/>
           <w:sz w:val="20"/>
           <w:szCs w:val="20"/>
         </w:rPr>
-        <w:t xml:space="preserve">    </w:t>
-      </w:r>
+        <w:t xml:space="preserve">loop:   </w:t>
+      </w:r>
+      <w:proofErr w:type="spellStart"/>
       <w:r>
         <w:rPr>
           <w:rFonts w:ascii="Courier New" w:eastAsia="Times New Roman" w:hAnsi="Courier New" w:cs="Courier New"/>
           <w:sz w:val="20"/>
           <w:szCs w:val="20"/>
         </w:rPr>
-        <w:t xml:space="preserve">  </w:t>
-      </w:r>
+        <w:t>addi</w:t>
+      </w:r>
+      <w:proofErr w:type="spellEnd"/>
       <w:r>
         <w:rPr>
           <w:rFonts w:ascii="Courier New" w:eastAsia="Times New Roman" w:hAnsi="Courier New" w:cs="Courier New"/>
           <w:sz w:val="20"/>
           <w:szCs w:val="20"/>
         </w:rPr>
-        <w:t xml:space="preserve">x6, x6, 4       </w:t>
-      </w:r>
-    </w:p>
-    <w:p>
-      <w:pPr>
-        <w:spacing w:after="0" w:line="240" w:lineRule="auto"/>
-        <w:ind w:left="720"/>
+        <w:t xml:space="preserve">    </w:t>
+      </w:r>
+      <w:r>
         <w:rPr>
           <w:rFonts w:ascii="Courier New" w:eastAsia="Times New Roman" w:hAnsi="Courier New" w:cs="Courier New"/>
           <w:sz w:val="20"/>
           <w:szCs w:val="20"/>
         </w:rPr>
-      </w:pPr>
+        <w:t xml:space="preserve">  </w:t>
+      </w:r>
       <w:r>
         <w:rPr>
           <w:rFonts w:ascii="Courier New" w:eastAsia="Times New Roman" w:hAnsi="Courier New" w:cs="Courier New"/>
           <w:sz w:val="20"/>
           <w:szCs w:val="20"/>
         </w:rPr>
-        <w:t xml:space="preserve">        </w:t>
-      </w:r>
-      <w:proofErr w:type="spellStart"/>
-      <w:r>
+        <w:t xml:space="preserve">x6, x6, 4       </w:t>
+      </w:r>
+    </w:p>
+    <w:p>
+      <w:pPr>
+        <w:spacing w:after="0" w:line="240" w:lineRule="auto"/>
+        <w:ind w:left="720"/>
         <w:rPr>
           <w:rFonts w:ascii="Courier New" w:eastAsia="Times New Roman" w:hAnsi="Courier New" w:cs="Courier New"/>
           <w:sz w:val="20"/>
           <w:szCs w:val="20"/>
         </w:rPr>
-        <w:t>lw</w:t>
-      </w:r>
-      <w:proofErr w:type="spellEnd"/>
+      </w:pPr>
       <w:r>
         <w:rPr>
           <w:rFonts w:ascii="Courier New" w:eastAsia="Times New Roman" w:hAnsi="Courier New" w:cs="Courier New"/>
           <w:sz w:val="20"/>
           <w:szCs w:val="20"/>
         </w:rPr>
-        <w:t xml:space="preserve">      </w:t>
-      </w:r>
+        <w:t xml:space="preserve">        </w:t>
+      </w:r>
+      <w:proofErr w:type="spellStart"/>
       <w:r>
         <w:rPr>
           <w:rFonts w:ascii="Courier New" w:eastAsia="Times New Roman" w:hAnsi="Courier New" w:cs="Courier New"/>
           <w:sz w:val="20"/>
           <w:szCs w:val="20"/>
         </w:rPr>
-        <w:t xml:space="preserve">  </w:t>
-      </w:r>
+        <w:t>lw</w:t>
+      </w:r>
+      <w:proofErr w:type="spellEnd"/>
       <w:r>
         <w:rPr>
           <w:rFonts w:ascii="Courier New" w:eastAsia="Times New Roman" w:hAnsi="Courier New" w:cs="Courier New"/>
           <w:sz w:val="20"/>
           <w:szCs w:val="20"/>
         </w:rPr>
-        <w:t xml:space="preserve">x10, 0(x6)      </w:t>
-      </w:r>
-    </w:p>
-    <w:p>
-      <w:pPr>
-        <w:spacing w:after="0" w:line="240" w:lineRule="auto"/>
-        <w:ind w:left="720"/>
+        <w:t xml:space="preserve">      </w:t>
+      </w:r>
+      <w:r>
         <w:rPr>
           <w:rFonts w:ascii="Courier New" w:eastAsia="Times New Roman" w:hAnsi="Courier New" w:cs="Courier New"/>
           <w:sz w:val="20"/>
           <w:szCs w:val="20"/>
         </w:rPr>
-      </w:pPr>
+        <w:t xml:space="preserve">  </w:t>
+      </w:r>
       <w:r>
         <w:rPr>
           <w:rFonts w:ascii="Courier New" w:eastAsia="Times New Roman" w:hAnsi="Courier New" w:cs="Courier New"/>
           <w:sz w:val="20"/>
           <w:szCs w:val="20"/>
         </w:rPr>
-        <w:t xml:space="preserve">        add     </w:t>
-      </w:r>
-      <w:r>
+        <w:t xml:space="preserve">x10, 0(x6)      </w:t>
+      </w:r>
+    </w:p>
+    <w:p>
+      <w:pPr>
+        <w:spacing w:after="0" w:line="240" w:lineRule="auto"/>
+        <w:ind w:left="720"/>
         <w:rPr>
           <w:rFonts w:ascii="Courier New" w:eastAsia="Times New Roman" w:hAnsi="Courier New" w:cs="Courier New"/>
           <w:sz w:val="20"/>
           <w:szCs w:val="20"/>
         </w:rPr>
-        <w:t xml:space="preserve">  </w:t>
-      </w:r>
+      </w:pPr>
       <w:r>
         <w:rPr>
           <w:rFonts w:ascii="Courier New" w:eastAsia="Times New Roman" w:hAnsi="Courier New" w:cs="Courier New"/>
           <w:sz w:val="20"/>
           <w:szCs w:val="20"/>
         </w:rPr>
-        <w:t xml:space="preserve">x7, x10, x7     </w:t>
-      </w:r>
-    </w:p>
-    <w:p>
-      <w:pPr>
-        <w:spacing w:after="0" w:line="240" w:lineRule="auto"/>
-        <w:ind w:left="720"/>
+        <w:t xml:space="preserve">        add     </w:t>
+      </w:r>
+      <w:r>
         <w:rPr>
           <w:rFonts w:ascii="Courier New" w:eastAsia="Times New Roman" w:hAnsi="Courier New" w:cs="Courier New"/>
           <w:sz w:val="20"/>
           <w:szCs w:val="20"/>
         </w:rPr>
-      </w:pPr>
+        <w:t xml:space="preserve">  </w:t>
+      </w:r>
       <w:r>
         <w:rPr>
           <w:rFonts w:ascii="Courier New" w:eastAsia="Times New Roman" w:hAnsi="Courier New" w:cs="Courier New"/>
           <w:sz w:val="20"/>
           <w:szCs w:val="20"/>
         </w:rPr>
-        <w:t xml:space="preserve">        </w:t>
-      </w:r>
-      <w:proofErr w:type="spellStart"/>
-      <w:r>
+        <w:t xml:space="preserve">x7, x10, x7     </w:t>
+      </w:r>
+    </w:p>
+    <w:p>
+      <w:pPr>
+        <w:spacing w:after="0" w:line="240" w:lineRule="auto"/>
+        <w:ind w:left="720"/>
         <w:rPr>
           <w:rFonts w:ascii="Courier New" w:eastAsia="Times New Roman" w:hAnsi="Courier New" w:cs="Courier New"/>
           <w:sz w:val="20"/>
           <w:szCs w:val="20"/>
         </w:rPr>
-        <w:t>subi</w:t>
-      </w:r>
-      <w:proofErr w:type="spellEnd"/>
+      </w:pPr>
       <w:r>
         <w:rPr>
           <w:rFonts w:ascii="Courier New" w:eastAsia="Times New Roman" w:hAnsi="Courier New" w:cs="Courier New"/>
           <w:sz w:val="20"/>
           <w:szCs w:val="20"/>
         </w:rPr>
-        <w:t xml:space="preserve">    </w:t>
-      </w:r>
+        <w:t xml:space="preserve">        </w:t>
+      </w:r>
+      <w:proofErr w:type="spellStart"/>
       <w:r>
         <w:rPr>
           <w:rFonts w:ascii="Courier New" w:eastAsia="Times New Roman" w:hAnsi="Courier New" w:cs="Courier New"/>
           <w:sz w:val="20"/>
           <w:szCs w:val="20"/>
         </w:rPr>
-        <w:t xml:space="preserve">  </w:t>
-      </w:r>
+        <w:t>subi</w:t>
+      </w:r>
+      <w:proofErr w:type="spellEnd"/>
       <w:r>
         <w:rPr>
           <w:rFonts w:ascii="Courier New" w:eastAsia="Times New Roman" w:hAnsi="Courier New" w:cs="Courier New"/>
           <w:sz w:val="20"/>
           <w:szCs w:val="20"/>
         </w:rPr>
-        <w:t xml:space="preserve">x5, x5, 1       </w:t>
-      </w:r>
-    </w:p>
-    <w:p>
-      <w:pPr>
-        <w:spacing w:after="0" w:line="240" w:lineRule="auto"/>
-        <w:ind w:left="720"/>
+        <w:t xml:space="preserve">    </w:t>
+      </w:r>
+      <w:r>
         <w:rPr>
           <w:rFonts w:ascii="Courier New" w:eastAsia="Times New Roman" w:hAnsi="Courier New" w:cs="Courier New"/>
           <w:sz w:val="20"/>
           <w:szCs w:val="20"/>
         </w:rPr>
-      </w:pPr>
+        <w:t xml:space="preserve">  </w:t>
+      </w:r>
       <w:r>
         <w:rPr>
           <w:rFonts w:ascii="Courier New" w:eastAsia="Times New Roman" w:hAnsi="Courier New" w:cs="Courier New"/>
           <w:sz w:val="20"/>
           <w:szCs w:val="20"/>
         </w:rPr>
-        <w:t xml:space="preserve">        </w:t>
-      </w:r>
-      <w:proofErr w:type="spellStart"/>
-      <w:r>
+        <w:t xml:space="preserve">x5, x5, 1       </w:t>
+      </w:r>
+    </w:p>
+    <w:p>
+      <w:pPr>
+        <w:spacing w:after="0" w:line="240" w:lineRule="auto"/>
+        <w:ind w:left="720"/>
         <w:rPr>
           <w:rFonts w:ascii="Courier New" w:eastAsia="Times New Roman" w:hAnsi="Courier New" w:cs="Courier New"/>
           <w:sz w:val="20"/>
           <w:szCs w:val="20"/>
         </w:rPr>
-        <w:t>bne</w:t>
-      </w:r>
-      <w:proofErr w:type="spellEnd"/>
+      </w:pPr>
       <w:r>
         <w:rPr>
           <w:rFonts w:ascii="Courier New" w:eastAsia="Times New Roman" w:hAnsi="Courier New" w:cs="Courier New"/>
           <w:sz w:val="20"/>
           <w:szCs w:val="20"/>
         </w:rPr>
-        <w:t xml:space="preserve">     </w:t>
-      </w:r>
+        <w:t xml:space="preserve">        </w:t>
+      </w:r>
+      <w:proofErr w:type="spellStart"/>
       <w:r>
         <w:rPr>
           <w:rFonts w:ascii="Courier New" w:eastAsia="Times New Roman" w:hAnsi="Courier New" w:cs="Courier New"/>
           <w:sz w:val="20"/>
           <w:szCs w:val="20"/>
         </w:rPr>
-        <w:t xml:space="preserve">  </w:t>
-      </w:r>
+        <w:t>bne</w:t>
+      </w:r>
+      <w:proofErr w:type="spellEnd"/>
       <w:r>
         <w:rPr>
           <w:rFonts w:ascii="Courier New" w:eastAsia="Times New Roman" w:hAnsi="Courier New" w:cs="Courier New"/>
           <w:sz w:val="20"/>
           <w:szCs w:val="20"/>
         </w:rPr>
-        <w:t>x5, x0, loop</w:t>
-      </w:r>
-    </w:p>
-    <w:p>
-      <w:pPr>
-        <w:spacing w:after="0" w:line="240" w:lineRule="auto"/>
-        <w:ind w:left="720"/>
+        <w:t xml:space="preserve">     </w:t>
+      </w:r>
+      <w:r>
         <w:rPr>
           <w:rFonts w:ascii="Courier New" w:eastAsia="Times New Roman" w:hAnsi="Courier New" w:cs="Courier New"/>
           <w:sz w:val="20"/>
           <w:szCs w:val="20"/>
         </w:rPr>
-      </w:pPr>
+        <w:t xml:space="preserve">  </w:t>
+      </w:r>
       <w:r>
         <w:rPr>
           <w:rFonts w:ascii="Courier New" w:eastAsia="Times New Roman" w:hAnsi="Courier New" w:cs="Courier New"/>
           <w:sz w:val="20"/>
           <w:szCs w:val="20"/>
         </w:rPr>
-        <w:t xml:space="preserve">done:   j       </w:t>
-      </w:r>
-      <w:r>
+        <w:t>x5, x0, loop</w:t>
+      </w:r>
+    </w:p>
+    <w:p>
+      <w:pPr>
+        <w:spacing w:after="0" w:line="240" w:lineRule="auto"/>
+        <w:ind w:left="720"/>
         <w:rPr>
           <w:rFonts w:ascii="Courier New" w:eastAsia="Times New Roman" w:hAnsi="Courier New" w:cs="Courier New"/>
           <w:sz w:val="20"/>
           <w:szCs w:val="20"/>
         </w:rPr>
-        <w:t xml:space="preserve">  </w:t>
-      </w:r>
+      </w:pPr>
       <w:r>
         <w:rPr>
           <w:rFonts w:ascii="Courier New" w:eastAsia="Times New Roman" w:hAnsi="Courier New" w:cs="Courier New"/>
           <w:sz w:val="20"/>
           <w:szCs w:val="20"/>
         </w:rPr>
-        <w:t>done            # infinite loop (breakpoint)</w:t>
-      </w:r>
-    </w:p>
-    <w:p>
-      <w:pPr>
-        <w:spacing w:after="0" w:line="240" w:lineRule="auto"/>
-        <w:ind w:left="720"/>
+        <w:t xml:space="preserve">done:   j       </w:t>
+      </w:r>
+      <w:r>
         <w:rPr>
           <w:rFonts w:ascii="Courier New" w:eastAsia="Times New Roman" w:hAnsi="Courier New" w:cs="Courier New"/>
           <w:sz w:val="20"/>
           <w:szCs w:val="20"/>
         </w:rPr>
-      </w:pPr>
-    </w:p>
-    <w:p>
-      <w:pPr>
-        <w:spacing w:after="0" w:line="240" w:lineRule="auto"/>
-        <w:ind w:left="720"/>
+        <w:t xml:space="preserve">  </w:t>
+      </w:r>
+      <w:r>
         <w:rPr>
           <w:rFonts w:ascii="Courier New" w:eastAsia="Times New Roman" w:hAnsi="Courier New" w:cs="Courier New"/>
           <w:sz w:val="20"/>
           <w:szCs w:val="20"/>
         </w:rPr>
-      </w:pPr>
-      <w:r>
+        <w:t>done            # infinite loop (breakpoint)</w:t>
+      </w:r>
+    </w:p>
+    <w:p>
+      <w:pPr>
+        <w:spacing w:after="0" w:line="240" w:lineRule="auto"/>
+        <w:ind w:left="720"/>
         <w:rPr>
           <w:rFonts w:ascii="Courier New" w:eastAsia="Times New Roman" w:hAnsi="Courier New" w:cs="Courier New"/>
           <w:sz w:val="20"/>
           <w:szCs w:val="20"/>
         </w:rPr>
-        <w:t>#   initialize data in the array</w:t>
-      </w:r>
-      <w:r>
+      </w:pPr>
+    </w:p>
+    <w:p>
+      <w:pPr>
+        <w:spacing w:after="0" w:line="240" w:lineRule="auto"/>
+        <w:ind w:left="720"/>
         <w:rPr>
           <w:rFonts w:ascii="Courier New" w:eastAsia="Times New Roman" w:hAnsi="Courier New" w:cs="Courier New"/>
           <w:sz w:val="20"/>
           <w:szCs w:val="20"/>
         </w:rPr>
+      </w:pPr>
+      <w:r>
+        <w:rPr>
+          <w:rFonts w:ascii="Courier New" w:eastAsia="Times New Roman" w:hAnsi="Courier New" w:cs="Courier New"/>
+          <w:sz w:val="20"/>
+          <w:szCs w:val="20"/>
+        </w:rPr>
+        <w:t xml:space="preserve">#   </w:t>
+      </w:r>
+      <w:proofErr w:type="gramStart"/>
+      <w:r>
+        <w:rPr>
+          <w:rFonts w:ascii="Courier New" w:eastAsia="Times New Roman" w:hAnsi="Courier New" w:cs="Courier New"/>
+          <w:sz w:val="20"/>
+          <w:szCs w:val="20"/>
+        </w:rPr>
+        <w:t>initialize</w:t>
+      </w:r>
+      <w:proofErr w:type="gramEnd"/>
+      <w:r>
+        <w:rPr>
+          <w:rFonts w:ascii="Courier New" w:eastAsia="Times New Roman" w:hAnsi="Courier New" w:cs="Courier New"/>
+          <w:sz w:val="20"/>
+          <w:szCs w:val="20"/>
+        </w:rPr>
+        <w:t xml:space="preserve"> data in the array</w:t>
+      </w:r>
+      <w:r>
+        <w:rPr>
+          <w:rFonts w:ascii="Courier New" w:eastAsia="Times New Roman" w:hAnsi="Courier New" w:cs="Courier New"/>
+          <w:sz w:val="20"/>
+          <w:szCs w:val="20"/>
+        </w:rPr>
         <w:t xml:space="preserve"> [assumed to start at 0x10000000]</w:t>
       </w:r>
     </w:p>
@@ -1611,7 +1733,25 @@
           <w:sz w:val="20"/>
           <w:szCs w:val="20"/>
         </w:rPr>
-        <w:t>array:  .word 0x5, 0x4, 0x10, 0x3, 0x12, 0x1, 0x7, 0x4, 0x8, 0x2</w:t>
+        <w:t>array:</w:t>
+      </w:r>
+      <w:proofErr w:type="gramStart"/>
+      <w:r>
+        <w:rPr>
+          <w:rFonts w:ascii="Courier New" w:eastAsia="Times New Roman" w:hAnsi="Courier New" w:cs="Courier New"/>
+          <w:sz w:val="20"/>
+          <w:szCs w:val="20"/>
+        </w:rPr>
+        <w:t xml:space="preserve">  .word</w:t>
+      </w:r>
+      <w:proofErr w:type="gramEnd"/>
+      <w:r>
+        <w:rPr>
+          <w:rFonts w:ascii="Courier New" w:eastAsia="Times New Roman" w:hAnsi="Courier New" w:cs="Courier New"/>
+          <w:sz w:val="20"/>
+          <w:szCs w:val="20"/>
+        </w:rPr>
+        <w:t xml:space="preserve"> 0x5, 0x4, 0x10, 0x3, 0x12, 0x1, 0x7, 0x4, 0x8, 0x2</w:t>
       </w:r>
     </w:p>
     <w:p>
@@ -1737,6 +1877,7 @@
       <w:r>
         <w:rPr>
           <w:rFonts w:ascii="Helvetica" w:eastAsia="Times New Roman" w:hAnsi="Helvetica" w:cs="Helvetica"/>
+          <w:noProof/>
           <w:color w:val="333333"/>
           <w:sz w:val="21"/>
           <w:szCs w:val="21"/>
@@ -1948,9 +2089,21 @@
                 <w:szCs w:val="21"/>
                 <w:shd w:val="clear" w:color="auto" w:fill="FFFFFF"/>
               </w:rPr>
-              <w:t>riscv_multicycle.vhdl</w:t>
+              <w:t>riscv_</w:t>
+            </w:r>
+            <w:proofErr w:type="gramStart"/>
+            <w:r>
+              <w:rPr>
+                <w:rFonts w:ascii="Helvetica" w:eastAsia="Times New Roman" w:hAnsi="Helvetica" w:cs="Helvetica"/>
+                <w:color w:val="333333"/>
+                <w:sz w:val="21"/>
+                <w:szCs w:val="21"/>
+                <w:shd w:val="clear" w:color="auto" w:fill="FFFFFF"/>
+              </w:rPr>
+              <w:t>multicycle.vhdl</w:t>
             </w:r>
             <w:proofErr w:type="spellEnd"/>
+            <w:proofErr w:type="gramEnd"/>
             <w:r>
               <w:rPr>
                 <w:rFonts w:ascii="Helvetica" w:eastAsia="Times New Roman" w:hAnsi="Helvetica" w:cs="Helvetica"/>
@@ -2014,9 +2167,21 @@
                 <w:szCs w:val="21"/>
                 <w:shd w:val="clear" w:color="auto" w:fill="FFFFFF"/>
               </w:rPr>
-              <w:t>pc_live.vhdl</w:t>
+              <w:t>pc_</w:t>
+            </w:r>
+            <w:proofErr w:type="gramStart"/>
+            <w:r>
+              <w:rPr>
+                <w:rFonts w:ascii="Helvetica" w:eastAsia="Times New Roman" w:hAnsi="Helvetica" w:cs="Helvetica"/>
+                <w:color w:val="333333"/>
+                <w:sz w:val="21"/>
+                <w:szCs w:val="21"/>
+                <w:shd w:val="clear" w:color="auto" w:fill="FFFFFF"/>
+              </w:rPr>
+              <w:t>live.vhdl</w:t>
             </w:r>
             <w:proofErr w:type="spellEnd"/>
+            <w:proofErr w:type="gramEnd"/>
           </w:p>
         </w:tc>
         <w:tc>
@@ -2070,9 +2235,21 @@
                 <w:szCs w:val="21"/>
                 <w:shd w:val="clear" w:color="auto" w:fill="FFFFFF"/>
               </w:rPr>
-              <w:t>instr_mem.vhdl</w:t>
+              <w:t>instr_</w:t>
+            </w:r>
+            <w:proofErr w:type="gramStart"/>
+            <w:r>
+              <w:rPr>
+                <w:rFonts w:ascii="Helvetica" w:eastAsia="Times New Roman" w:hAnsi="Helvetica" w:cs="Helvetica"/>
+                <w:color w:val="333333"/>
+                <w:sz w:val="21"/>
+                <w:szCs w:val="21"/>
+                <w:shd w:val="clear" w:color="auto" w:fill="FFFFFF"/>
+              </w:rPr>
+              <w:t>mem.vhdl</w:t>
             </w:r>
             <w:proofErr w:type="spellEnd"/>
+            <w:proofErr w:type="gramEnd"/>
           </w:p>
         </w:tc>
         <w:tc>
@@ -2126,9 +2303,21 @@
                 <w:szCs w:val="21"/>
                 <w:shd w:val="clear" w:color="auto" w:fill="FFFFFF"/>
               </w:rPr>
-              <w:t>reg_file.vhdl</w:t>
+              <w:t>reg_</w:t>
+            </w:r>
+            <w:proofErr w:type="gramStart"/>
+            <w:r>
+              <w:rPr>
+                <w:rFonts w:ascii="Helvetica" w:eastAsia="Times New Roman" w:hAnsi="Helvetica" w:cs="Helvetica"/>
+                <w:color w:val="333333"/>
+                <w:sz w:val="21"/>
+                <w:szCs w:val="21"/>
+                <w:shd w:val="clear" w:color="auto" w:fill="FFFFFF"/>
+              </w:rPr>
+              <w:t>file.vhdl</w:t>
             </w:r>
             <w:proofErr w:type="spellEnd"/>
+            <w:proofErr w:type="gramEnd"/>
           </w:p>
         </w:tc>
         <w:tc>
@@ -2192,9 +2381,21 @@
                 <w:szCs w:val="21"/>
                 <w:shd w:val="clear" w:color="auto" w:fill="FFFFFF"/>
               </w:rPr>
-              <w:t>control_unit.vhdl</w:t>
+              <w:t>control_</w:t>
+            </w:r>
+            <w:proofErr w:type="gramStart"/>
+            <w:r>
+              <w:rPr>
+                <w:rFonts w:ascii="Helvetica" w:eastAsia="Times New Roman" w:hAnsi="Helvetica" w:cs="Helvetica"/>
+                <w:color w:val="333333"/>
+                <w:sz w:val="21"/>
+                <w:szCs w:val="21"/>
+                <w:shd w:val="clear" w:color="auto" w:fill="FFFFFF"/>
+              </w:rPr>
+              <w:t>unit.vhdl</w:t>
             </w:r>
             <w:proofErr w:type="spellEnd"/>
+            <w:proofErr w:type="gramEnd"/>
           </w:p>
         </w:tc>
         <w:tc>
@@ -2480,9 +2681,21 @@
                 <w:szCs w:val="21"/>
                 <w:shd w:val="clear" w:color="auto" w:fill="FFFFFF"/>
               </w:rPr>
-              <w:t>mmediate_generator.vhdl</w:t>
+              <w:t>mmediate_</w:t>
+            </w:r>
+            <w:proofErr w:type="gramStart"/>
+            <w:r>
+              <w:rPr>
+                <w:rFonts w:ascii="Helvetica" w:eastAsia="Times New Roman" w:hAnsi="Helvetica" w:cs="Helvetica"/>
+                <w:color w:val="333333"/>
+                <w:sz w:val="21"/>
+                <w:szCs w:val="21"/>
+                <w:shd w:val="clear" w:color="auto" w:fill="FFFFFF"/>
+              </w:rPr>
+              <w:t>generator.vhdl</w:t>
             </w:r>
             <w:proofErr w:type="spellEnd"/>
+            <w:proofErr w:type="gramEnd"/>
           </w:p>
         </w:tc>
         <w:tc>
@@ -2556,9 +2769,21 @@
                 <w:szCs w:val="21"/>
                 <w:shd w:val="clear" w:color="auto" w:fill="FFFFFF"/>
               </w:rPr>
-              <w:t>alu_control.vhdl</w:t>
+              <w:t>alu_</w:t>
+            </w:r>
+            <w:proofErr w:type="gramStart"/>
+            <w:r>
+              <w:rPr>
+                <w:rFonts w:ascii="Helvetica" w:eastAsia="Times New Roman" w:hAnsi="Helvetica" w:cs="Helvetica"/>
+                <w:color w:val="333333"/>
+                <w:sz w:val="21"/>
+                <w:szCs w:val="21"/>
+                <w:shd w:val="clear" w:color="auto" w:fill="FFFFFF"/>
+              </w:rPr>
+              <w:t>control.vhdl</w:t>
             </w:r>
             <w:proofErr w:type="spellEnd"/>
+            <w:proofErr w:type="gramEnd"/>
           </w:p>
         </w:tc>
         <w:tc>
@@ -2636,6 +2861,7 @@
               </w:rPr>
             </w:pPr>
             <w:proofErr w:type="spellStart"/>
+            <w:proofErr w:type="gramStart"/>
             <w:r>
               <w:rPr>
                 <w:rFonts w:ascii="Helvetica" w:eastAsia="Times New Roman" w:hAnsi="Helvetica" w:cs="Helvetica"/>
@@ -2647,6 +2873,7 @@
               <w:t>alu.vhdl</w:t>
             </w:r>
             <w:proofErr w:type="spellEnd"/>
+            <w:proofErr w:type="gramEnd"/>
           </w:p>
         </w:tc>
         <w:tc>
@@ -2722,9 +2949,21 @@
                 <w:szCs w:val="21"/>
                 <w:shd w:val="clear" w:color="auto" w:fill="FFFFFF"/>
               </w:rPr>
-              <w:t>data_mem.vhdl</w:t>
+              <w:t>data_</w:t>
+            </w:r>
+            <w:proofErr w:type="gramStart"/>
+            <w:r>
+              <w:rPr>
+                <w:rFonts w:ascii="Helvetica" w:eastAsia="Times New Roman" w:hAnsi="Helvetica" w:cs="Helvetica"/>
+                <w:color w:val="333333"/>
+                <w:sz w:val="21"/>
+                <w:szCs w:val="21"/>
+                <w:shd w:val="clear" w:color="auto" w:fill="FFFFFF"/>
+              </w:rPr>
+              <w:t>mem.vhdl</w:t>
             </w:r>
             <w:proofErr w:type="spellEnd"/>
+            <w:proofErr w:type="gramEnd"/>
           </w:p>
         </w:tc>
         <w:tc>
@@ -2788,9 +3027,21 @@
                 <w:szCs w:val="21"/>
                 <w:shd w:val="clear" w:color="auto" w:fill="FFFFFF"/>
               </w:rPr>
-              <w:t>tb_riscv_multicycle.vhdl</w:t>
+              <w:t>tb_riscv_</w:t>
+            </w:r>
+            <w:proofErr w:type="gramStart"/>
+            <w:r>
+              <w:rPr>
+                <w:rFonts w:ascii="Helvetica" w:eastAsia="Times New Roman" w:hAnsi="Helvetica" w:cs="Helvetica"/>
+                <w:color w:val="333333"/>
+                <w:sz w:val="21"/>
+                <w:szCs w:val="21"/>
+                <w:shd w:val="clear" w:color="auto" w:fill="FFFFFF"/>
+              </w:rPr>
+              <w:t>multicycle.vhdl</w:t>
             </w:r>
             <w:proofErr w:type="spellEnd"/>
+            <w:proofErr w:type="gramEnd"/>
           </w:p>
         </w:tc>
         <w:tc>
@@ -2874,9 +3125,21 @@
                 <w:szCs w:val="21"/>
                 <w:shd w:val="clear" w:color="auto" w:fill="FFFFFF"/>
               </w:rPr>
-              <w:t>_multicycle_behav.wcfg</w:t>
+              <w:t>_multicycle_</w:t>
+            </w:r>
+            <w:proofErr w:type="gramStart"/>
+            <w:r>
+              <w:rPr>
+                <w:rFonts w:ascii="Helvetica" w:eastAsia="Times New Roman" w:hAnsi="Helvetica" w:cs="Helvetica"/>
+                <w:color w:val="333333"/>
+                <w:sz w:val="21"/>
+                <w:szCs w:val="21"/>
+                <w:shd w:val="clear" w:color="auto" w:fill="FFFFFF"/>
+              </w:rPr>
+              <w:t>behav.wcfg</w:t>
             </w:r>
             <w:proofErr w:type="spellEnd"/>
+            <w:proofErr w:type="gramEnd"/>
           </w:p>
         </w:tc>
         <w:tc>
@@ -3291,9 +3554,9 @@
                 <w:szCs w:val="21"/>
                 <w:shd w:val="clear" w:color="auto" w:fill="FFFFFF"/>
               </w:rPr>
-              <w:t xml:space="preserve">     #  </w:t>
-            </w:r>
-            <w:proofErr w:type="spellStart"/>
+              <w:t xml:space="preserve">     </w:t>
+            </w:r>
+            <w:proofErr w:type="gramStart"/>
             <w:r>
               <w:rPr>
                 <w:rFonts w:ascii="Helvetica" w:eastAsia="Times New Roman" w:hAnsi="Helvetica" w:cs="Helvetica"/>
@@ -3304,9 +3567,23 @@
                 <w:szCs w:val="21"/>
                 <w:shd w:val="clear" w:color="auto" w:fill="FFFFFF"/>
               </w:rPr>
+              <w:t xml:space="preserve">#  </w:t>
+            </w:r>
+            <w:proofErr w:type="spellStart"/>
+            <w:r>
+              <w:rPr>
+                <w:rFonts w:ascii="Helvetica" w:eastAsia="Times New Roman" w:hAnsi="Helvetica" w:cs="Helvetica"/>
+                <w:i/>
+                <w:iCs/>
+                <w:color w:val="333333"/>
+                <w:sz w:val="21"/>
+                <w:szCs w:val="21"/>
+                <w:shd w:val="clear" w:color="auto" w:fill="FFFFFF"/>
+              </w:rPr>
               <w:t>rd</w:t>
             </w:r>
             <w:proofErr w:type="spellEnd"/>
+            <w:proofErr w:type="gramEnd"/>
             <w:r>
               <w:rPr>
                 <w:rFonts w:ascii="Helvetica" w:eastAsia="Times New Roman" w:hAnsi="Helvetica" w:cs="Helvetica"/>
@@ -3870,9 +4147,9 @@
                 <w:szCs w:val="21"/>
                 <w:shd w:val="clear" w:color="auto" w:fill="FFFFFF"/>
               </w:rPr>
-              <w:t xml:space="preserve">        #  </w:t>
-            </w:r>
-            <w:proofErr w:type="spellStart"/>
+              <w:t xml:space="preserve">        </w:t>
+            </w:r>
+            <w:proofErr w:type="gramStart"/>
             <w:r>
               <w:rPr>
                 <w:rFonts w:ascii="Helvetica" w:eastAsia="Times New Roman" w:hAnsi="Helvetica" w:cs="Helvetica"/>
@@ -3883,9 +4160,23 @@
                 <w:szCs w:val="21"/>
                 <w:shd w:val="clear" w:color="auto" w:fill="FFFFFF"/>
               </w:rPr>
+              <w:t xml:space="preserve">#  </w:t>
+            </w:r>
+            <w:proofErr w:type="spellStart"/>
+            <w:r>
+              <w:rPr>
+                <w:rFonts w:ascii="Helvetica" w:eastAsia="Times New Roman" w:hAnsi="Helvetica" w:cs="Helvetica"/>
+                <w:i/>
+                <w:iCs/>
+                <w:color w:val="333333"/>
+                <w:sz w:val="21"/>
+                <w:szCs w:val="21"/>
+                <w:shd w:val="clear" w:color="auto" w:fill="FFFFFF"/>
+              </w:rPr>
               <w:t>rd</w:t>
             </w:r>
             <w:proofErr w:type="spellEnd"/>
+            <w:proofErr w:type="gramEnd"/>
             <w:r>
               <w:rPr>
                 <w:rFonts w:ascii="Helvetica" w:eastAsia="Times New Roman" w:hAnsi="Helvetica" w:cs="Helvetica"/>
@@ -4487,9 +4778,9 @@
                 <w:szCs w:val="21"/>
                 <w:shd w:val="clear" w:color="auto" w:fill="FFFFFF"/>
               </w:rPr>
-              <w:t xml:space="preserve">        #  </w:t>
-            </w:r>
-            <w:proofErr w:type="spellStart"/>
+              <w:t xml:space="preserve">        </w:t>
+            </w:r>
+            <w:proofErr w:type="gramStart"/>
             <w:r>
               <w:rPr>
                 <w:rFonts w:ascii="Helvetica" w:eastAsia="Times New Roman" w:hAnsi="Helvetica" w:cs="Helvetica"/>
@@ -4500,9 +4791,9 @@
                 <w:szCs w:val="21"/>
                 <w:shd w:val="clear" w:color="auto" w:fill="FFFFFF"/>
               </w:rPr>
-              <w:t>rd</w:t>
-            </w:r>
-            <w:proofErr w:type="spellEnd"/>
+              <w:t xml:space="preserve">#  </w:t>
+            </w:r>
+            <w:proofErr w:type="spellStart"/>
             <w:r>
               <w:rPr>
                 <w:rFonts w:ascii="Helvetica" w:eastAsia="Times New Roman" w:hAnsi="Helvetica" w:cs="Helvetica"/>
@@ -4513,8 +4804,10 @@
                 <w:szCs w:val="21"/>
                 <w:shd w:val="clear" w:color="auto" w:fill="FFFFFF"/>
               </w:rPr>
-              <w:t xml:space="preserve"> = </w:t>
-            </w:r>
+              <w:t>rd</w:t>
+            </w:r>
+            <w:proofErr w:type="spellEnd"/>
+            <w:proofErr w:type="gramEnd"/>
             <w:r>
               <w:rPr>
                 <w:rFonts w:ascii="Helvetica" w:eastAsia="Times New Roman" w:hAnsi="Helvetica" w:cs="Helvetica"/>
@@ -4525,8 +4818,22 @@
                 <w:szCs w:val="21"/>
                 <w:shd w:val="clear" w:color="auto" w:fill="FFFFFF"/>
               </w:rPr>
+              <w:t xml:space="preserve"> = </w:t>
+            </w:r>
+            <w:proofErr w:type="gramStart"/>
+            <w:r>
+              <w:rPr>
+                <w:rFonts w:ascii="Helvetica" w:eastAsia="Times New Roman" w:hAnsi="Helvetica" w:cs="Helvetica"/>
+                <w:i/>
+                <w:iCs/>
+                <w:color w:val="333333"/>
+                <w:sz w:val="21"/>
+                <w:szCs w:val="21"/>
+                <w:shd w:val="clear" w:color="auto" w:fill="FFFFFF"/>
+              </w:rPr>
               <w:t>memory[</w:t>
             </w:r>
+            <w:proofErr w:type="gramEnd"/>
             <w:r>
               <w:rPr>
                 <w:rFonts w:ascii="Helvetica" w:eastAsia="Times New Roman" w:hAnsi="Helvetica" w:cs="Helvetica"/>
@@ -4881,31 +5188,32 @@
           <w:p>
             <w:pPr>
               <w:rPr>
+                <w:rFonts w:ascii="Helvetica" w:eastAsia="Times New Roman" w:hAnsi="Helvetica" w:cs="Helvetica"/>
+                <w:color w:val="333333"/>
+                <w:sz w:val="21"/>
+                <w:szCs w:val="21"/>
+                <w:highlight w:val="yellow"/>
+                <w:shd w:val="clear" w:color="auto" w:fill="FFFFFF"/>
+              </w:rPr>
+            </w:pPr>
+            <w:r>
+              <w:rPr>
+                <w:rFonts w:ascii="Helvetica" w:eastAsia="Times New Roman" w:hAnsi="Helvetica" w:cs="Helvetica"/>
+                <w:color w:val="333333"/>
+                <w:sz w:val="21"/>
+                <w:szCs w:val="21"/>
+                <w:shd w:val="clear" w:color="auto" w:fill="FFFFFF"/>
+              </w:rPr>
+              <w:t xml:space="preserve">    Opcode= “</w:t>
+            </w:r>
+            <w:r>
+              <w:rPr>
                 <w:rFonts w:ascii="Helvetica" w:hAnsi="Helvetica" w:cs="Helvetica"/>
                 <w:color w:val="333333"/>
                 <w:sz w:val="21"/>
                 <w:szCs w:val="21"/>
                 <w:shd w:val="clear" w:color="auto" w:fill="FFFFFF"/>
               </w:rPr>
-            </w:pPr>
-            <w:r>
-              <w:rPr>
-                <w:rFonts w:ascii="Helvetica" w:eastAsia="Times New Roman" w:hAnsi="Helvetica" w:cs="Helvetica"/>
-                <w:color w:val="333333"/>
-                <w:sz w:val="21"/>
-                <w:szCs w:val="21"/>
-                <w:shd w:val="clear" w:color="auto" w:fill="FFFFFF"/>
-              </w:rPr>
-              <w:t xml:space="preserve">    Opcode= “</w:t>
-            </w:r>
-            <w:r>
-              <w:rPr>
-                <w:rFonts w:ascii="Helvetica" w:hAnsi="Helvetica" w:cs="Helvetica"/>
-                <w:color w:val="333333"/>
-                <w:sz w:val="21"/>
-                <w:szCs w:val="21"/>
-                <w:shd w:val="clear" w:color="auto" w:fill="FFFFFF"/>
-              </w:rPr>
               <w:t>0000011</w:t>
             </w:r>
             <w:r>
@@ -4918,18 +5226,6 @@
               </w:rPr>
               <w:t>”</w:t>
             </w:r>
-          </w:p>
-          <w:p>
-            <w:pPr>
-              <w:rPr>
-                <w:rFonts w:ascii="Helvetica" w:eastAsia="Times New Roman" w:hAnsi="Helvetica" w:cs="Helvetica"/>
-                <w:color w:val="333333"/>
-                <w:sz w:val="21"/>
-                <w:szCs w:val="21"/>
-                <w:highlight w:val="yellow"/>
-                <w:shd w:val="clear" w:color="auto" w:fill="FFFFFF"/>
-              </w:rPr>
-            </w:pPr>
           </w:p>
         </w:tc>
       </w:tr>
@@ -5190,8 +5486,9 @@
                 <w:szCs w:val="21"/>
                 <w:shd w:val="clear" w:color="auto" w:fill="FFFFFF"/>
               </w:rPr>
-              <w:t xml:space="preserve">        #  </w:t>
-            </w:r>
+              <w:t xml:space="preserve">        </w:t>
+            </w:r>
+            <w:proofErr w:type="gramStart"/>
             <w:r>
               <w:rPr>
                 <w:rFonts w:ascii="Helvetica" w:eastAsia="Times New Roman" w:hAnsi="Helvetica" w:cs="Helvetica"/>
@@ -5202,7 +5499,32 @@
                 <w:szCs w:val="21"/>
                 <w:shd w:val="clear" w:color="auto" w:fill="FFFFFF"/>
               </w:rPr>
-              <w:t xml:space="preserve">PC = PC + 4 + </w:t>
+              <w:t xml:space="preserve">#  </w:t>
+            </w:r>
+            <w:r>
+              <w:rPr>
+                <w:rFonts w:ascii="Helvetica" w:eastAsia="Times New Roman" w:hAnsi="Helvetica" w:cs="Helvetica"/>
+                <w:i/>
+                <w:iCs/>
+                <w:color w:val="333333"/>
+                <w:sz w:val="21"/>
+                <w:szCs w:val="21"/>
+                <w:shd w:val="clear" w:color="auto" w:fill="FFFFFF"/>
+              </w:rPr>
+              <w:t>PC</w:t>
+            </w:r>
+            <w:proofErr w:type="gramEnd"/>
+            <w:r>
+              <w:rPr>
+                <w:rFonts w:ascii="Helvetica" w:eastAsia="Times New Roman" w:hAnsi="Helvetica" w:cs="Helvetica"/>
+                <w:i/>
+                <w:iCs/>
+                <w:color w:val="333333"/>
+                <w:sz w:val="21"/>
+                <w:szCs w:val="21"/>
+                <w:shd w:val="clear" w:color="auto" w:fill="FFFFFF"/>
+              </w:rPr>
+              <w:t xml:space="preserve"> = PC + 4 + </w:t>
             </w:r>
             <w:proofErr w:type="spellStart"/>
             <w:r>
@@ -5335,19 +5657,10 @@
                 <w:szCs w:val="21"/>
                 <w:shd w:val="clear" w:color="auto" w:fill="FFFFFF"/>
               </w:rPr>
-              <w:t xml:space="preserve">    “</w:t>
-            </w:r>
-            <w:r>
-              <w:rPr>
-                <w:rFonts w:ascii="Helvetica" w:eastAsia="Times New Roman" w:hAnsi="Helvetica" w:cs="Helvetica"/>
-                <w:color w:val="333333"/>
-                <w:sz w:val="21"/>
-                <w:szCs w:val="21"/>
-                <w:shd w:val="clear" w:color="auto" w:fill="FFFFFF"/>
-              </w:rPr>
-              <w:t>&lt;</w:t>
+              <w:t xml:space="preserve">    “&lt;</w:t>
             </w:r>
             <w:proofErr w:type="spellStart"/>
+            <w:proofErr w:type="gramStart"/>
             <w:r>
               <w:rPr>
                 <w:rFonts w:ascii="Helvetica" w:eastAsia="Times New Roman" w:hAnsi="Helvetica" w:cs="Helvetica"/>
@@ -5367,39 +5680,21 @@
                 <w:szCs w:val="21"/>
                 <w:shd w:val="clear" w:color="auto" w:fill="FFFFFF"/>
               </w:rPr>
-              <w:t>[1</w:t>
-            </w:r>
-            <w:r>
-              <w:rPr>
-                <w:rFonts w:ascii="Helvetica" w:eastAsia="Times New Roman" w:hAnsi="Helvetica" w:cs="Helvetica"/>
-                <w:color w:val="333333"/>
-                <w:sz w:val="21"/>
-                <w:szCs w:val="21"/>
-                <w:shd w:val="clear" w:color="auto" w:fill="FFFFFF"/>
-              </w:rPr>
-              <w:t>1</w:t>
-            </w:r>
-            <w:r>
-              <w:rPr>
-                <w:rFonts w:ascii="Helvetica" w:eastAsia="Times New Roman" w:hAnsi="Helvetica" w:cs="Helvetica"/>
-                <w:color w:val="333333"/>
-                <w:sz w:val="21"/>
-                <w:szCs w:val="21"/>
-                <w:shd w:val="clear" w:color="auto" w:fill="FFFFFF"/>
-              </w:rPr>
-              <w:t xml:space="preserve">]&gt; </w:t>
-            </w:r>
-            <w:r>
-              <w:rPr>
-                <w:rFonts w:ascii="Helvetica" w:eastAsia="Times New Roman" w:hAnsi="Helvetica" w:cs="Helvetica"/>
-                <w:color w:val="333333"/>
-                <w:sz w:val="21"/>
-                <w:szCs w:val="21"/>
-                <w:shd w:val="clear" w:color="auto" w:fill="FFFFFF"/>
-              </w:rPr>
-              <w:t>&lt;</w:t>
+              <w:t>[</w:t>
+            </w:r>
+            <w:proofErr w:type="gramEnd"/>
+            <w:r>
+              <w:rPr>
+                <w:rFonts w:ascii="Helvetica" w:eastAsia="Times New Roman" w:hAnsi="Helvetica" w:cs="Helvetica"/>
+                <w:color w:val="333333"/>
+                <w:sz w:val="21"/>
+                <w:szCs w:val="21"/>
+                <w:shd w:val="clear" w:color="auto" w:fill="FFFFFF"/>
+              </w:rPr>
+              <w:t>11]&gt; &lt;</w:t>
             </w:r>
             <w:proofErr w:type="spellStart"/>
+            <w:proofErr w:type="gramStart"/>
             <w:r>
               <w:rPr>
                 <w:rFonts w:ascii="Helvetica" w:eastAsia="Times New Roman" w:hAnsi="Helvetica" w:cs="Helvetica"/>
@@ -5421,45 +5716,16 @@
               </w:rPr>
               <w:t>[</w:t>
             </w:r>
-            <w:r>
-              <w:rPr>
-                <w:rFonts w:ascii="Helvetica" w:eastAsia="Times New Roman" w:hAnsi="Helvetica" w:cs="Helvetica"/>
-                <w:color w:val="333333"/>
-                <w:sz w:val="21"/>
-                <w:szCs w:val="21"/>
-                <w:shd w:val="clear" w:color="auto" w:fill="FFFFFF"/>
-              </w:rPr>
-              <w:t>9</w:t>
-            </w:r>
-            <w:r>
-              <w:rPr>
-                <w:rFonts w:ascii="Helvetica" w:eastAsia="Times New Roman" w:hAnsi="Helvetica" w:cs="Helvetica"/>
-                <w:color w:val="333333"/>
-                <w:sz w:val="21"/>
-                <w:szCs w:val="21"/>
-                <w:shd w:val="clear" w:color="auto" w:fill="FFFFFF"/>
-              </w:rPr>
-              <w:t>:</w:t>
-            </w:r>
-            <w:r>
-              <w:rPr>
-                <w:rFonts w:ascii="Helvetica" w:eastAsia="Times New Roman" w:hAnsi="Helvetica" w:cs="Helvetica"/>
-                <w:color w:val="333333"/>
-                <w:sz w:val="21"/>
-                <w:szCs w:val="21"/>
-                <w:shd w:val="clear" w:color="auto" w:fill="FFFFFF"/>
-              </w:rPr>
-              <w:t>4</w:t>
-            </w:r>
-            <w:r>
-              <w:rPr>
-                <w:rFonts w:ascii="Helvetica" w:eastAsia="Times New Roman" w:hAnsi="Helvetica" w:cs="Helvetica"/>
-                <w:color w:val="333333"/>
-                <w:sz w:val="21"/>
-                <w:szCs w:val="21"/>
-                <w:shd w:val="clear" w:color="auto" w:fill="FFFFFF"/>
-              </w:rPr>
-              <w:t>]&gt; &lt;5-bit rs2&gt;</w:t>
+            <w:proofErr w:type="gramEnd"/>
+            <w:r>
+              <w:rPr>
+                <w:rFonts w:ascii="Helvetica" w:eastAsia="Times New Roman" w:hAnsi="Helvetica" w:cs="Helvetica"/>
+                <w:color w:val="333333"/>
+                <w:sz w:val="21"/>
+                <w:szCs w:val="21"/>
+                <w:shd w:val="clear" w:color="auto" w:fill="FFFFFF"/>
+              </w:rPr>
+              <w:t>9:4]&gt; &lt;5-bit rs2&gt;</w:t>
             </w:r>
             <w:r>
               <w:t xml:space="preserve"> </w:t>
@@ -5488,6 +5754,7 @@
               <w:t>&lt;3-bit funct3&gt; &lt;</w:t>
             </w:r>
             <w:proofErr w:type="spellStart"/>
+            <w:proofErr w:type="gramStart"/>
             <w:r>
               <w:rPr>
                 <w:rFonts w:ascii="Helvetica" w:eastAsia="Times New Roman" w:hAnsi="Helvetica" w:cs="Helvetica"/>
@@ -5509,25 +5776,36 @@
               </w:rPr>
               <w:t>[</w:t>
             </w:r>
-            <w:r>
-              <w:rPr>
-                <w:rFonts w:ascii="Helvetica" w:eastAsia="Times New Roman" w:hAnsi="Helvetica" w:cs="Helvetica"/>
-                <w:color w:val="333333"/>
-                <w:sz w:val="21"/>
-                <w:szCs w:val="21"/>
-                <w:shd w:val="clear" w:color="auto" w:fill="FFFFFF"/>
-              </w:rPr>
-              <w:t>3</w:t>
-            </w:r>
-            <w:r>
-              <w:rPr>
-                <w:rFonts w:ascii="Helvetica" w:eastAsia="Times New Roman" w:hAnsi="Helvetica" w:cs="Helvetica"/>
-                <w:color w:val="333333"/>
-                <w:sz w:val="21"/>
-                <w:szCs w:val="21"/>
-                <w:shd w:val="clear" w:color="auto" w:fill="FFFFFF"/>
-              </w:rPr>
-              <w:t xml:space="preserve">:1]&gt;   </w:t>
+            <w:proofErr w:type="gramEnd"/>
+            <w:r>
+              <w:rPr>
+                <w:rFonts w:ascii="Helvetica" w:eastAsia="Times New Roman" w:hAnsi="Helvetica" w:cs="Helvetica"/>
+                <w:color w:val="333333"/>
+                <w:sz w:val="21"/>
+                <w:szCs w:val="21"/>
+                <w:shd w:val="clear" w:color="auto" w:fill="FFFFFF"/>
+              </w:rPr>
+              <w:t>3:</w:t>
+            </w:r>
+            <w:r>
+              <w:rPr>
+                <w:rFonts w:ascii="Helvetica" w:eastAsia="Times New Roman" w:hAnsi="Helvetica" w:cs="Helvetica"/>
+                <w:color w:val="333333"/>
+                <w:sz w:val="21"/>
+                <w:szCs w:val="21"/>
+                <w:shd w:val="clear" w:color="auto" w:fill="FFFFFF"/>
+              </w:rPr>
+              <w:t>0</w:t>
+            </w:r>
+            <w:r>
+              <w:rPr>
+                <w:rFonts w:ascii="Helvetica" w:eastAsia="Times New Roman" w:hAnsi="Helvetica" w:cs="Helvetica"/>
+                <w:color w:val="333333"/>
+                <w:sz w:val="21"/>
+                <w:szCs w:val="21"/>
+                <w:shd w:val="clear" w:color="auto" w:fill="FFFFFF"/>
+              </w:rPr>
+              <w:t xml:space="preserve">]&gt;   </w:t>
             </w:r>
           </w:p>
           <w:p>
@@ -5548,29 +5826,10 @@
                 <w:szCs w:val="21"/>
                 <w:shd w:val="clear" w:color="auto" w:fill="FFFFFF"/>
               </w:rPr>
-              <w:t xml:space="preserve">     </w:t>
-            </w:r>
-            <w:r>
-              <w:rPr>
-                <w:rFonts w:ascii="Helvetica" w:eastAsia="Times New Roman" w:hAnsi="Helvetica" w:cs="Helvetica"/>
-                <w:color w:val="333333"/>
-                <w:sz w:val="21"/>
-                <w:szCs w:val="21"/>
-                <w:shd w:val="clear" w:color="auto" w:fill="FFFFFF"/>
-              </w:rPr>
-              <w:t>&lt;unused bit&gt;</w:t>
-            </w:r>
-            <w:r>
-              <w:rPr>
-                <w:rFonts w:ascii="Helvetica" w:eastAsia="Times New Roman" w:hAnsi="Helvetica" w:cs="Helvetica"/>
-                <w:color w:val="333333"/>
-                <w:sz w:val="21"/>
-                <w:szCs w:val="21"/>
-                <w:shd w:val="clear" w:color="auto" w:fill="FFFFFF"/>
-              </w:rPr>
-              <w:t>&lt;</w:t>
+              <w:t xml:space="preserve">     &lt;</w:t>
             </w:r>
             <w:proofErr w:type="spellStart"/>
+            <w:proofErr w:type="gramStart"/>
             <w:r>
               <w:rPr>
                 <w:rFonts w:ascii="Helvetica" w:eastAsia="Times New Roman" w:hAnsi="Helvetica" w:cs="Helvetica"/>
@@ -5590,27 +5849,18 @@
                 <w:szCs w:val="21"/>
                 <w:shd w:val="clear" w:color="auto" w:fill="FFFFFF"/>
               </w:rPr>
-              <w:t>[1</w:t>
-            </w:r>
-            <w:r>
-              <w:rPr>
-                <w:rFonts w:ascii="Helvetica" w:eastAsia="Times New Roman" w:hAnsi="Helvetica" w:cs="Helvetica"/>
-                <w:color w:val="333333"/>
-                <w:sz w:val="21"/>
-                <w:szCs w:val="21"/>
-                <w:shd w:val="clear" w:color="auto" w:fill="FFFFFF"/>
-              </w:rPr>
-              <w:t>0</w:t>
-            </w:r>
-            <w:r>
-              <w:rPr>
-                <w:rFonts w:ascii="Helvetica" w:eastAsia="Times New Roman" w:hAnsi="Helvetica" w:cs="Helvetica"/>
-                <w:color w:val="333333"/>
-                <w:sz w:val="21"/>
-                <w:szCs w:val="21"/>
-                <w:shd w:val="clear" w:color="auto" w:fill="FFFFFF"/>
-              </w:rPr>
-              <w:t>]&gt;&lt;7-bit opcode&gt;”</w:t>
+              <w:t>[</w:t>
+            </w:r>
+            <w:proofErr w:type="gramEnd"/>
+            <w:r>
+              <w:rPr>
+                <w:rFonts w:ascii="Helvetica" w:eastAsia="Times New Roman" w:hAnsi="Helvetica" w:cs="Helvetica"/>
+                <w:color w:val="333333"/>
+                <w:sz w:val="21"/>
+                <w:szCs w:val="21"/>
+                <w:shd w:val="clear" w:color="auto" w:fill="FFFFFF"/>
+              </w:rPr>
+              <w:t>10]&gt;&lt;7-bit opcode&gt;”</w:t>
             </w:r>
           </w:p>
           <w:p>
@@ -5623,46 +5873,6 @@
                 <w:shd w:val="clear" w:color="auto" w:fill="FFFFFF"/>
               </w:rPr>
             </w:pPr>
-            <w:r>
-              <w:rPr>
-                <w:rFonts w:ascii="Helvetica" w:eastAsia="Times New Roman" w:hAnsi="Helvetica" w:cs="Helvetica"/>
-                <w:color w:val="333333"/>
-                <w:sz w:val="21"/>
-                <w:szCs w:val="21"/>
-                <w:shd w:val="clear" w:color="auto" w:fill="FFFFFF"/>
-              </w:rPr>
-              <w:t xml:space="preserve"> </w:t>
-            </w:r>
-            <w:r>
-              <w:rPr>
-                <w:rFonts w:ascii="Helvetica" w:eastAsia="Times New Roman" w:hAnsi="Helvetica" w:cs="Helvetica"/>
-                <w:color w:val="333333"/>
-                <w:sz w:val="21"/>
-                <w:szCs w:val="21"/>
-                <w:shd w:val="clear" w:color="auto" w:fill="FFFFFF"/>
-              </w:rPr>
-              <w:t xml:space="preserve">    funct3= “</w:t>
-            </w:r>
-            <w:r>
-              <w:rPr>
-                <w:rFonts w:ascii="Helvetica" w:eastAsia="Times New Roman" w:hAnsi="Helvetica" w:cs="Helvetica"/>
-                <w:color w:val="333333"/>
-                <w:sz w:val="21"/>
-                <w:szCs w:val="21"/>
-                <w:shd w:val="clear" w:color="auto" w:fill="FFFFFF"/>
-              </w:rPr>
-              <w:t>001</w:t>
-            </w:r>
-            <w:r>
-              <w:rPr>
-                <w:rFonts w:ascii="Helvetica" w:eastAsia="Times New Roman" w:hAnsi="Helvetica" w:cs="Helvetica"/>
-                <w:color w:val="333333"/>
-                <w:sz w:val="21"/>
-                <w:szCs w:val="21"/>
-                <w:shd w:val="clear" w:color="auto" w:fill="FFFFFF"/>
-              </w:rPr>
-              <w:t>”</w:t>
-            </w:r>
           </w:p>
           <w:p>
             <w:pPr>
@@ -5682,37 +5892,7 @@
                 <w:szCs w:val="21"/>
                 <w:shd w:val="clear" w:color="auto" w:fill="FFFFFF"/>
               </w:rPr>
-              <w:t xml:space="preserve">    Opcode= “</w:t>
-            </w:r>
-            <w:r>
-              <w:rPr>
-                <w:rFonts w:ascii="Helvetica" w:hAnsi="Helvetica" w:cs="Helvetica"/>
-                <w:color w:val="333333"/>
-                <w:sz w:val="21"/>
-                <w:szCs w:val="21"/>
-                <w:shd w:val="clear" w:color="auto" w:fill="FFFFFF"/>
-              </w:rPr>
-              <w:t>1100011</w:t>
-            </w:r>
-            <w:r>
-              <w:rPr>
-                <w:rFonts w:ascii="Helvetica" w:eastAsia="Times New Roman" w:hAnsi="Helvetica" w:cs="Helvetica"/>
-                <w:color w:val="333333"/>
-                <w:sz w:val="21"/>
-                <w:szCs w:val="21"/>
-                <w:shd w:val="clear" w:color="auto" w:fill="FFFFFF"/>
-              </w:rPr>
-              <w:t>”</w:t>
-            </w:r>
-            <w:r>
-              <w:rPr>
-                <w:rFonts w:ascii="Helvetica" w:hAnsi="Helvetica" w:cs="Helvetica"/>
-                <w:color w:val="333333"/>
-                <w:sz w:val="21"/>
-                <w:szCs w:val="21"/>
-                <w:shd w:val="clear" w:color="auto" w:fill="FFFFFF"/>
-              </w:rPr>
-              <w:t>.</w:t>
+              <w:t xml:space="preserve">     funct3= “001”</w:t>
             </w:r>
           </w:p>
           <w:p>
@@ -5727,15 +5907,34 @@
             </w:pPr>
             <w:r>
               <w:rPr>
+                <w:rFonts w:ascii="Helvetica" w:eastAsia="Times New Roman" w:hAnsi="Helvetica" w:cs="Helvetica"/>
+                <w:color w:val="333333"/>
+                <w:sz w:val="21"/>
+                <w:szCs w:val="21"/>
+                <w:shd w:val="clear" w:color="auto" w:fill="FFFFFF"/>
+              </w:rPr>
+              <w:t xml:space="preserve">    Opcode= “</w:t>
+            </w:r>
+            <w:r>
+              <w:rPr>
                 <w:rFonts w:ascii="Helvetica" w:hAnsi="Helvetica" w:cs="Helvetica"/>
                 <w:color w:val="333333"/>
                 <w:sz w:val="21"/>
                 <w:szCs w:val="21"/>
                 <w:shd w:val="clear" w:color="auto" w:fill="FFFFFF"/>
               </w:rPr>
-              <w:t>So the final PC = PC + 4 + (sign extend)(</w:t>
-            </w:r>
-            <w:proofErr w:type="spellStart"/>
+              <w:t>1100011</w:t>
+            </w:r>
+            <w:r>
+              <w:rPr>
+                <w:rFonts w:ascii="Helvetica" w:eastAsia="Times New Roman" w:hAnsi="Helvetica" w:cs="Helvetica"/>
+                <w:color w:val="333333"/>
+                <w:sz w:val="21"/>
+                <w:szCs w:val="21"/>
+                <w:shd w:val="clear" w:color="auto" w:fill="FFFFFF"/>
+              </w:rPr>
+              <w:t>”</w:t>
+            </w:r>
             <w:r>
               <w:rPr>
                 <w:rFonts w:ascii="Helvetica" w:hAnsi="Helvetica" w:cs="Helvetica"/>
@@ -5744,132 +5943,19 @@
                 <w:szCs w:val="21"/>
                 <w:shd w:val="clear" w:color="auto" w:fill="FFFFFF"/>
               </w:rPr>
-              <w:t>imm</w:t>
-            </w:r>
-            <w:proofErr w:type="spellEnd"/>
-            <w:r>
-              <w:rPr>
-                <w:rFonts w:ascii="Helvetica" w:hAnsi="Helvetica" w:cs="Helvetica"/>
-                <w:color w:val="333333"/>
-                <w:sz w:val="21"/>
-                <w:szCs w:val="21"/>
-                <w:shd w:val="clear" w:color="auto" w:fill="FFFFFF"/>
-              </w:rPr>
-              <w:t>[</w:t>
-            </w:r>
-            <w:r>
-              <w:rPr>
-                <w:rFonts w:ascii="Helvetica" w:hAnsi="Helvetica" w:cs="Helvetica"/>
-                <w:color w:val="333333"/>
-                <w:sz w:val="21"/>
-                <w:szCs w:val="21"/>
-                <w:shd w:val="clear" w:color="auto" w:fill="FFFFFF"/>
-              </w:rPr>
-              <w:t>1</w:t>
-            </w:r>
-            <w:r>
-              <w:rPr>
-                <w:rFonts w:ascii="Helvetica" w:hAnsi="Helvetica" w:cs="Helvetica"/>
-                <w:color w:val="333333"/>
-                <w:sz w:val="21"/>
-                <w:szCs w:val="21"/>
-                <w:shd w:val="clear" w:color="auto" w:fill="FFFFFF"/>
-              </w:rPr>
-              <w:t>1</w:t>
-            </w:r>
-            <w:r>
-              <w:rPr>
-                <w:rFonts w:ascii="Helvetica" w:hAnsi="Helvetica" w:cs="Helvetica"/>
-                <w:color w:val="333333"/>
-                <w:sz w:val="21"/>
-                <w:szCs w:val="21"/>
-                <w:shd w:val="clear" w:color="auto" w:fill="FFFFFF"/>
-              </w:rPr>
-              <w:t>:1])</w:t>
+              <w:t>.</w:t>
             </w:r>
           </w:p>
           <w:p>
             <w:pPr>
               <w:rPr>
-                <w:rFonts w:ascii="Helvetica" w:hAnsi="Helvetica" w:cs="Helvetica"/>
+                <w:rFonts w:ascii="Helvetica" w:eastAsia="Times New Roman" w:hAnsi="Helvetica" w:cs="Helvetica"/>
                 <w:color w:val="333333"/>
                 <w:sz w:val="21"/>
                 <w:szCs w:val="21"/>
                 <w:shd w:val="clear" w:color="auto" w:fill="FFFFFF"/>
               </w:rPr>
             </w:pPr>
-            <w:r>
-              <w:rPr>
-                <w:rFonts w:ascii="Helvetica" w:hAnsi="Helvetica" w:cs="Helvetica"/>
-                <w:color w:val="333333"/>
-                <w:sz w:val="21"/>
-                <w:szCs w:val="21"/>
-                <w:shd w:val="clear" w:color="auto" w:fill="FFFFFF"/>
-              </w:rPr>
-              <w:t xml:space="preserve">Note: for our implementation, </w:t>
-            </w:r>
-            <w:proofErr w:type="spellStart"/>
-            <w:r>
-              <w:rPr>
-                <w:rFonts w:ascii="Helvetica" w:hAnsi="Helvetica" w:cs="Helvetica"/>
-                <w:color w:val="333333"/>
-                <w:sz w:val="21"/>
-                <w:szCs w:val="21"/>
-                <w:shd w:val="clear" w:color="auto" w:fill="FFFFFF"/>
-              </w:rPr>
-              <w:t>imm</w:t>
-            </w:r>
-            <w:proofErr w:type="spellEnd"/>
-            <w:r>
-              <w:rPr>
-                <w:rFonts w:ascii="Helvetica" w:hAnsi="Helvetica" w:cs="Helvetica"/>
-                <w:color w:val="333333"/>
-                <w:sz w:val="21"/>
-                <w:szCs w:val="21"/>
-                <w:shd w:val="clear" w:color="auto" w:fill="FFFFFF"/>
-              </w:rPr>
-              <w:t>[</w:t>
-            </w:r>
-            <w:r>
-              <w:rPr>
-                <w:rFonts w:ascii="Helvetica" w:hAnsi="Helvetica" w:cs="Helvetica"/>
-                <w:color w:val="333333"/>
-                <w:sz w:val="21"/>
-                <w:szCs w:val="21"/>
-                <w:shd w:val="clear" w:color="auto" w:fill="FFFFFF"/>
-              </w:rPr>
-              <w:t>11</w:t>
-            </w:r>
-            <w:r>
-              <w:rPr>
-                <w:rFonts w:ascii="Helvetica" w:hAnsi="Helvetica" w:cs="Helvetica"/>
-                <w:color w:val="333333"/>
-                <w:sz w:val="21"/>
-                <w:szCs w:val="21"/>
-                <w:shd w:val="clear" w:color="auto" w:fill="FFFFFF"/>
-              </w:rPr>
-              <w:t>:1]</w:t>
-            </w:r>
-            <w:r>
-              <w:rPr>
-                <w:rFonts w:ascii="Helvetica" w:hAnsi="Helvetica" w:cs="Helvetica"/>
-                <w:color w:val="333333"/>
-                <w:sz w:val="21"/>
-                <w:szCs w:val="21"/>
-                <w:shd w:val="clear" w:color="auto" w:fill="FFFFFF"/>
-              </w:rPr>
-              <w:t xml:space="preserve"> </w:t>
-            </w:r>
-            <w:r>
-              <w:rPr>
-                <w:rFonts w:ascii="Helvetica" w:hAnsi="Helvetica" w:cs="Helvetica"/>
-                <w:color w:val="333333"/>
-                <w:sz w:val="21"/>
-                <w:szCs w:val="21"/>
-                <w:shd w:val="clear" w:color="auto" w:fill="FFFFFF"/>
-              </w:rPr>
-              <w:t>points to a byte [not word or 16-bit]</w:t>
-            </w:r>
           </w:p>
           <w:p>
             <w:pPr>
@@ -5881,6 +5967,7 @@
                 <w:shd w:val="clear" w:color="auto" w:fill="FFFFFF"/>
               </w:rPr>
             </w:pPr>
+            <w:proofErr w:type="gramStart"/>
             <w:r>
               <w:rPr>
                 <w:rFonts w:ascii="Helvetica" w:hAnsi="Helvetica" w:cs="Helvetica"/>
@@ -5889,8 +5976,9 @@
                 <w:szCs w:val="21"/>
                 <w:shd w:val="clear" w:color="auto" w:fill="FFFFFF"/>
               </w:rPr>
-              <w:t xml:space="preserve">         Unused bit is due to shifting </w:t>
-            </w:r>
+              <w:t>So</w:t>
+            </w:r>
+            <w:proofErr w:type="gramEnd"/>
             <w:r>
               <w:rPr>
                 <w:rFonts w:ascii="Helvetica" w:hAnsi="Helvetica" w:cs="Helvetica"/>
@@ -5899,8 +5987,9 @@
                 <w:szCs w:val="21"/>
                 <w:shd w:val="clear" w:color="auto" w:fill="FFFFFF"/>
               </w:rPr>
-              <w:t>right</w:t>
-            </w:r>
+              <w:t xml:space="preserve"> the final PC = PC + 4 + (sign </w:t>
+            </w:r>
+            <w:proofErr w:type="gramStart"/>
             <w:r>
               <w:rPr>
                 <w:rFonts w:ascii="Helvetica" w:hAnsi="Helvetica" w:cs="Helvetica"/>
@@ -5909,12 +5998,190 @@
                 <w:szCs w:val="21"/>
                 <w:shd w:val="clear" w:color="auto" w:fill="FFFFFF"/>
               </w:rPr>
-              <w:t>, which drops least significant bit.</w:t>
+              <w:t>extend)(</w:t>
+            </w:r>
+            <w:proofErr w:type="spellStart"/>
+            <w:r>
+              <w:rPr>
+                <w:rFonts w:ascii="Helvetica" w:hAnsi="Helvetica" w:cs="Helvetica"/>
+                <w:color w:val="333333"/>
+                <w:sz w:val="21"/>
+                <w:szCs w:val="21"/>
+                <w:shd w:val="clear" w:color="auto" w:fill="FFFFFF"/>
+              </w:rPr>
+              <w:t>imm</w:t>
+            </w:r>
+            <w:proofErr w:type="spellEnd"/>
+            <w:r>
+              <w:rPr>
+                <w:rFonts w:ascii="Helvetica" w:hAnsi="Helvetica" w:cs="Helvetica"/>
+                <w:color w:val="333333"/>
+                <w:sz w:val="21"/>
+                <w:szCs w:val="21"/>
+                <w:shd w:val="clear" w:color="auto" w:fill="FFFFFF"/>
+              </w:rPr>
+              <w:t>[</w:t>
+            </w:r>
+            <w:proofErr w:type="gramEnd"/>
+            <w:r>
+              <w:rPr>
+                <w:rFonts w:ascii="Helvetica" w:hAnsi="Helvetica" w:cs="Helvetica"/>
+                <w:color w:val="333333"/>
+                <w:sz w:val="21"/>
+                <w:szCs w:val="21"/>
+                <w:shd w:val="clear" w:color="auto" w:fill="FFFFFF"/>
+              </w:rPr>
+              <w:t>1</w:t>
+            </w:r>
+            <w:r>
+              <w:rPr>
+                <w:rFonts w:ascii="Helvetica" w:hAnsi="Helvetica" w:cs="Helvetica"/>
+                <w:color w:val="333333"/>
+                <w:sz w:val="21"/>
+                <w:szCs w:val="21"/>
+                <w:shd w:val="clear" w:color="auto" w:fill="FFFFFF"/>
+              </w:rPr>
+              <w:t>1</w:t>
+            </w:r>
+            <w:r>
+              <w:rPr>
+                <w:rFonts w:ascii="Helvetica" w:hAnsi="Helvetica" w:cs="Helvetica"/>
+                <w:color w:val="333333"/>
+                <w:sz w:val="21"/>
+                <w:szCs w:val="21"/>
+                <w:shd w:val="clear" w:color="auto" w:fill="FFFFFF"/>
+              </w:rPr>
+              <w:t>:</w:t>
+            </w:r>
+            <w:r>
+              <w:rPr>
+                <w:rFonts w:ascii="Helvetica" w:hAnsi="Helvetica" w:cs="Helvetica"/>
+                <w:color w:val="333333"/>
+                <w:sz w:val="21"/>
+                <w:szCs w:val="21"/>
+                <w:shd w:val="clear" w:color="auto" w:fill="FFFFFF"/>
+              </w:rPr>
+              <w:t>0</w:t>
+            </w:r>
+            <w:r>
+              <w:rPr>
+                <w:rFonts w:ascii="Helvetica" w:hAnsi="Helvetica" w:cs="Helvetica"/>
+                <w:color w:val="333333"/>
+                <w:sz w:val="21"/>
+                <w:szCs w:val="21"/>
+                <w:shd w:val="clear" w:color="auto" w:fill="FFFFFF"/>
+              </w:rPr>
+              <w:t>])</w:t>
             </w:r>
           </w:p>
           <w:p>
             <w:pPr>
               <w:rPr>
+                <w:rFonts w:ascii="Helvetica" w:hAnsi="Helvetica" w:cs="Helvetica"/>
+                <w:color w:val="333333"/>
+                <w:sz w:val="21"/>
+                <w:szCs w:val="21"/>
+                <w:shd w:val="clear" w:color="auto" w:fill="FFFFFF"/>
+              </w:rPr>
+            </w:pPr>
+            <w:r>
+              <w:rPr>
+                <w:rFonts w:ascii="Helvetica" w:hAnsi="Helvetica" w:cs="Helvetica"/>
+                <w:color w:val="333333"/>
+                <w:sz w:val="21"/>
+                <w:szCs w:val="21"/>
+                <w:shd w:val="clear" w:color="auto" w:fill="FFFFFF"/>
+              </w:rPr>
+              <w:t xml:space="preserve">Note: for our implementation, </w:t>
+            </w:r>
+            <w:proofErr w:type="spellStart"/>
+            <w:proofErr w:type="gramStart"/>
+            <w:r>
+              <w:rPr>
+                <w:rFonts w:ascii="Helvetica" w:hAnsi="Helvetica" w:cs="Helvetica"/>
+                <w:color w:val="333333"/>
+                <w:sz w:val="21"/>
+                <w:szCs w:val="21"/>
+                <w:shd w:val="clear" w:color="auto" w:fill="FFFFFF"/>
+              </w:rPr>
+              <w:t>imm</w:t>
+            </w:r>
+            <w:proofErr w:type="spellEnd"/>
+            <w:r>
+              <w:rPr>
+                <w:rFonts w:ascii="Helvetica" w:hAnsi="Helvetica" w:cs="Helvetica"/>
+                <w:color w:val="333333"/>
+                <w:sz w:val="21"/>
+                <w:szCs w:val="21"/>
+                <w:shd w:val="clear" w:color="auto" w:fill="FFFFFF"/>
+              </w:rPr>
+              <w:t>[</w:t>
+            </w:r>
+            <w:proofErr w:type="gramEnd"/>
+            <w:r>
+              <w:rPr>
+                <w:rFonts w:ascii="Helvetica" w:hAnsi="Helvetica" w:cs="Helvetica"/>
+                <w:color w:val="333333"/>
+                <w:sz w:val="21"/>
+                <w:szCs w:val="21"/>
+                <w:shd w:val="clear" w:color="auto" w:fill="FFFFFF"/>
+              </w:rPr>
+              <w:t>11</w:t>
+            </w:r>
+            <w:r>
+              <w:rPr>
+                <w:rFonts w:ascii="Helvetica" w:hAnsi="Helvetica" w:cs="Helvetica"/>
+                <w:color w:val="333333"/>
+                <w:sz w:val="21"/>
+                <w:szCs w:val="21"/>
+                <w:shd w:val="clear" w:color="auto" w:fill="FFFFFF"/>
+              </w:rPr>
+              <w:t>:</w:t>
+            </w:r>
+            <w:r>
+              <w:rPr>
+                <w:rFonts w:ascii="Helvetica" w:hAnsi="Helvetica" w:cs="Helvetica"/>
+                <w:color w:val="333333"/>
+                <w:sz w:val="21"/>
+                <w:szCs w:val="21"/>
+                <w:shd w:val="clear" w:color="auto" w:fill="FFFFFF"/>
+              </w:rPr>
+              <w:t>0</w:t>
+            </w:r>
+            <w:r>
+              <w:rPr>
+                <w:rFonts w:ascii="Helvetica" w:hAnsi="Helvetica" w:cs="Helvetica"/>
+                <w:color w:val="333333"/>
+                <w:sz w:val="21"/>
+                <w:szCs w:val="21"/>
+                <w:shd w:val="clear" w:color="auto" w:fill="FFFFFF"/>
+              </w:rPr>
+              <w:t>]</w:t>
+            </w:r>
+            <w:r>
+              <w:rPr>
+                <w:rFonts w:ascii="Helvetica" w:hAnsi="Helvetica" w:cs="Helvetica"/>
+                <w:color w:val="333333"/>
+                <w:sz w:val="21"/>
+                <w:szCs w:val="21"/>
+                <w:shd w:val="clear" w:color="auto" w:fill="FFFFFF"/>
+              </w:rPr>
+              <w:t xml:space="preserve"> </w:t>
+            </w:r>
+            <w:r>
+              <w:rPr>
+                <w:rFonts w:ascii="Helvetica" w:hAnsi="Helvetica" w:cs="Helvetica"/>
+                <w:color w:val="333333"/>
+                <w:sz w:val="21"/>
+                <w:szCs w:val="21"/>
+                <w:shd w:val="clear" w:color="auto" w:fill="FFFFFF"/>
+              </w:rPr>
+              <w:t>points to a byte [not word or 16-bit]</w:t>
+            </w:r>
+          </w:p>
+          <w:p>
+            <w:pPr>
+              <w:rPr>
                 <w:rFonts w:ascii="Helvetica" w:eastAsia="Times New Roman" w:hAnsi="Helvetica" w:cs="Helvetica"/>
                 <w:color w:val="333333"/>
                 <w:sz w:val="21"/>
@@ -5923,6 +6190,16 @@
                 <w:shd w:val="clear" w:color="auto" w:fill="FFFFFF"/>
               </w:rPr>
             </w:pPr>
+            <w:r>
+              <w:rPr>
+                <w:rFonts w:ascii="Helvetica" w:hAnsi="Helvetica" w:cs="Helvetica"/>
+                <w:color w:val="333333"/>
+                <w:sz w:val="21"/>
+                <w:szCs w:val="21"/>
+                <w:shd w:val="clear" w:color="auto" w:fill="FFFFFF"/>
+              </w:rPr>
+              <w:t xml:space="preserve">      </w:t>
+            </w:r>
           </w:p>
         </w:tc>
       </w:tr>
@@ -6124,8 +6401,20 @@
                 <w:szCs w:val="21"/>
                 <w:shd w:val="clear" w:color="auto" w:fill="FFFFFF"/>
               </w:rPr>
-              <w:t xml:space="preserve"> where</w:t>
-            </w:r>
+              <w:t xml:space="preserve"> </w:t>
+            </w:r>
+            <w:proofErr w:type="gramStart"/>
+            <w:r>
+              <w:rPr>
+                <w:rFonts w:ascii="Helvetica" w:eastAsia="Times New Roman" w:hAnsi="Helvetica" w:cs="Helvetica"/>
+                <w:color w:val="333333"/>
+                <w:sz w:val="21"/>
+                <w:szCs w:val="21"/>
+                <w:shd w:val="clear" w:color="auto" w:fill="FFFFFF"/>
+              </w:rPr>
+              <w:t>where</w:t>
+            </w:r>
+            <w:proofErr w:type="gramEnd"/>
           </w:p>
           <w:p>
             <w:pPr>
@@ -6270,6 +6559,7 @@
               <w:t xml:space="preserve">, </w:t>
             </w:r>
             <w:proofErr w:type="spellStart"/>
+            <w:proofErr w:type="gramStart"/>
             <w:r>
               <w:rPr>
                 <w:rFonts w:ascii="Helvetica" w:eastAsia="Times New Roman" w:hAnsi="Helvetica" w:cs="Helvetica"/>
@@ -6293,7 +6583,20 @@
                 <w:szCs w:val="21"/>
                 <w:shd w:val="clear" w:color="auto" w:fill="FFFFFF"/>
               </w:rPr>
-              <w:t xml:space="preserve">  # jump to PC = PC + 4 +</w:t>
+              <w:t xml:space="preserve">  #</w:t>
+            </w:r>
+            <w:proofErr w:type="gramEnd"/>
+            <w:r>
+              <w:rPr>
+                <w:rFonts w:ascii="Helvetica" w:eastAsia="Times New Roman" w:hAnsi="Helvetica" w:cs="Helvetica"/>
+                <w:i/>
+                <w:iCs/>
+                <w:color w:val="333333"/>
+                <w:sz w:val="21"/>
+                <w:szCs w:val="21"/>
+                <w:shd w:val="clear" w:color="auto" w:fill="FFFFFF"/>
+              </w:rPr>
+              <w:t xml:space="preserve"> jump to PC = PC + 4 +</w:t>
             </w:r>
             <w:r>
               <w:rPr>
@@ -6497,8 +6800,9 @@
                 <w:szCs w:val="21"/>
                 <w:shd w:val="clear" w:color="auto" w:fill="FFFFFF"/>
               </w:rPr>
-              <w:t xml:space="preserve">        #  </w:t>
-            </w:r>
+              <w:t xml:space="preserve">        </w:t>
+            </w:r>
+            <w:proofErr w:type="gramStart"/>
             <w:r>
               <w:rPr>
                 <w:rFonts w:ascii="Helvetica" w:eastAsia="Times New Roman" w:hAnsi="Helvetica" w:cs="Helvetica"/>
@@ -6509,7 +6813,32 @@
                 <w:szCs w:val="21"/>
                 <w:shd w:val="clear" w:color="auto" w:fill="FFFFFF"/>
               </w:rPr>
-              <w:t xml:space="preserve">PC = PC + 4 + </w:t>
+              <w:t xml:space="preserve">#  </w:t>
+            </w:r>
+            <w:r>
+              <w:rPr>
+                <w:rFonts w:ascii="Helvetica" w:eastAsia="Times New Roman" w:hAnsi="Helvetica" w:cs="Helvetica"/>
+                <w:i/>
+                <w:iCs/>
+                <w:color w:val="333333"/>
+                <w:sz w:val="21"/>
+                <w:szCs w:val="21"/>
+                <w:shd w:val="clear" w:color="auto" w:fill="FFFFFF"/>
+              </w:rPr>
+              <w:t>PC</w:t>
+            </w:r>
+            <w:proofErr w:type="gramEnd"/>
+            <w:r>
+              <w:rPr>
+                <w:rFonts w:ascii="Helvetica" w:eastAsia="Times New Roman" w:hAnsi="Helvetica" w:cs="Helvetica"/>
+                <w:i/>
+                <w:iCs/>
+                <w:color w:val="333333"/>
+                <w:sz w:val="21"/>
+                <w:szCs w:val="21"/>
+                <w:shd w:val="clear" w:color="auto" w:fill="FFFFFF"/>
+              </w:rPr>
+              <w:t xml:space="preserve"> = PC + 4 + </w:t>
             </w:r>
             <w:proofErr w:type="spellStart"/>
             <w:r>
@@ -6643,6 +6972,7 @@
               <w:t xml:space="preserve">    “&lt;</w:t>
             </w:r>
             <w:proofErr w:type="spellStart"/>
+            <w:proofErr w:type="gramStart"/>
             <w:r>
               <w:rPr>
                 <w:rFonts w:ascii="Helvetica" w:eastAsia="Times New Roman" w:hAnsi="Helvetica" w:cs="Helvetica"/>
@@ -6662,7 +6992,28 @@
                 <w:szCs w:val="21"/>
                 <w:shd w:val="clear" w:color="auto" w:fill="FFFFFF"/>
               </w:rPr>
-              <w:t>[20]</w:t>
+              <w:t>[</w:t>
+            </w:r>
+            <w:proofErr w:type="gramEnd"/>
+            <w:r>
+              <w:rPr>
+                <w:rFonts w:ascii="Helvetica" w:eastAsia="Times New Roman" w:hAnsi="Helvetica" w:cs="Helvetica"/>
+                <w:color w:val="333333"/>
+                <w:sz w:val="21"/>
+                <w:szCs w:val="21"/>
+                <w:shd w:val="clear" w:color="auto" w:fill="FFFFFF"/>
+              </w:rPr>
+              <w:t>19</w:t>
+            </w:r>
+            <w:r>
+              <w:rPr>
+                <w:rFonts w:ascii="Helvetica" w:eastAsia="Times New Roman" w:hAnsi="Helvetica" w:cs="Helvetica"/>
+                <w:color w:val="333333"/>
+                <w:sz w:val="21"/>
+                <w:szCs w:val="21"/>
+                <w:shd w:val="clear" w:color="auto" w:fill="FFFFFF"/>
+              </w:rPr>
+              <w:t>]</w:t>
             </w:r>
             <w:r>
               <w:rPr>
@@ -6685,6 +7036,7 @@
               <w:t>&lt;</w:t>
             </w:r>
             <w:proofErr w:type="spellStart"/>
+            <w:proofErr w:type="gramStart"/>
             <w:r>
               <w:rPr>
                 <w:rFonts w:ascii="Helvetica" w:eastAsia="Times New Roman" w:hAnsi="Helvetica" w:cs="Helvetica"/>
@@ -6704,7 +7056,166 @@
                 <w:szCs w:val="21"/>
                 <w:shd w:val="clear" w:color="auto" w:fill="FFFFFF"/>
               </w:rPr>
-              <w:t>[10</w:t>
+              <w:t>[</w:t>
+            </w:r>
+            <w:proofErr w:type="gramEnd"/>
+            <w:r>
+              <w:rPr>
+                <w:rFonts w:ascii="Helvetica" w:eastAsia="Times New Roman" w:hAnsi="Helvetica" w:cs="Helvetica"/>
+                <w:color w:val="333333"/>
+                <w:sz w:val="21"/>
+                <w:szCs w:val="21"/>
+                <w:shd w:val="clear" w:color="auto" w:fill="FFFFFF"/>
+              </w:rPr>
+              <w:t>9</w:t>
+            </w:r>
+            <w:r>
+              <w:rPr>
+                <w:rFonts w:ascii="Helvetica" w:eastAsia="Times New Roman" w:hAnsi="Helvetica" w:cs="Helvetica"/>
+                <w:color w:val="333333"/>
+                <w:sz w:val="21"/>
+                <w:szCs w:val="21"/>
+                <w:shd w:val="clear" w:color="auto" w:fill="FFFFFF"/>
+              </w:rPr>
+              <w:t>:</w:t>
+            </w:r>
+            <w:r>
+              <w:rPr>
+                <w:rFonts w:ascii="Helvetica" w:eastAsia="Times New Roman" w:hAnsi="Helvetica" w:cs="Helvetica"/>
+                <w:color w:val="333333"/>
+                <w:sz w:val="21"/>
+                <w:szCs w:val="21"/>
+                <w:shd w:val="clear" w:color="auto" w:fill="FFFFFF"/>
+              </w:rPr>
+              <w:t>0</w:t>
+            </w:r>
+            <w:r>
+              <w:rPr>
+                <w:rFonts w:ascii="Helvetica" w:eastAsia="Times New Roman" w:hAnsi="Helvetica" w:cs="Helvetica"/>
+                <w:color w:val="333333"/>
+                <w:sz w:val="21"/>
+                <w:szCs w:val="21"/>
+                <w:shd w:val="clear" w:color="auto" w:fill="FFFFFF"/>
+              </w:rPr>
+              <w:t xml:space="preserve">]&gt; </w:t>
+            </w:r>
+            <w:r>
+              <w:rPr>
+                <w:rFonts w:ascii="Helvetica" w:eastAsia="Times New Roman" w:hAnsi="Helvetica" w:cs="Helvetica"/>
+                <w:color w:val="333333"/>
+                <w:sz w:val="21"/>
+                <w:szCs w:val="21"/>
+                <w:shd w:val="clear" w:color="auto" w:fill="FFFFFF"/>
+              </w:rPr>
+              <w:t>&lt;</w:t>
+            </w:r>
+            <w:proofErr w:type="spellStart"/>
+            <w:proofErr w:type="gramStart"/>
+            <w:r>
+              <w:rPr>
+                <w:rFonts w:ascii="Helvetica" w:eastAsia="Times New Roman" w:hAnsi="Helvetica" w:cs="Helvetica"/>
+                <w:color w:val="333333"/>
+                <w:sz w:val="21"/>
+                <w:szCs w:val="21"/>
+                <w:shd w:val="clear" w:color="auto" w:fill="FFFFFF"/>
+              </w:rPr>
+              <w:t>imm</w:t>
+            </w:r>
+            <w:proofErr w:type="spellEnd"/>
+            <w:r>
+              <w:rPr>
+                <w:rFonts w:ascii="Helvetica" w:eastAsia="Times New Roman" w:hAnsi="Helvetica" w:cs="Helvetica"/>
+                <w:color w:val="333333"/>
+                <w:sz w:val="21"/>
+                <w:szCs w:val="21"/>
+                <w:shd w:val="clear" w:color="auto" w:fill="FFFFFF"/>
+              </w:rPr>
+              <w:t>[</w:t>
+            </w:r>
+            <w:proofErr w:type="gramEnd"/>
+            <w:r>
+              <w:rPr>
+                <w:rFonts w:ascii="Helvetica" w:eastAsia="Times New Roman" w:hAnsi="Helvetica" w:cs="Helvetica"/>
+                <w:color w:val="333333"/>
+                <w:sz w:val="21"/>
+                <w:szCs w:val="21"/>
+                <w:shd w:val="clear" w:color="auto" w:fill="FFFFFF"/>
+              </w:rPr>
+              <w:t>1</w:t>
+            </w:r>
+            <w:r>
+              <w:rPr>
+                <w:rFonts w:ascii="Helvetica" w:eastAsia="Times New Roman" w:hAnsi="Helvetica" w:cs="Helvetica"/>
+                <w:color w:val="333333"/>
+                <w:sz w:val="21"/>
+                <w:szCs w:val="21"/>
+                <w:shd w:val="clear" w:color="auto" w:fill="FFFFFF"/>
+              </w:rPr>
+              <w:t>0</w:t>
+            </w:r>
+            <w:r>
+              <w:rPr>
+                <w:rFonts w:ascii="Helvetica" w:eastAsia="Times New Roman" w:hAnsi="Helvetica" w:cs="Helvetica"/>
+                <w:color w:val="333333"/>
+                <w:sz w:val="21"/>
+                <w:szCs w:val="21"/>
+                <w:shd w:val="clear" w:color="auto" w:fill="FFFFFF"/>
+              </w:rPr>
+              <w:t>]&gt;</w:t>
+            </w:r>
+            <w:r>
+              <w:rPr>
+                <w:rFonts w:ascii="Helvetica" w:eastAsia="Times New Roman" w:hAnsi="Helvetica" w:cs="Helvetica"/>
+                <w:color w:val="333333"/>
+                <w:sz w:val="21"/>
+                <w:szCs w:val="21"/>
+                <w:shd w:val="clear" w:color="auto" w:fill="FFFFFF"/>
+              </w:rPr>
+              <w:t xml:space="preserve"> &lt;</w:t>
+            </w:r>
+            <w:proofErr w:type="spellStart"/>
+            <w:proofErr w:type="gramStart"/>
+            <w:r>
+              <w:rPr>
+                <w:rFonts w:ascii="Helvetica" w:eastAsia="Times New Roman" w:hAnsi="Helvetica" w:cs="Helvetica"/>
+                <w:color w:val="333333"/>
+                <w:sz w:val="21"/>
+                <w:szCs w:val="21"/>
+                <w:shd w:val="clear" w:color="auto" w:fill="FFFFFF"/>
+              </w:rPr>
+              <w:t>imm</w:t>
+            </w:r>
+            <w:proofErr w:type="spellEnd"/>
+            <w:r>
+              <w:rPr>
+                <w:rFonts w:ascii="Helvetica" w:eastAsia="Times New Roman" w:hAnsi="Helvetica" w:cs="Helvetica"/>
+                <w:color w:val="333333"/>
+                <w:sz w:val="21"/>
+                <w:szCs w:val="21"/>
+                <w:shd w:val="clear" w:color="auto" w:fill="FFFFFF"/>
+              </w:rPr>
+              <w:t>[</w:t>
+            </w:r>
+            <w:proofErr w:type="gramEnd"/>
+            <w:r>
+              <w:rPr>
+                <w:rFonts w:ascii="Helvetica" w:eastAsia="Times New Roman" w:hAnsi="Helvetica" w:cs="Helvetica"/>
+                <w:color w:val="333333"/>
+                <w:sz w:val="21"/>
+                <w:szCs w:val="21"/>
+                <w:shd w:val="clear" w:color="auto" w:fill="FFFFFF"/>
+              </w:rPr>
+              <w:t>1</w:t>
+            </w:r>
+            <w:r>
+              <w:rPr>
+                <w:rFonts w:ascii="Helvetica" w:eastAsia="Times New Roman" w:hAnsi="Helvetica" w:cs="Helvetica"/>
+                <w:color w:val="333333"/>
+                <w:sz w:val="21"/>
+                <w:szCs w:val="21"/>
+                <w:shd w:val="clear" w:color="auto" w:fill="FFFFFF"/>
+              </w:rPr>
+              <w:t>8</w:t>
             </w:r>
             <w:r>
               <w:rPr>
@@ -6724,17 +7235,27 @@
                 <w:szCs w:val="21"/>
                 <w:shd w:val="clear" w:color="auto" w:fill="FFFFFF"/>
               </w:rPr>
-              <w:t xml:space="preserve">]&gt; </w:t>
-            </w:r>
-            <w:r>
-              <w:rPr>
-                <w:rFonts w:ascii="Helvetica" w:eastAsia="Times New Roman" w:hAnsi="Helvetica" w:cs="Helvetica"/>
-                <w:color w:val="333333"/>
-                <w:sz w:val="21"/>
-                <w:szCs w:val="21"/>
-                <w:shd w:val="clear" w:color="auto" w:fill="FFFFFF"/>
-              </w:rPr>
-              <w:t>&lt;</w:t>
+              <w:t>1</w:t>
+            </w:r>
+            <w:r>
+              <w:rPr>
+                <w:rFonts w:ascii="Helvetica" w:eastAsia="Times New Roman" w:hAnsi="Helvetica" w:cs="Helvetica"/>
+                <w:color w:val="333333"/>
+                <w:sz w:val="21"/>
+                <w:szCs w:val="21"/>
+                <w:shd w:val="clear" w:color="auto" w:fill="FFFFFF"/>
+              </w:rPr>
+              <w:t>]&gt;</w:t>
+            </w:r>
+            <w:r>
+              <w:rPr>
+                <w:rFonts w:ascii="Helvetica" w:eastAsia="Times New Roman" w:hAnsi="Helvetica" w:cs="Helvetica"/>
+                <w:color w:val="333333"/>
+                <w:sz w:val="21"/>
+                <w:szCs w:val="21"/>
+                <w:shd w:val="clear" w:color="auto" w:fill="FFFFFF"/>
+              </w:rPr>
+              <w:t xml:space="preserve">&lt;5-bit </w:t>
             </w:r>
             <w:proofErr w:type="spellStart"/>
             <w:r>
@@ -6745,7 +7266,7 @@
                 <w:szCs w:val="21"/>
                 <w:shd w:val="clear" w:color="auto" w:fill="FFFFFF"/>
               </w:rPr>
-              <w:t>imm</w:t>
+              <w:t>rd</w:t>
             </w:r>
             <w:proofErr w:type="spellEnd"/>
             <w:r>
@@ -6756,49 +7277,7 @@
                 <w:szCs w:val="21"/>
                 <w:shd w:val="clear" w:color="auto" w:fill="FFFFFF"/>
               </w:rPr>
-              <w:t>[11]&gt;</w:t>
-            </w:r>
-            <w:r>
-              <w:rPr>
-                <w:rFonts w:ascii="Helvetica" w:eastAsia="Times New Roman" w:hAnsi="Helvetica" w:cs="Helvetica"/>
-                <w:color w:val="333333"/>
-                <w:sz w:val="21"/>
-                <w:szCs w:val="21"/>
-                <w:shd w:val="clear" w:color="auto" w:fill="FFFFFF"/>
-              </w:rPr>
-              <w:t xml:space="preserve"> &lt;</w:t>
-            </w:r>
-            <w:proofErr w:type="spellStart"/>
-            <w:r>
-              <w:rPr>
-                <w:rFonts w:ascii="Helvetica" w:eastAsia="Times New Roman" w:hAnsi="Helvetica" w:cs="Helvetica"/>
-                <w:color w:val="333333"/>
-                <w:sz w:val="21"/>
-                <w:szCs w:val="21"/>
-                <w:shd w:val="clear" w:color="auto" w:fill="FFFFFF"/>
-              </w:rPr>
-              <w:t>imm</w:t>
-            </w:r>
-            <w:proofErr w:type="spellEnd"/>
-            <w:r>
-              <w:rPr>
-                <w:rFonts w:ascii="Helvetica" w:eastAsia="Times New Roman" w:hAnsi="Helvetica" w:cs="Helvetica"/>
-                <w:color w:val="333333"/>
-                <w:sz w:val="21"/>
-                <w:szCs w:val="21"/>
-                <w:shd w:val="clear" w:color="auto" w:fill="FFFFFF"/>
-              </w:rPr>
-              <w:t>[19:12]&gt;</w:t>
-            </w:r>
-            <w:r>
-              <w:rPr>
-                <w:rFonts w:ascii="Helvetica" w:eastAsia="Times New Roman" w:hAnsi="Helvetica" w:cs="Helvetica"/>
-                <w:color w:val="333333"/>
-                <w:sz w:val="21"/>
-                <w:szCs w:val="21"/>
-                <w:shd w:val="clear" w:color="auto" w:fill="FFFFFF"/>
-              </w:rPr>
-              <w:t>&lt;5-bit rd&gt;</w:t>
+              <w:t>&gt;</w:t>
             </w:r>
             <w:r>
               <w:t xml:space="preserve"> </w:t>
@@ -6938,6 +7417,7 @@
                 <w:shd w:val="clear" w:color="auto" w:fill="FFFFFF"/>
               </w:rPr>
             </w:pPr>
+            <w:proofErr w:type="gramStart"/>
             <w:r>
               <w:rPr>
                 <w:rFonts w:ascii="Helvetica" w:hAnsi="Helvetica" w:cs="Helvetica"/>
@@ -6946,7 +7426,29 @@
                 <w:szCs w:val="21"/>
                 <w:shd w:val="clear" w:color="auto" w:fill="FFFFFF"/>
               </w:rPr>
-              <w:t>So the final PC = PC + 4 + (sign extend)(</w:t>
+              <w:t>So</w:t>
+            </w:r>
+            <w:proofErr w:type="gramEnd"/>
+            <w:r>
+              <w:rPr>
+                <w:rFonts w:ascii="Helvetica" w:hAnsi="Helvetica" w:cs="Helvetica"/>
+                <w:color w:val="333333"/>
+                <w:sz w:val="21"/>
+                <w:szCs w:val="21"/>
+                <w:shd w:val="clear" w:color="auto" w:fill="FFFFFF"/>
+              </w:rPr>
+              <w:t xml:space="preserve"> the final PC = PC + 4 + (sign </w:t>
+            </w:r>
+            <w:proofErr w:type="gramStart"/>
+            <w:r>
+              <w:rPr>
+                <w:rFonts w:ascii="Helvetica" w:hAnsi="Helvetica" w:cs="Helvetica"/>
+                <w:color w:val="333333"/>
+                <w:sz w:val="21"/>
+                <w:szCs w:val="21"/>
+                <w:shd w:val="clear" w:color="auto" w:fill="FFFFFF"/>
+              </w:rPr>
+              <w:t>extend)(</w:t>
             </w:r>
             <w:proofErr w:type="spellStart"/>
             <w:r>
@@ -6968,7 +7470,48 @@
                 <w:szCs w:val="21"/>
                 <w:shd w:val="clear" w:color="auto" w:fill="FFFFFF"/>
               </w:rPr>
-              <w:t>[20:1])</w:t>
+              <w:t>[</w:t>
+            </w:r>
+            <w:proofErr w:type="gramEnd"/>
+            <w:r>
+              <w:rPr>
+                <w:rFonts w:ascii="Helvetica" w:hAnsi="Helvetica" w:cs="Helvetica"/>
+                <w:color w:val="333333"/>
+                <w:sz w:val="21"/>
+                <w:szCs w:val="21"/>
+                <w:shd w:val="clear" w:color="auto" w:fill="FFFFFF"/>
+              </w:rPr>
+              <w:t>19</w:t>
+            </w:r>
+            <w:r>
+              <w:rPr>
+                <w:rFonts w:ascii="Helvetica" w:hAnsi="Helvetica" w:cs="Helvetica"/>
+                <w:color w:val="333333"/>
+                <w:sz w:val="21"/>
+                <w:szCs w:val="21"/>
+                <w:shd w:val="clear" w:color="auto" w:fill="FFFFFF"/>
+              </w:rPr>
+              <w:t>:</w:t>
+            </w:r>
+            <w:r>
+              <w:rPr>
+                <w:rFonts w:ascii="Helvetica" w:hAnsi="Helvetica" w:cs="Helvetica"/>
+                <w:color w:val="333333"/>
+                <w:sz w:val="21"/>
+                <w:szCs w:val="21"/>
+                <w:shd w:val="clear" w:color="auto" w:fill="FFFFFF"/>
+              </w:rPr>
+              <w:t>0</w:t>
+            </w:r>
+            <w:r>
+              <w:rPr>
+                <w:rFonts w:ascii="Helvetica" w:hAnsi="Helvetica" w:cs="Helvetica"/>
+                <w:color w:val="333333"/>
+                <w:sz w:val="21"/>
+                <w:szCs w:val="21"/>
+                <w:shd w:val="clear" w:color="auto" w:fill="FFFFFF"/>
+              </w:rPr>
+              <w:t>])</w:t>
             </w:r>
           </w:p>
           <w:p>
@@ -6992,6 +7535,7 @@
               <w:t xml:space="preserve">Note: for our implementation, </w:t>
             </w:r>
             <w:proofErr w:type="spellStart"/>
+            <w:proofErr w:type="gramStart"/>
             <w:r>
               <w:rPr>
                 <w:rFonts w:ascii="Helvetica" w:hAnsi="Helvetica" w:cs="Helvetica"/>
@@ -7011,7 +7555,28 @@
                 <w:szCs w:val="21"/>
                 <w:shd w:val="clear" w:color="auto" w:fill="FFFFFF"/>
               </w:rPr>
-              <w:t>[20:1] points to a byte</w:t>
+              <w:t>[</w:t>
+            </w:r>
+            <w:proofErr w:type="gramEnd"/>
+            <w:r>
+              <w:rPr>
+                <w:rFonts w:ascii="Helvetica" w:hAnsi="Helvetica" w:cs="Helvetica"/>
+                <w:color w:val="333333"/>
+                <w:sz w:val="21"/>
+                <w:szCs w:val="21"/>
+                <w:shd w:val="clear" w:color="auto" w:fill="FFFFFF"/>
+              </w:rPr>
+              <w:t>19:0</w:t>
+            </w:r>
+            <w:r>
+              <w:rPr>
+                <w:rFonts w:ascii="Helvetica" w:hAnsi="Helvetica" w:cs="Helvetica"/>
+                <w:color w:val="333333"/>
+                <w:sz w:val="21"/>
+                <w:szCs w:val="21"/>
+                <w:shd w:val="clear" w:color="auto" w:fill="FFFFFF"/>
+              </w:rPr>
+              <w:t>] points to a byte</w:t>
             </w:r>
             <w:r>
               <w:rPr>
@@ -7117,8 +7682,20 @@
                 <w:szCs w:val="21"/>
                 <w:shd w:val="clear" w:color="auto" w:fill="FFFFFF"/>
               </w:rPr>
-              <w:t xml:space="preserve"> where</w:t>
-            </w:r>
+              <w:t xml:space="preserve"> </w:t>
+            </w:r>
+            <w:proofErr w:type="gramStart"/>
+            <w:r>
+              <w:rPr>
+                <w:rFonts w:ascii="Helvetica" w:eastAsia="Times New Roman" w:hAnsi="Helvetica" w:cs="Helvetica"/>
+                <w:color w:val="333333"/>
+                <w:sz w:val="21"/>
+                <w:szCs w:val="21"/>
+                <w:shd w:val="clear" w:color="auto" w:fill="FFFFFF"/>
+              </w:rPr>
+              <w:t>where</w:t>
+            </w:r>
+            <w:proofErr w:type="gramEnd"/>
           </w:p>
           <w:p>
             <w:pPr>
@@ -7611,6 +8188,17 @@
               </w:rPr>
               <w:t>&lt;7-bit opcode&gt;”</w:t>
             </w:r>
+          </w:p>
+          <w:p>
+            <w:pPr>
+              <w:rPr>
+                <w:rFonts w:ascii="Helvetica" w:eastAsia="Times New Roman" w:hAnsi="Helvetica" w:cs="Helvetica"/>
+                <w:color w:val="333333"/>
+                <w:sz w:val="21"/>
+                <w:szCs w:val="21"/>
+                <w:shd w:val="clear" w:color="auto" w:fill="FFFFFF"/>
+              </w:rPr>
+            </w:pPr>
           </w:p>
           <w:p>
             <w:pPr>
@@ -7799,7 +8387,29 @@
                 <w:szCs w:val="21"/>
                 <w:shd w:val="clear" w:color="auto" w:fill="FFFFFF"/>
               </w:rPr>
-              <w:t xml:space="preserve"> Since we cannot have a load with a 32-bit immediate value, this pseudo-instruction is replace with two instructions</w:t>
+              <w:t xml:space="preserve"> Since we cannot have a load with a 32-bit immediate value, this pseudo-instruction is </w:t>
+            </w:r>
+            <w:proofErr w:type="gramStart"/>
+            <w:r>
+              <w:rPr>
+                <w:rFonts w:ascii="Helvetica" w:eastAsia="Times New Roman" w:hAnsi="Helvetica" w:cs="Helvetica"/>
+                <w:color w:val="333333"/>
+                <w:sz w:val="21"/>
+                <w:szCs w:val="21"/>
+                <w:shd w:val="clear" w:color="auto" w:fill="FFFFFF"/>
+              </w:rPr>
+              <w:t>replace</w:t>
+            </w:r>
+            <w:proofErr w:type="gramEnd"/>
+            <w:r>
+              <w:rPr>
+                <w:rFonts w:ascii="Helvetica" w:eastAsia="Times New Roman" w:hAnsi="Helvetica" w:cs="Helvetica"/>
+                <w:color w:val="333333"/>
+                <w:sz w:val="21"/>
+                <w:szCs w:val="21"/>
+                <w:shd w:val="clear" w:color="auto" w:fill="FFFFFF"/>
+              </w:rPr>
+              <w:t xml:space="preserve"> with two instructions</w:t>
             </w:r>
             <w:r>
               <w:rPr>
@@ -7894,7 +8504,33 @@
                 <w:szCs w:val="21"/>
                 <w:shd w:val="clear" w:color="auto" w:fill="FFFFFF"/>
               </w:rPr>
-              <w:t>, offset[31:12]</w:t>
+              <w:t xml:space="preserve">, </w:t>
+            </w:r>
+            <w:proofErr w:type="gramStart"/>
+            <w:r>
+              <w:rPr>
+                <w:rFonts w:ascii="Helvetica" w:eastAsia="Times New Roman" w:hAnsi="Helvetica" w:cs="Helvetica"/>
+                <w:i/>
+                <w:iCs/>
+                <w:color w:val="333333"/>
+                <w:sz w:val="21"/>
+                <w:szCs w:val="21"/>
+                <w:shd w:val="clear" w:color="auto" w:fill="FFFFFF"/>
+              </w:rPr>
+              <w:t>offset[</w:t>
+            </w:r>
+            <w:proofErr w:type="gramEnd"/>
+            <w:r>
+              <w:rPr>
+                <w:rFonts w:ascii="Helvetica" w:eastAsia="Times New Roman" w:hAnsi="Helvetica" w:cs="Helvetica"/>
+                <w:i/>
+                <w:iCs/>
+                <w:color w:val="333333"/>
+                <w:sz w:val="21"/>
+                <w:szCs w:val="21"/>
+                <w:shd w:val="clear" w:color="auto" w:fill="FFFFFF"/>
+              </w:rPr>
+              <w:t>31:12]</w:t>
             </w:r>
           </w:p>
           <w:p>
@@ -7922,6 +8558,7 @@
               <w:t xml:space="preserve">     </w:t>
             </w:r>
             <w:proofErr w:type="spellStart"/>
+            <w:proofErr w:type="gramStart"/>
             <w:r>
               <w:rPr>
                 <w:rFonts w:ascii="Helvetica" w:eastAsia="Times New Roman" w:hAnsi="Helvetica" w:cs="Helvetica"/>
@@ -7957,8 +8594,9 @@
                 <w:szCs w:val="21"/>
                 <w:shd w:val="clear" w:color="auto" w:fill="FFFFFF"/>
               </w:rPr>
-              <w:t>x5</w:t>
-            </w:r>
+              <w:t>x</w:t>
+            </w:r>
+            <w:proofErr w:type="gramEnd"/>
             <w:r>
               <w:rPr>
                 <w:rFonts w:ascii="Helvetica" w:eastAsia="Times New Roman" w:hAnsi="Helvetica" w:cs="Helvetica"/>
@@ -7969,7 +8607,7 @@
                 <w:szCs w:val="21"/>
                 <w:shd w:val="clear" w:color="auto" w:fill="FFFFFF"/>
               </w:rPr>
-              <w:t xml:space="preserve">, </w:t>
+              <w:t>5</w:t>
             </w:r>
             <w:r>
               <w:rPr>
@@ -7981,7 +8619,7 @@
                 <w:szCs w:val="21"/>
                 <w:shd w:val="clear" w:color="auto" w:fill="FFFFFF"/>
               </w:rPr>
-              <w:t>x5</w:t>
+              <w:t xml:space="preserve">, </w:t>
             </w:r>
             <w:r>
               <w:rPr>
@@ -7993,7 +8631,45 @@
                 <w:szCs w:val="21"/>
                 <w:shd w:val="clear" w:color="auto" w:fill="FFFFFF"/>
               </w:rPr>
-              <w:t>, offset[11:0</w:t>
+              <w:t>x5</w:t>
+            </w:r>
+            <w:r>
+              <w:rPr>
+                <w:rFonts w:ascii="Helvetica" w:eastAsia="Times New Roman" w:hAnsi="Helvetica" w:cs="Helvetica"/>
+                <w:i/>
+                <w:iCs/>
+                <w:color w:val="333333"/>
+                <w:sz w:val="21"/>
+                <w:szCs w:val="21"/>
+                <w:shd w:val="clear" w:color="auto" w:fill="FFFFFF"/>
+              </w:rPr>
+              <w:t xml:space="preserve">, </w:t>
+            </w:r>
+            <w:proofErr w:type="gramStart"/>
+            <w:r>
+              <w:rPr>
+                <w:rFonts w:ascii="Helvetica" w:eastAsia="Times New Roman" w:hAnsi="Helvetica" w:cs="Helvetica"/>
+                <w:i/>
+                <w:iCs/>
+                <w:color w:val="333333"/>
+                <w:sz w:val="21"/>
+                <w:szCs w:val="21"/>
+                <w:shd w:val="clear" w:color="auto" w:fill="FFFFFF"/>
+              </w:rPr>
+              <w:t>offset[</w:t>
+            </w:r>
+            <w:proofErr w:type="gramEnd"/>
+            <w:r>
+              <w:rPr>
+                <w:rFonts w:ascii="Helvetica" w:eastAsia="Times New Roman" w:hAnsi="Helvetica" w:cs="Helvetica"/>
+                <w:i/>
+                <w:iCs/>
+                <w:color w:val="333333"/>
+                <w:sz w:val="21"/>
+                <w:szCs w:val="21"/>
+                <w:shd w:val="clear" w:color="auto" w:fill="FFFFFF"/>
+              </w:rPr>
+              <w:t>11:0</w:t>
             </w:r>
             <w:r>
               <w:rPr>
@@ -8095,6 +8771,7 @@
               </w:rPr>
               <w:t>Format</w:t>
             </w:r>
+            <w:proofErr w:type="gramStart"/>
             <w:r>
               <w:rPr>
                 <w:rFonts w:ascii="Helvetica" w:eastAsia="Times New Roman" w:hAnsi="Helvetica" w:cs="Helvetica"/>
@@ -8115,6 +8792,7 @@
               </w:rPr>
               <w:t>“</w:t>
             </w:r>
+            <w:proofErr w:type="gramEnd"/>
             <w:r>
               <w:rPr>
                 <w:rFonts w:ascii="Helvetica" w:eastAsia="Times New Roman" w:hAnsi="Helvetica" w:cs="Helvetica"/>
@@ -8730,7 +9408,6 @@
           <w:sz w:val="37"/>
           <w:szCs w:val="37"/>
         </w:rPr>
-        <w:lastRenderedPageBreak/>
         <w:t>Tasks</w:t>
       </w:r>
     </w:p>
@@ -8961,9 +9638,21 @@
           <w:szCs w:val="21"/>
           <w:shd w:val="clear" w:color="auto" w:fill="FFFFFF"/>
         </w:rPr>
-        <w:t>alu_control.vhdl</w:t>
+        <w:t>alu_</w:t>
+      </w:r>
+      <w:proofErr w:type="gramStart"/>
+      <w:r>
+        <w:rPr>
+          <w:rFonts w:ascii="Helvetica" w:eastAsia="Times New Roman" w:hAnsi="Helvetica" w:cs="Helvetica"/>
+          <w:color w:val="333333"/>
+          <w:sz w:val="21"/>
+          <w:szCs w:val="21"/>
+          <w:shd w:val="clear" w:color="auto" w:fill="FFFFFF"/>
+        </w:rPr>
+        <w:t>control.vhdl</w:t>
       </w:r>
       <w:proofErr w:type="spellEnd"/>
+      <w:proofErr w:type="gramEnd"/>
       <w:r>
         <w:rPr>
           <w:rFonts w:ascii="Helvetica" w:eastAsia="Times New Roman" w:hAnsi="Helvetica" w:cs="Helvetica"/>
@@ -8975,6 +9664,7 @@
         <w:t xml:space="preserve"> and </w:t>
       </w:r>
       <w:proofErr w:type="spellStart"/>
+      <w:proofErr w:type="gramStart"/>
       <w:r>
         <w:rPr>
           <w:rFonts w:ascii="Helvetica" w:eastAsia="Times New Roman" w:hAnsi="Helvetica" w:cs="Helvetica"/>
@@ -8986,6 +9676,7 @@
         <w:t>alu.vhdl</w:t>
       </w:r>
       <w:proofErr w:type="spellEnd"/>
+      <w:proofErr w:type="gramEnd"/>
     </w:p>
     <w:p>
       <w:pPr>
@@ -9019,9 +9710,20 @@
           <w:sz w:val="21"/>
           <w:szCs w:val="21"/>
         </w:rPr>
-        <w:t>instru_mem.vhdl</w:t>
+        <w:t>instru_</w:t>
+      </w:r>
+      <w:proofErr w:type="gramStart"/>
+      <w:r>
+        <w:rPr>
+          <w:rFonts w:ascii="Helvetica" w:eastAsia="Times New Roman" w:hAnsi="Helvetica" w:cs="Helvetica"/>
+          <w:color w:val="333333"/>
+          <w:sz w:val="21"/>
+          <w:szCs w:val="21"/>
+        </w:rPr>
+        <w:t>mem.vhdl</w:t>
       </w:r>
       <w:proofErr w:type="spellEnd"/>
+      <w:proofErr w:type="gramEnd"/>
       <w:r>
         <w:rPr>
           <w:rFonts w:ascii="Helvetica" w:eastAsia="Times New Roman" w:hAnsi="Helvetica" w:cs="Helvetica"/>
@@ -9103,9 +9805,21 @@
           <w:szCs w:val="21"/>
           <w:shd w:val="clear" w:color="auto" w:fill="FFFFFF"/>
         </w:rPr>
-        <w:t>riscv_multicycle.vhdl</w:t>
+        <w:t>riscv_</w:t>
+      </w:r>
+      <w:proofErr w:type="gramStart"/>
+      <w:r>
+        <w:rPr>
+          <w:rFonts w:ascii="Helvetica" w:eastAsia="Times New Roman" w:hAnsi="Helvetica" w:cs="Helvetica"/>
+          <w:color w:val="333333"/>
+          <w:sz w:val="21"/>
+          <w:szCs w:val="21"/>
+          <w:shd w:val="clear" w:color="auto" w:fill="FFFFFF"/>
+        </w:rPr>
+        <w:t>multicycle.vhdl</w:t>
       </w:r>
       <w:proofErr w:type="spellEnd"/>
+      <w:proofErr w:type="gramEnd"/>
     </w:p>
     <w:p>
       <w:pPr>
@@ -9235,7 +9949,17 @@
           <w:sz w:val="21"/>
           <w:szCs w:val="21"/>
         </w:rPr>
-        <w:t>tb_riscv_multi</w:t>
+        <w:t>tb_riscv_</w:t>
+      </w:r>
+      <w:proofErr w:type="gramStart"/>
+      <w:r>
+        <w:rPr>
+          <w:rFonts w:ascii="Helvetica" w:eastAsia="Times New Roman" w:hAnsi="Helvetica" w:cs="Helvetica"/>
+          <w:color w:val="333333"/>
+          <w:sz w:val="21"/>
+          <w:szCs w:val="21"/>
+        </w:rPr>
+        <w:t>multi</w:t>
       </w:r>
       <w:r>
         <w:rPr>
@@ -9247,6 +9971,7 @@
         <w:t>cycle.vhdl</w:t>
       </w:r>
       <w:proofErr w:type="spellEnd"/>
+      <w:proofErr w:type="gramEnd"/>
       <w:r>
         <w:rPr>
           <w:rFonts w:ascii="Helvetica" w:eastAsia="Times New Roman" w:hAnsi="Helvetica" w:cs="Helvetica"/>
@@ -9291,9 +10016,20 @@
           <w:sz w:val="21"/>
           <w:szCs w:val="21"/>
         </w:rPr>
-        <w:t>tb_riscv_multicycle_behav.wcfg</w:t>
+        <w:t>tb_riscv_multicycle_</w:t>
+      </w:r>
+      <w:proofErr w:type="gramStart"/>
+      <w:r>
+        <w:rPr>
+          <w:rFonts w:ascii="Helvetica" w:eastAsia="Times New Roman" w:hAnsi="Helvetica" w:cs="Helvetica"/>
+          <w:color w:val="333333"/>
+          <w:sz w:val="21"/>
+          <w:szCs w:val="21"/>
+        </w:rPr>
+        <w:t>behav.wcfg</w:t>
       </w:r>
       <w:proofErr w:type="spellEnd"/>
+      <w:proofErr w:type="gramEnd"/>
       <w:r>
         <w:rPr>
           <w:rFonts w:ascii="Helvetica" w:eastAsia="Times New Roman" w:hAnsi="Helvetica" w:cs="Helvetica"/>
@@ -9523,9 +10259,9 @@
           <w:sz w:val="21"/>
           <w:szCs w:val="21"/>
         </w:rPr>
-        <w:t>alu_input_a</w:t>
-      </w:r>
-      <w:proofErr w:type="spellEnd"/>
+        <w:t>alu_input_</w:t>
+      </w:r>
+      <w:proofErr w:type="gramStart"/>
       <w:r>
         <w:rPr>
           <w:rFonts w:ascii="Helvetica" w:eastAsia="Times New Roman" w:hAnsi="Helvetica" w:cs="Helvetica"/>
@@ -9535,9 +10271,9 @@
           <w:sz w:val="21"/>
           <w:szCs w:val="21"/>
         </w:rPr>
-        <w:t xml:space="preserve">,  </w:t>
-      </w:r>
-      <w:proofErr w:type="spellStart"/>
+        <w:t>a</w:t>
+      </w:r>
+      <w:proofErr w:type="spellEnd"/>
       <w:r>
         <w:rPr>
           <w:rFonts w:ascii="Helvetica" w:eastAsia="Times New Roman" w:hAnsi="Helvetica" w:cs="Helvetica"/>
@@ -9547,9 +10283,9 @@
           <w:sz w:val="21"/>
           <w:szCs w:val="21"/>
         </w:rPr>
-        <w:t>alu_input_b</w:t>
-      </w:r>
-      <w:proofErr w:type="spellEnd"/>
+        <w:t xml:space="preserve">,  </w:t>
+      </w:r>
+      <w:proofErr w:type="spellStart"/>
       <w:r>
         <w:rPr>
           <w:rFonts w:ascii="Helvetica" w:eastAsia="Times New Roman" w:hAnsi="Helvetica" w:cs="Helvetica"/>
@@ -9559,9 +10295,9 @@
           <w:sz w:val="21"/>
           <w:szCs w:val="21"/>
         </w:rPr>
-        <w:t xml:space="preserve">, </w:t>
-      </w:r>
-      <w:proofErr w:type="spellStart"/>
+        <w:t>alu</w:t>
+      </w:r>
+      <w:proofErr w:type="gramEnd"/>
       <w:r>
         <w:rPr>
           <w:rFonts w:ascii="Helvetica" w:eastAsia="Times New Roman" w:hAnsi="Helvetica" w:cs="Helvetica"/>
@@ -9571,7 +10307,7 @@
           <w:sz w:val="21"/>
           <w:szCs w:val="21"/>
         </w:rPr>
-        <w:t>alu_result</w:t>
+        <w:t>_input_b</w:t>
       </w:r>
       <w:proofErr w:type="spellEnd"/>
       <w:r>
@@ -9595,7 +10331,7 @@
           <w:sz w:val="21"/>
           <w:szCs w:val="21"/>
         </w:rPr>
-        <w:t>alu_src</w:t>
+        <w:t>alu_result</w:t>
       </w:r>
       <w:proofErr w:type="spellEnd"/>
       <w:r>
@@ -9619,9 +10355,46 @@
           <w:sz w:val="21"/>
           <w:szCs w:val="21"/>
         </w:rPr>
+        <w:t>alu_</w:t>
+      </w:r>
+      <w:proofErr w:type="gramStart"/>
+      <w:r>
+        <w:rPr>
+          <w:rFonts w:ascii="Helvetica" w:eastAsia="Times New Roman" w:hAnsi="Helvetica" w:cs="Helvetica"/>
+          <w:i/>
+          <w:iCs/>
+          <w:color w:val="333333"/>
+          <w:sz w:val="21"/>
+          <w:szCs w:val="21"/>
+        </w:rPr>
+        <w:t>src</w:t>
+      </w:r>
+      <w:proofErr w:type="spellEnd"/>
+      <w:r>
+        <w:rPr>
+          <w:rFonts w:ascii="Helvetica" w:eastAsia="Times New Roman" w:hAnsi="Helvetica" w:cs="Helvetica"/>
+          <w:i/>
+          <w:iCs/>
+          <w:color w:val="333333"/>
+          <w:sz w:val="21"/>
+          <w:szCs w:val="21"/>
+        </w:rPr>
+        <w:t xml:space="preserve">, </w:t>
+      </w:r>
+      <w:proofErr w:type="spellStart"/>
+      <w:r>
+        <w:rPr>
+          <w:rFonts w:ascii="Helvetica" w:eastAsia="Times New Roman" w:hAnsi="Helvetica" w:cs="Helvetica"/>
+          <w:i/>
+          <w:iCs/>
+          <w:color w:val="333333"/>
+          <w:sz w:val="21"/>
+          <w:szCs w:val="21"/>
+        </w:rPr>
         <w:t>reg_write</w:t>
       </w:r>
       <w:proofErr w:type="spellEnd"/>
+      <w:proofErr w:type="gramEnd"/>
       <w:r>
         <w:rPr>
           <w:rFonts w:ascii="Helvetica" w:eastAsia="Times New Roman" w:hAnsi="Helvetica" w:cs="Helvetica"/>
@@ -9774,9 +10547,20 @@
           <w:sz w:val="21"/>
           <w:szCs w:val="21"/>
         </w:rPr>
-        <w:t>instru_mem.vhdl</w:t>
+        <w:t>instru_</w:t>
+      </w:r>
+      <w:proofErr w:type="gramStart"/>
+      <w:r>
+        <w:rPr>
+          <w:rFonts w:ascii="Helvetica" w:eastAsia="Times New Roman" w:hAnsi="Helvetica" w:cs="Helvetica"/>
+          <w:color w:val="333333"/>
+          <w:sz w:val="21"/>
+          <w:szCs w:val="21"/>
+        </w:rPr>
+        <w:t>mem.vhdl</w:t>
       </w:r>
       <w:proofErr w:type="spellEnd"/>
+      <w:proofErr w:type="gramEnd"/>
       <w:r>
         <w:rPr>
           <w:rFonts w:ascii="Helvetica" w:eastAsia="Times New Roman" w:hAnsi="Helvetica" w:cs="Helvetica"/>
@@ -10167,9 +10951,9 @@
           <w:sz w:val="21"/>
           <w:szCs w:val="21"/>
         </w:rPr>
-        <w:t>alu_input_a</w:t>
-      </w:r>
-      <w:proofErr w:type="spellEnd"/>
+        <w:t>alu_input_</w:t>
+      </w:r>
+      <w:proofErr w:type="gramStart"/>
       <w:r>
         <w:rPr>
           <w:rFonts w:ascii="Helvetica" w:eastAsia="Times New Roman" w:hAnsi="Helvetica" w:cs="Helvetica"/>
@@ -10179,9 +10963,9 @@
           <w:sz w:val="21"/>
           <w:szCs w:val="21"/>
         </w:rPr>
-        <w:t xml:space="preserve">,  </w:t>
-      </w:r>
-      <w:proofErr w:type="spellStart"/>
+        <w:t>a</w:t>
+      </w:r>
+      <w:proofErr w:type="spellEnd"/>
       <w:r>
         <w:rPr>
           <w:rFonts w:ascii="Helvetica" w:eastAsia="Times New Roman" w:hAnsi="Helvetica" w:cs="Helvetica"/>
@@ -10191,9 +10975,9 @@
           <w:sz w:val="21"/>
           <w:szCs w:val="21"/>
         </w:rPr>
-        <w:t>alu_input_b</w:t>
-      </w:r>
-      <w:proofErr w:type="spellEnd"/>
+        <w:t xml:space="preserve">,  </w:t>
+      </w:r>
+      <w:proofErr w:type="spellStart"/>
       <w:r>
         <w:rPr>
           <w:rFonts w:ascii="Helvetica" w:eastAsia="Times New Roman" w:hAnsi="Helvetica" w:cs="Helvetica"/>
@@ -10203,9 +10987,9 @@
           <w:sz w:val="21"/>
           <w:szCs w:val="21"/>
         </w:rPr>
-        <w:t xml:space="preserve">, </w:t>
-      </w:r>
-      <w:proofErr w:type="spellStart"/>
+        <w:t>alu</w:t>
+      </w:r>
+      <w:proofErr w:type="gramEnd"/>
       <w:r>
         <w:rPr>
           <w:rFonts w:ascii="Helvetica" w:eastAsia="Times New Roman" w:hAnsi="Helvetica" w:cs="Helvetica"/>
@@ -10215,7 +10999,7 @@
           <w:sz w:val="21"/>
           <w:szCs w:val="21"/>
         </w:rPr>
-        <w:t>alu_result</w:t>
+        <w:t>_input_b</w:t>
       </w:r>
       <w:proofErr w:type="spellEnd"/>
       <w:r>
@@ -10239,7 +11023,7 @@
           <w:sz w:val="21"/>
           <w:szCs w:val="21"/>
         </w:rPr>
-        <w:t>alu_src</w:t>
+        <w:t>alu_result</w:t>
       </w:r>
       <w:proofErr w:type="spellEnd"/>
       <w:r>
@@ -10263,9 +11047,9 @@
           <w:sz w:val="21"/>
           <w:szCs w:val="21"/>
         </w:rPr>
-        <w:t>reg_write</w:t>
-      </w:r>
-      <w:proofErr w:type="spellEnd"/>
+        <w:t>alu_</w:t>
+      </w:r>
+      <w:proofErr w:type="gramStart"/>
       <w:r>
         <w:rPr>
           <w:rFonts w:ascii="Helvetica" w:eastAsia="Times New Roman" w:hAnsi="Helvetica" w:cs="Helvetica"/>
@@ -10275,9 +11059,9 @@
           <w:sz w:val="21"/>
           <w:szCs w:val="21"/>
         </w:rPr>
-        <w:t xml:space="preserve">, </w:t>
-      </w:r>
-      <w:proofErr w:type="spellStart"/>
+        <w:t>src</w:t>
+      </w:r>
+      <w:proofErr w:type="spellEnd"/>
       <w:r>
         <w:rPr>
           <w:rFonts w:ascii="Helvetica" w:eastAsia="Times New Roman" w:hAnsi="Helvetica" w:cs="Helvetica"/>
@@ -10287,9 +11071,9 @@
           <w:sz w:val="21"/>
           <w:szCs w:val="21"/>
         </w:rPr>
-        <w:t>reg_write_chip</w:t>
-      </w:r>
-      <w:proofErr w:type="spellEnd"/>
+        <w:t xml:space="preserve">, </w:t>
+      </w:r>
+      <w:proofErr w:type="spellStart"/>
       <w:r>
         <w:rPr>
           <w:rFonts w:ascii="Helvetica" w:eastAsia="Times New Roman" w:hAnsi="Helvetica" w:cs="Helvetica"/>
@@ -10299,6 +11083,43 @@
           <w:sz w:val="21"/>
           <w:szCs w:val="21"/>
         </w:rPr>
+        <w:t>reg_write</w:t>
+      </w:r>
+      <w:proofErr w:type="spellEnd"/>
+      <w:proofErr w:type="gramEnd"/>
+      <w:r>
+        <w:rPr>
+          <w:rFonts w:ascii="Helvetica" w:eastAsia="Times New Roman" w:hAnsi="Helvetica" w:cs="Helvetica"/>
+          <w:i/>
+          <w:iCs/>
+          <w:color w:val="333333"/>
+          <w:sz w:val="21"/>
+          <w:szCs w:val="21"/>
+        </w:rPr>
+        <w:t xml:space="preserve">, </w:t>
+      </w:r>
+      <w:proofErr w:type="spellStart"/>
+      <w:r>
+        <w:rPr>
+          <w:rFonts w:ascii="Helvetica" w:eastAsia="Times New Roman" w:hAnsi="Helvetica" w:cs="Helvetica"/>
+          <w:i/>
+          <w:iCs/>
+          <w:color w:val="333333"/>
+          <w:sz w:val="21"/>
+          <w:szCs w:val="21"/>
+        </w:rPr>
+        <w:t>reg_write_chip</w:t>
+      </w:r>
+      <w:proofErr w:type="spellEnd"/>
+      <w:r>
+        <w:rPr>
+          <w:rFonts w:ascii="Helvetica" w:eastAsia="Times New Roman" w:hAnsi="Helvetica" w:cs="Helvetica"/>
+          <w:i/>
+          <w:iCs/>
+          <w:color w:val="333333"/>
+          <w:sz w:val="21"/>
+          <w:szCs w:val="21"/>
+        </w:rPr>
         <w:t>, display_x5</w:t>
       </w:r>
     </w:p>
@@ -10350,9 +11171,23 @@
           <w:szCs w:val="21"/>
           <w:highlight w:val="yellow"/>
         </w:rPr>
-        <w:t>instru_mem.vhdl</w:t>
+        <w:t>instru_</w:t>
+      </w:r>
+      <w:proofErr w:type="gramStart"/>
+      <w:r>
+        <w:rPr>
+          <w:rFonts w:ascii="Helvetica" w:eastAsia="Times New Roman" w:hAnsi="Helvetica" w:cs="Helvetica"/>
+          <w:b/>
+          <w:bCs/>
+          <w:color w:val="333333"/>
+          <w:sz w:val="21"/>
+          <w:szCs w:val="21"/>
+          <w:highlight w:val="yellow"/>
+        </w:rPr>
+        <w:t>mem.vhdl</w:t>
       </w:r>
       <w:proofErr w:type="spellEnd"/>
+      <w:proofErr w:type="gramEnd"/>
       <w:r>
         <w:rPr>
           <w:rFonts w:ascii="Helvetica" w:eastAsia="Times New Roman" w:hAnsi="Helvetica" w:cs="Helvetica"/>
@@ -10461,9 +11296,20 @@
           <w:sz w:val="21"/>
           <w:szCs w:val="21"/>
         </w:rPr>
-        <w:t>instru_mem.vhdl</w:t>
+        <w:t>instru_</w:t>
+      </w:r>
+      <w:proofErr w:type="gramStart"/>
+      <w:r>
+        <w:rPr>
+          <w:rFonts w:ascii="Helvetica" w:eastAsia="Times New Roman" w:hAnsi="Helvetica" w:cs="Helvetica"/>
+          <w:color w:val="333333"/>
+          <w:sz w:val="21"/>
+          <w:szCs w:val="21"/>
+        </w:rPr>
+        <w:t>mem.vhdl</w:t>
       </w:r>
       <w:proofErr w:type="spellEnd"/>
+      <w:proofErr w:type="gramEnd"/>
       <w:r>
         <w:rPr>
           <w:rFonts w:ascii="Helvetica" w:eastAsia="Times New Roman" w:hAnsi="Helvetica" w:cs="Helvetica"/>
@@ -10480,7 +11326,27 @@
           <w:sz w:val="21"/>
           <w:szCs w:val="21"/>
         </w:rPr>
-        <w:t>to implement the 9 lines of the main program. This will require creating the 32-bit assembly code word for each instruction. [</w:t>
+        <w:t xml:space="preserve">to implement the 9 lines of the main program. This will require creating the 32-bit assembly </w:t>
+      </w:r>
+      <w:proofErr w:type="gramStart"/>
+      <w:r>
+        <w:rPr>
+          <w:rFonts w:ascii="Helvetica" w:eastAsia="Times New Roman" w:hAnsi="Helvetica" w:cs="Helvetica"/>
+          <w:color w:val="333333"/>
+          <w:sz w:val="21"/>
+          <w:szCs w:val="21"/>
+        </w:rPr>
+        <w:t>code word</w:t>
+      </w:r>
+      <w:proofErr w:type="gramEnd"/>
+      <w:r>
+        <w:rPr>
+          <w:rFonts w:ascii="Helvetica" w:eastAsia="Times New Roman" w:hAnsi="Helvetica" w:cs="Helvetica"/>
+          <w:color w:val="333333"/>
+          <w:sz w:val="21"/>
+          <w:szCs w:val="21"/>
+        </w:rPr>
+        <w:t xml:space="preserve"> for each instruction. [</w:t>
       </w:r>
       <w:r>
         <w:rPr>
@@ -10510,9 +11376,20 @@
           <w:sz w:val="21"/>
           <w:szCs w:val="21"/>
         </w:rPr>
-        <w:t>data_mem.vhdl</w:t>
+        <w:t>data_</w:t>
+      </w:r>
+      <w:proofErr w:type="gramStart"/>
+      <w:r>
+        <w:rPr>
+          <w:rFonts w:ascii="Helvetica" w:eastAsia="Times New Roman" w:hAnsi="Helvetica" w:cs="Helvetica"/>
+          <w:color w:val="333333"/>
+          <w:sz w:val="21"/>
+          <w:szCs w:val="21"/>
+        </w:rPr>
+        <w:t>mem.vhdl</w:t>
       </w:r>
       <w:proofErr w:type="spellEnd"/>
+      <w:proofErr w:type="gramEnd"/>
       <w:r>
         <w:rPr>
           <w:rFonts w:ascii="Helvetica" w:eastAsia="Times New Roman" w:hAnsi="Helvetica" w:cs="Helvetica"/>
@@ -10635,9 +11512,23 @@
           <w:szCs w:val="21"/>
           <w:highlight w:val="yellow"/>
         </w:rPr>
-        <w:t>instru_mem.vhdl</w:t>
+        <w:t>instru_</w:t>
+      </w:r>
+      <w:proofErr w:type="gramStart"/>
+      <w:r>
+        <w:rPr>
+          <w:rFonts w:ascii="Helvetica" w:eastAsia="Times New Roman" w:hAnsi="Helvetica" w:cs="Helvetica"/>
+          <w:b/>
+          <w:bCs/>
+          <w:color w:val="333333"/>
+          <w:sz w:val="21"/>
+          <w:szCs w:val="21"/>
+          <w:highlight w:val="yellow"/>
+        </w:rPr>
+        <w:t>mem.vhdl</w:t>
       </w:r>
       <w:proofErr w:type="spellEnd"/>
+      <w:proofErr w:type="gramEnd"/>
       <w:r>
         <w:rPr>
           <w:rFonts w:ascii="Helvetica" w:eastAsia="Times New Roman" w:hAnsi="Helvetica" w:cs="Helvetica"/>
@@ -11350,9 +12241,9 @@
           <w:highlight w:val="yellow"/>
           <w:shd w:val="clear" w:color="auto" w:fill="FFFFFF"/>
         </w:rPr>
-        <w:t xml:space="preserve">Turn in your simulation plot in </w:t>
-      </w:r>
-      <w:proofErr w:type="spellStart"/>
+        <w:t xml:space="preserve">Turn in your simulation plot </w:t>
+      </w:r>
+      <w:proofErr w:type="gramStart"/>
       <w:r>
         <w:rPr>
           <w:rFonts w:ascii="Helvetica" w:eastAsia="Times New Roman" w:hAnsi="Helvetica" w:cs="Helvetica"/>
@@ -11364,9 +12255,24 @@
           <w:highlight w:val="yellow"/>
           <w:shd w:val="clear" w:color="auto" w:fill="FFFFFF"/>
         </w:rPr>
+        <w:t xml:space="preserve">in </w:t>
+      </w:r>
+      <w:proofErr w:type="spellStart"/>
+      <w:r>
+        <w:rPr>
+          <w:rFonts w:ascii="Helvetica" w:eastAsia="Times New Roman" w:hAnsi="Helvetica" w:cs="Helvetica"/>
+          <w:b/>
+          <w:bCs/>
+          <w:color w:val="333333"/>
+          <w:sz w:val="21"/>
+          <w:szCs w:val="21"/>
+          <w:highlight w:val="yellow"/>
+          <w:shd w:val="clear" w:color="auto" w:fill="FFFFFF"/>
+        </w:rPr>
         <w:t>gradescope</w:t>
       </w:r>
       <w:proofErr w:type="spellEnd"/>
+      <w:proofErr w:type="gramEnd"/>
       <w:r>
         <w:rPr>
           <w:rFonts w:ascii="Helvetica" w:eastAsia="Times New Roman" w:hAnsi="Helvetica" w:cs="Helvetica"/>
@@ -11375,6 +12281,62 @@
           <w:szCs w:val="21"/>
         </w:rPr>
         <w:t>.</w:t>
+      </w:r>
+      <w:r>
+        <w:rPr>
+          <w:rFonts w:ascii="Helvetica" w:eastAsia="Times New Roman" w:hAnsi="Helvetica" w:cs="Helvetica"/>
+          <w:color w:val="333333"/>
+          <w:sz w:val="21"/>
+          <w:szCs w:val="21"/>
+        </w:rPr>
+        <w:t xml:space="preserve"> Remember to </w:t>
+      </w:r>
+      <w:r>
+        <w:rPr>
+          <w:rFonts w:ascii="Helvetica" w:eastAsia="Times New Roman" w:hAnsi="Helvetica" w:cs="Helvetica"/>
+          <w:color w:val="333333"/>
+          <w:sz w:val="21"/>
+          <w:szCs w:val="21"/>
+        </w:rPr>
+        <w:t xml:space="preserve">annotate on the simulation plot the key </w:t>
+      </w:r>
+      <w:r>
+        <w:rPr>
+          <w:rFonts w:ascii="Helvetica" w:eastAsia="Times New Roman" w:hAnsi="Helvetica" w:cs="Helvetica"/>
+          <w:color w:val="333333"/>
+          <w:sz w:val="21"/>
+          <w:szCs w:val="21"/>
+        </w:rPr>
+        <w:t xml:space="preserve">points showing your simulation worked (like final clock cycle, </w:t>
+      </w:r>
+      <w:r>
+        <w:rPr>
+          <w:rFonts w:ascii="Helvetica" w:eastAsia="Times New Roman" w:hAnsi="Helvetica" w:cs="Helvetica"/>
+          <w:color w:val="333333"/>
+          <w:sz w:val="21"/>
+          <w:szCs w:val="21"/>
+        </w:rPr>
+        <w:t xml:space="preserve">final value of x5, x6, x7 and x10, </w:t>
+      </w:r>
+      <w:proofErr w:type="spellStart"/>
+      <w:r>
+        <w:rPr>
+          <w:rFonts w:ascii="Helvetica" w:eastAsia="Times New Roman" w:hAnsi="Helvetica" w:cs="Helvetica"/>
+          <w:color w:val="333333"/>
+          <w:sz w:val="21"/>
+          <w:szCs w:val="21"/>
+        </w:rPr>
+        <w:t>etc</w:t>
+      </w:r>
+      <w:proofErr w:type="spellEnd"/>
+      <w:r>
+        <w:rPr>
+          <w:rFonts w:ascii="Helvetica" w:eastAsia="Times New Roman" w:hAnsi="Helvetica" w:cs="Helvetica"/>
+          <w:color w:val="333333"/>
+          <w:sz w:val="21"/>
+          <w:szCs w:val="21"/>
+        </w:rPr>
+        <w:t>)</w:t>
       </w:r>
     </w:p>
     <w:p>
@@ -11459,7 +12421,6 @@
           <w:sz w:val="21"/>
           <w:szCs w:val="21"/>
         </w:rPr>
-        <w:lastRenderedPageBreak/>
         <w:t xml:space="preserve">Answer the following questions </w:t>
       </w:r>
       <w:r>
@@ -12028,9 +12989,21 @@
                 <w:szCs w:val="21"/>
                 <w:shd w:val="clear" w:color="auto" w:fill="FFFFFF"/>
               </w:rPr>
-              <w:t>alu_control.vhdl</w:t>
+              <w:t>alu_</w:t>
+            </w:r>
+            <w:proofErr w:type="gramStart"/>
+            <w:r>
+              <w:rPr>
+                <w:rFonts w:ascii="Helvetica" w:eastAsia="Times New Roman" w:hAnsi="Helvetica" w:cs="Helvetica"/>
+                <w:color w:val="333333"/>
+                <w:sz w:val="21"/>
+                <w:szCs w:val="21"/>
+                <w:shd w:val="clear" w:color="auto" w:fill="FFFFFF"/>
+              </w:rPr>
+              <w:t>control.vhdl</w:t>
             </w:r>
             <w:proofErr w:type="spellEnd"/>
+            <w:proofErr w:type="gramEnd"/>
             <w:r>
               <w:rPr>
                 <w:rFonts w:ascii="Helvetica" w:eastAsia="Times New Roman" w:hAnsi="Helvetica" w:cs="Helvetica"/>
@@ -12042,6 +13015,7 @@
               <w:t xml:space="preserve"> and </w:t>
             </w:r>
             <w:proofErr w:type="spellStart"/>
+            <w:proofErr w:type="gramStart"/>
             <w:r>
               <w:rPr>
                 <w:rFonts w:ascii="Helvetica" w:eastAsia="Times New Roman" w:hAnsi="Helvetica" w:cs="Helvetica"/>
@@ -12053,6 +13027,7 @@
               <w:t>alu.vhdl</w:t>
             </w:r>
             <w:proofErr w:type="spellEnd"/>
+            <w:proofErr w:type="gramEnd"/>
           </w:p>
         </w:tc>
         <w:tc>
@@ -12169,9 +13144,21 @@
                 <w:szCs w:val="21"/>
                 <w:shd w:val="clear" w:color="auto" w:fill="FFFFFF"/>
               </w:rPr>
-              <w:t>riscv_multicycle.vhdl</w:t>
+              <w:t>riscv_</w:t>
+            </w:r>
+            <w:proofErr w:type="gramStart"/>
+            <w:r>
+              <w:rPr>
+                <w:rFonts w:ascii="Helvetica" w:eastAsia="Times New Roman" w:hAnsi="Helvetica" w:cs="Helvetica"/>
+                <w:color w:val="333333"/>
+                <w:sz w:val="21"/>
+                <w:szCs w:val="21"/>
+                <w:shd w:val="clear" w:color="auto" w:fill="FFFFFF"/>
+              </w:rPr>
+              <w:t>multicycle.vhdl</w:t>
             </w:r>
             <w:proofErr w:type="spellEnd"/>
+            <w:proofErr w:type="gramEnd"/>
           </w:p>
         </w:tc>
         <w:tc>
@@ -12937,6 +13924,7 @@
                 <w:sz w:val="21"/>
                 <w:szCs w:val="21"/>
               </w:rPr>
+              <w:lastRenderedPageBreak/>
               <w:t>Total</w:t>
             </w:r>
           </w:p>
@@ -13086,7 +14074,18 @@
           <w:szCs w:val="21"/>
           <w:shd w:val="clear" w:color="auto" w:fill="FFFFFF"/>
         </w:rPr>
-        <w:t xml:space="preserve"> or search engines is “level 2: Use of GenAI for brainstorming or idea generation.” For example, you can prompt GenAI on how to implement basic hardware in VHDL, such as “how to you implement a 32-bit register in VHDL?” “How to you implement a multiplexer using the </w:t>
+        <w:t xml:space="preserve"> or search engines is “level 2: Use of GenAI for brainstorming or idea generation.” For example, you can prompt GenAI on how to implement basic hardware in VHDL, such as “how to you implement a 32-bit register in VHDL?” “How to you implement a multiplexer using </w:t>
+      </w:r>
+      <w:proofErr w:type="gramStart"/>
+      <w:r>
+        <w:rPr>
+          <w:rFonts w:ascii="Helvetica" w:eastAsia="Times New Roman" w:hAnsi="Helvetica" w:cs="Helvetica"/>
+          <w:color w:val="333333"/>
+          <w:sz w:val="21"/>
+          <w:szCs w:val="21"/>
+          <w:shd w:val="clear" w:color="auto" w:fill="FFFFFF"/>
+        </w:rPr>
+        <w:t xml:space="preserve">the </w:t>
       </w:r>
       <w:r>
         <w:rPr>
@@ -13100,15 +14099,38 @@
         </w:rPr>
         <w:t>when</w:t>
       </w:r>
-      <w:r>
-        <w:rPr>
-          <w:rFonts w:ascii="Helvetica" w:eastAsia="Times New Roman" w:hAnsi="Helvetica" w:cs="Helvetica"/>
-          <w:color w:val="333333"/>
-          <w:sz w:val="21"/>
-          <w:szCs w:val="21"/>
-          <w:shd w:val="clear" w:color="auto" w:fill="FFFFFF"/>
-        </w:rPr>
-        <w:t xml:space="preserve"> statement?”, or ask basic questions about the RISC-V Stage 1 multicycle architecture, like “why is the ALU controller separate from the Control Unit in RISC-V?”; however, any coding must be your own work.  Do not ask GenAI to produce specific code for this assignment, like “Given this VHDL code for the ALU, add the SUBI function.”</w:t>
+      <w:proofErr w:type="gramEnd"/>
+      <w:r>
+        <w:rPr>
+          <w:rFonts w:ascii="Helvetica" w:eastAsia="Times New Roman" w:hAnsi="Helvetica" w:cs="Helvetica"/>
+          <w:color w:val="333333"/>
+          <w:sz w:val="21"/>
+          <w:szCs w:val="21"/>
+          <w:shd w:val="clear" w:color="auto" w:fill="FFFFFF"/>
+        </w:rPr>
+        <w:t xml:space="preserve"> statement?</w:t>
+      </w:r>
+      <w:proofErr w:type="gramStart"/>
+      <w:r>
+        <w:rPr>
+          <w:rFonts w:ascii="Helvetica" w:eastAsia="Times New Roman" w:hAnsi="Helvetica" w:cs="Helvetica"/>
+          <w:color w:val="333333"/>
+          <w:sz w:val="21"/>
+          <w:szCs w:val="21"/>
+          <w:shd w:val="clear" w:color="auto" w:fill="FFFFFF"/>
+        </w:rPr>
+        <w:t>”, or</w:t>
+      </w:r>
+      <w:proofErr w:type="gramEnd"/>
+      <w:r>
+        <w:rPr>
+          <w:rFonts w:ascii="Helvetica" w:eastAsia="Times New Roman" w:hAnsi="Helvetica" w:cs="Helvetica"/>
+          <w:color w:val="333333"/>
+          <w:sz w:val="21"/>
+          <w:szCs w:val="21"/>
+          <w:shd w:val="clear" w:color="auto" w:fill="FFFFFF"/>
+        </w:rPr>
+        <w:t xml:space="preserve"> ask basic questions about the RISC-V Stage 1 multicycle architecture, like “why is the ALU controller separate from the Control Unit in RISC-V?”; however, any coding must be your own work.  Do not ask GenAI to produce specific code for this assignment, like “Given this VHDL code for the ALU, add the SUBI function.”</w:t>
       </w:r>
     </w:p>
     <w:p>
@@ -15151,6 +16173,16 @@
       <w:shd w:val="clear" w:color="auto" w:fill="E1DFDD"/>
     </w:rPr>
   </w:style>
+  <w:style w:type="paragraph" w:styleId="Revision">
+    <w:name w:val="Revision"/>
+    <w:hidden/>
+    <w:uiPriority w:val="99"/>
+    <w:semiHidden/>
+    <w:rsid w:val="00C10C6E"/>
+    <w:pPr>
+      <w:spacing w:after="0" w:line="240" w:lineRule="auto"/>
+    </w:pPr>
+  </w:style>
 </w:styles>
 </file>
 

</xml_diff>